<commit_message>
Phase 5 SQLite-Verbindung erfolgreich implementiert
</commit_message>
<xml_diff>
--- a/Dokumentation.docx
+++ b/Dokumentation.docx
@@ -220,7 +220,7 @@
                                 <a:avLst/>
                               </a:prstGeom>
                               <a:blipFill>
-                                <a:blip r:embed="rId5"/>
+                                <a:blip r:embed="rId7"/>
                                 <a:stretch>
                                   <a:fillRect r="-7574"/>
                                 </a:stretch>
@@ -272,7 +272,7 @@
                       <v:path arrowok="t" o:connecttype="custom" o:connectlocs="0,0;7315200,0;7315200,1130373;3620757,733885;0,1092249;0,0" o:connectangles="0,0,0,0,0,0"/>
                     </v:shape>
                     <v:rect id="Rechteck 151" o:spid="_x0000_s1028" style="position:absolute;width:73152;height:12161;visibility:visible;mso-wrap-style:square;v-text-anchor:middle" o:gfxdata="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" stroked="f" strokeweight="1.5pt">
-                      <v:fill r:id="rId6" o:title="" recolor="t" rotate="t" type="frame"/>
+                      <v:fill r:id="rId8" o:title="" recolor="t" rotate="t" type="frame"/>
                     </v:rect>
                     <w10:wrap anchorx="page" anchory="page"/>
                   </v:group>
@@ -2546,7 +2546,7 @@
                     <pic:cNvPicPr/>
                   </pic:nvPicPr>
                   <pic:blipFill>
-                    <a:blip r:embed="rId7">
+                    <a:blip r:embed="rId9">
                       <a:extLst>
                         <a:ext uri="{28A0092B-C50C-407E-A947-70E740481C1C}">
                           <a14:useLocalDpi xmlns:a14="http://schemas.microsoft.com/office/drawing/2010/main" val="0"/>
@@ -2595,7 +2595,7 @@
                     <pic:cNvPicPr/>
                   </pic:nvPicPr>
                   <pic:blipFill>
-                    <a:blip r:embed="rId8">
+                    <a:blip r:embed="rId10">
                       <a:extLst>
                         <a:ext uri="{28A0092B-C50C-407E-A947-70E740481C1C}">
                           <a14:useLocalDpi xmlns:a14="http://schemas.microsoft.com/office/drawing/2010/main" val="0"/>
@@ -2762,7 +2762,7 @@
                     <pic:cNvPicPr/>
                   </pic:nvPicPr>
                   <pic:blipFill>
-                    <a:blip r:embed="rId9">
+                    <a:blip r:embed="rId11">
                       <a:extLst>
                         <a:ext uri="{28A0092B-C50C-407E-A947-70E740481C1C}">
                           <a14:useLocalDpi xmlns:a14="http://schemas.microsoft.com/office/drawing/2010/main" val="0"/>
@@ -3023,7 +3023,7 @@
                     <pic:cNvPicPr/>
                   </pic:nvPicPr>
                   <pic:blipFill>
-                    <a:blip r:embed="rId10">
+                    <a:blip r:embed="rId12">
                       <a:extLst>
                         <a:ext uri="{28A0092B-C50C-407E-A947-70E740481C1C}">
                           <a14:useLocalDpi xmlns:a14="http://schemas.microsoft.com/office/drawing/2010/main" val="0"/>
@@ -3062,7 +3062,7 @@
           <w:noProof/>
         </w:rPr>
         <w:drawing>
-          <wp:anchor distT="0" distB="0" distL="114300" distR="114300" simplePos="0" relativeHeight="251666432" behindDoc="0" locked="0" layoutInCell="1" allowOverlap="1" wp14:anchorId="30414A45" wp14:editId="69163406">
+          <wp:anchor distT="0" distB="0" distL="114300" distR="114300" simplePos="0" relativeHeight="251666432" behindDoc="0" locked="0" layoutInCell="1" allowOverlap="1" wp14:anchorId="30414A45" wp14:editId="609C9E51">
             <wp:simplePos x="0" y="0"/>
             <wp:positionH relativeFrom="margin">
               <wp:align>right</wp:align>
@@ -3085,7 +3085,7 @@
                     <pic:cNvPicPr/>
                   </pic:nvPicPr>
                   <pic:blipFill>
-                    <a:blip r:embed="rId11" cstate="print">
+                    <a:blip r:embed="rId13" cstate="print">
                       <a:extLst>
                         <a:ext uri="{28A0092B-C50C-407E-A947-70E740481C1C}">
                           <a14:useLocalDpi xmlns:a14="http://schemas.microsoft.com/office/drawing/2010/main" val="0"/>
@@ -3124,7 +3124,7 @@
           <w:noProof/>
         </w:rPr>
         <w:drawing>
-          <wp:anchor distT="0" distB="0" distL="114300" distR="114300" simplePos="0" relativeHeight="251667456" behindDoc="0" locked="0" layoutInCell="1" allowOverlap="1" wp14:anchorId="38FD9A55" wp14:editId="6EAC7520">
+          <wp:anchor distT="0" distB="0" distL="114300" distR="114300" simplePos="0" relativeHeight="251667456" behindDoc="0" locked="0" layoutInCell="1" allowOverlap="1" wp14:anchorId="38FD9A55" wp14:editId="1E814765">
             <wp:simplePos x="0" y="0"/>
             <wp:positionH relativeFrom="column">
               <wp:posOffset>90805</wp:posOffset>
@@ -3147,7 +3147,7 @@
                     <pic:cNvPicPr/>
                   </pic:nvPicPr>
                   <pic:blipFill>
-                    <a:blip r:embed="rId12" cstate="print">
+                    <a:blip r:embed="rId14" cstate="print">
                       <a:extLst>
                         <a:ext uri="{28A0092B-C50C-407E-A947-70E740481C1C}">
                           <a14:useLocalDpi xmlns:a14="http://schemas.microsoft.com/office/drawing/2010/main" val="0"/>
@@ -3316,7 +3316,7 @@
           <w:noProof/>
         </w:rPr>
         <w:drawing>
-          <wp:anchor distT="0" distB="0" distL="114300" distR="114300" simplePos="0" relativeHeight="251668480" behindDoc="0" locked="0" layoutInCell="1" allowOverlap="1" wp14:anchorId="6F7F581A" wp14:editId="4C799095">
+          <wp:anchor distT="0" distB="0" distL="114300" distR="114300" simplePos="0" relativeHeight="251668480" behindDoc="0" locked="0" layoutInCell="1" allowOverlap="1" wp14:anchorId="6F7F581A" wp14:editId="6E647249">
             <wp:simplePos x="0" y="0"/>
             <wp:positionH relativeFrom="column">
               <wp:posOffset>147955</wp:posOffset>
@@ -3339,7 +3339,7 @@
                     <pic:cNvPicPr/>
                   </pic:nvPicPr>
                   <pic:blipFill>
-                    <a:blip r:embed="rId13" cstate="print">
+                    <a:blip r:embed="rId15" cstate="print">
                       <a:extLst>
                         <a:ext uri="{28A0092B-C50C-407E-A947-70E740481C1C}">
                           <a14:useLocalDpi xmlns:a14="http://schemas.microsoft.com/office/drawing/2010/main" val="0"/>
@@ -3487,7 +3487,7 @@
                     <pic:cNvPicPr/>
                   </pic:nvPicPr>
                   <pic:blipFill>
-                    <a:blip r:embed="rId14">
+                    <a:blip r:embed="rId16">
                       <a:extLst>
                         <a:ext uri="{28A0092B-C50C-407E-A947-70E740481C1C}">
                           <a14:useLocalDpi xmlns:a14="http://schemas.microsoft.com/office/drawing/2010/main" val="0"/>
@@ -3626,7 +3626,7 @@
         </w:rPr>
         <w:lastRenderedPageBreak/>
         <w:drawing>
-          <wp:anchor distT="0" distB="0" distL="114300" distR="114300" simplePos="0" relativeHeight="251671552" behindDoc="0" locked="0" layoutInCell="1" allowOverlap="1" wp14:anchorId="076D891D" wp14:editId="21517170">
+          <wp:anchor distT="0" distB="0" distL="114300" distR="114300" simplePos="0" relativeHeight="251671552" behindDoc="0" locked="0" layoutInCell="1" allowOverlap="1" wp14:anchorId="076D891D" wp14:editId="3019F1F8">
             <wp:simplePos x="0" y="0"/>
             <wp:positionH relativeFrom="column">
               <wp:posOffset>3110230</wp:posOffset>
@@ -3649,7 +3649,7 @@
                     <pic:cNvPicPr/>
                   </pic:nvPicPr>
                   <pic:blipFill>
-                    <a:blip r:embed="rId15" cstate="print">
+                    <a:blip r:embed="rId17" cstate="print">
                       <a:extLst>
                         <a:ext uri="{28A0092B-C50C-407E-A947-70E740481C1C}">
                           <a14:useLocalDpi xmlns:a14="http://schemas.microsoft.com/office/drawing/2010/main" val="0"/>
@@ -3685,7 +3685,7 @@
           <w:noProof/>
         </w:rPr>
         <w:drawing>
-          <wp:inline distT="0" distB="0" distL="0" distR="0" wp14:anchorId="2DDC6EE9" wp14:editId="4D2F0EA3">
+          <wp:inline distT="0" distB="0" distL="0" distR="0" wp14:anchorId="2DDC6EE9" wp14:editId="26373C88">
             <wp:extent cx="2469686" cy="1666875"/>
             <wp:effectExtent l="19050" t="19050" r="26035" b="9525"/>
             <wp:docPr id="1870732759" name="Grafik 9"/>
@@ -3700,7 +3700,7 @@
                     <pic:cNvPicPr/>
                   </pic:nvPicPr>
                   <pic:blipFill>
-                    <a:blip r:embed="rId16" cstate="print">
+                    <a:blip r:embed="rId18" cstate="print">
                       <a:extLst>
                         <a:ext uri="{28A0092B-C50C-407E-A947-70E740481C1C}">
                           <a14:useLocalDpi xmlns:a14="http://schemas.microsoft.com/office/drawing/2010/main" val="0"/>
@@ -3850,7 +3850,7 @@
         </w:rPr>
         <w:lastRenderedPageBreak/>
         <w:drawing>
-          <wp:inline distT="0" distB="0" distL="0" distR="0" wp14:anchorId="7AA15A65" wp14:editId="630836E6">
+          <wp:inline distT="0" distB="0" distL="0" distR="0" wp14:anchorId="7AA15A65" wp14:editId="5DA88D07">
             <wp:extent cx="2801815" cy="2603846"/>
             <wp:effectExtent l="0" t="0" r="0" b="6350"/>
             <wp:docPr id="422847558" name="Grafik 8"/>
@@ -3865,7 +3865,7 @@
                     <pic:cNvPicPr/>
                   </pic:nvPicPr>
                   <pic:blipFill>
-                    <a:blip r:embed="rId17" cstate="print">
+                    <a:blip r:embed="rId19" cstate="print">
                       <a:extLst>
                         <a:ext uri="{28A0092B-C50C-407E-A947-70E740481C1C}">
                           <a14:useLocalDpi xmlns:a14="http://schemas.microsoft.com/office/drawing/2010/main" val="0"/>
@@ -3920,13 +3920,8 @@
       <w:r>
         <w:t xml:space="preserve"> </w:t>
       </w:r>
-      <w:proofErr w:type="gramStart"/>
-      <w:r>
-        <w:t>Automatisch</w:t>
-      </w:r>
-      <w:proofErr w:type="gramEnd"/>
-      <w:r>
-        <w:t xml:space="preserve"> erzeugte Ergebnisdatei eines Studierenden</w:t>
+      <w:r>
+        <w:t>Automatisch erzeugte Ergebnisdatei eines Studierenden</w:t>
       </w:r>
     </w:p>
     <w:p>
@@ -3958,7 +3953,7 @@
                     <pic:cNvPicPr/>
                   </pic:nvPicPr>
                   <pic:blipFill>
-                    <a:blip r:embed="rId18">
+                    <a:blip r:embed="rId20">
                       <a:extLst>
                         <a:ext uri="{28A0092B-C50C-407E-A947-70E740481C1C}">
                           <a14:useLocalDpi xmlns:a14="http://schemas.microsoft.com/office/drawing/2010/main" val="0"/>
@@ -4013,13 +4008,8 @@
       <w:r>
         <w:t xml:space="preserve"> </w:t>
       </w:r>
-      <w:proofErr w:type="gramStart"/>
-      <w:r>
-        <w:t>Automatisch</w:t>
-      </w:r>
-      <w:proofErr w:type="gramEnd"/>
-      <w:r>
-        <w:t xml:space="preserve"> erzeugte Sammelübersicht der Prüfungsergebnisse.</w:t>
+      <w:r>
+        <w:t>Automatisch erzeugte Sammelübersicht der Prüfungsergebnisse.</w:t>
       </w:r>
     </w:p>
     <w:p>
@@ -4051,7 +4041,7 @@
                     <pic:cNvPicPr/>
                   </pic:nvPicPr>
                   <pic:blipFill>
-                    <a:blip r:embed="rId19">
+                    <a:blip r:embed="rId21">
                       <a:extLst>
                         <a:ext uri="{28A0092B-C50C-407E-A947-70E740481C1C}">
                           <a14:useLocalDpi xmlns:a14="http://schemas.microsoft.com/office/drawing/2010/main" val="0"/>
@@ -4106,13 +4096,8 @@
       <w:r>
         <w:t xml:space="preserve"> </w:t>
       </w:r>
-      <w:proofErr w:type="gramStart"/>
-      <w:r>
-        <w:t>Automatisch</w:t>
-      </w:r>
-      <w:proofErr w:type="gramEnd"/>
-      <w:r>
-        <w:t xml:space="preserve"> erzeugte Ordnerstruktur für die Speicherung der Prüfungsergebnisse.</w:t>
+      <w:r>
+        <w:t>Automatisch erzeugte Ordnerstruktur für die Speicherung der Prüfungsergebnisse.</w:t>
       </w:r>
     </w:p>
     <w:p>
@@ -4147,15 +4132,7 @@
     </w:p>
     <w:p>
       <w:r>
-        <w:t xml:space="preserve">Im Rahmen der Weiterentwicklung wurde die grafische Benutzeroberfläche überarbeitet. Hierzu </w:t>
-      </w:r>
-      <w:proofErr w:type="gramStart"/>
-      <w:r>
-        <w:t>wurden</w:t>
-      </w:r>
-      <w:proofErr w:type="gramEnd"/>
-      <w:r>
-        <w:t xml:space="preserve"> ein einheitliches Farbschema, das Unternehmenslogo sowie zentrale Designelemente in einer separaten Klasse (Style.java) ausgelagert. Dadurch können Farben, Schriftarten und Komponenten zentral verwaltet und wiederverwendet werden. Zusätzlich wurde das Layout der Anwendung optimiert, sodass sich die Oberfläche auch bei unterschiedlichen Fenstergrößen konsistent darstellt.</w:t>
+        <w:t>Im Rahmen der Weiterentwicklung wurde die grafische Benutzeroberfläche überarbeitet. Hierzu wurden ein einheitliches Farbschema, das Unternehmenslogo sowie zentrale Designelemente in einer separaten Klasse (Style.java) ausgelagert. Dadurch können Farben, Schriftarten und Komponenten zentral verwaltet und wiederverwendet werden. Zusätzlich wurde das Layout der Anwendung optimiert, sodass sich die Oberfläche auch bei unterschiedlichen Fenstergrößen konsistent darstellt.</w:t>
       </w:r>
     </w:p>
     <w:p>
@@ -4167,7 +4144,7 @@
           <w:noProof/>
         </w:rPr>
         <w:drawing>
-          <wp:inline distT="0" distB="0" distL="0" distR="0" wp14:anchorId="7965622C" wp14:editId="4A420D62">
+          <wp:inline distT="0" distB="0" distL="0" distR="0" wp14:anchorId="7965622C" wp14:editId="1D799DD4">
             <wp:extent cx="3390900" cy="2397776"/>
             <wp:effectExtent l="19050" t="19050" r="19050" b="21590"/>
             <wp:docPr id="1745081094" name="Grafik 8"/>
@@ -4182,7 +4159,7 @@
                     <pic:cNvPicPr/>
                   </pic:nvPicPr>
                   <pic:blipFill>
-                    <a:blip r:embed="rId20" cstate="print">
+                    <a:blip r:embed="rId22" cstate="print">
                       <a:extLst>
                         <a:ext uri="{28A0092B-C50C-407E-A947-70E740481C1C}">
                           <a14:useLocalDpi xmlns:a14="http://schemas.microsoft.com/office/drawing/2010/main" val="0"/>
@@ -4471,7 +4448,7 @@
                     <pic:cNvPicPr/>
                   </pic:nvPicPr>
                   <pic:blipFill>
-                    <a:blip r:embed="rId21">
+                    <a:blip r:embed="rId23">
                       <a:extLst>
                         <a:ext uri="{28A0092B-C50C-407E-A947-70E740481C1C}">
                           <a14:useLocalDpi xmlns:a14="http://schemas.microsoft.com/office/drawing/2010/main" val="0"/>
@@ -4544,7 +4521,7 @@
           <w:noProof/>
         </w:rPr>
         <w:drawing>
-          <wp:inline distT="0" distB="0" distL="0" distR="0" wp14:anchorId="2CD4F620" wp14:editId="4B34F905">
+          <wp:inline distT="0" distB="0" distL="0" distR="0" wp14:anchorId="2CD4F620" wp14:editId="4BDAA1AF">
             <wp:extent cx="3543300" cy="2125901"/>
             <wp:effectExtent l="19050" t="19050" r="19050" b="27305"/>
             <wp:docPr id="2129645333" name="Grafik 9"/>
@@ -4559,7 +4536,7 @@
                     <pic:cNvPicPr/>
                   </pic:nvPicPr>
                   <pic:blipFill>
-                    <a:blip r:embed="rId22" cstate="print">
+                    <a:blip r:embed="rId24" cstate="print">
                       <a:extLst>
                         <a:ext uri="{28A0092B-C50C-407E-A947-70E740481C1C}">
                           <a14:useLocalDpi xmlns:a14="http://schemas.microsoft.com/office/drawing/2010/main" val="0"/>
@@ -4623,6 +4600,128 @@
         <w:t>Dozentenoberfläche mit Prüfungsübersicht und Verwaltungsfunktionen</w:t>
       </w:r>
     </w:p>
+    <w:p/>
+    <w:p>
+      <w:pPr>
+        <w:rPr>
+          <w:b/>
+          <w:bCs/>
+        </w:rPr>
+      </w:pPr>
+      <w:r>
+        <w:rPr>
+          <w:b/>
+          <w:bCs/>
+        </w:rPr>
+        <w:lastRenderedPageBreak/>
+        <w:t>Phase 5.2 – SQLite-Anbindung</w:t>
+      </w:r>
+    </w:p>
+    <w:p>
+      <w:r>
+        <w:t xml:space="preserve">Für die persistente Speicherung wurde eine SQLite-Datenbank integriert. Über die Klasse </w:t>
+      </w:r>
+      <w:proofErr w:type="spellStart"/>
+      <w:r>
+        <w:t>DatabaseManager</w:t>
+      </w:r>
+      <w:proofErr w:type="spellEnd"/>
+      <w:r>
+        <w:t xml:space="preserve"> wird eine Verbindung zur Datenbank aufgebaut und wieder geschlossen. Beim ersten Verbindungsaufbau wird automatisch die Datenbankdatei </w:t>
+      </w:r>
+      <w:proofErr w:type="spellStart"/>
+      <w:r>
+        <w:t>pruefungssystem.db</w:t>
+      </w:r>
+      <w:proofErr w:type="spellEnd"/>
+      <w:r>
+        <w:t xml:space="preserve"> erzeugt.</w:t>
+      </w:r>
+    </w:p>
+    <w:p>
+      <w:pPr>
+        <w:keepNext/>
+      </w:pPr>
+      <w:r>
+        <w:rPr>
+          <w:noProof/>
+        </w:rPr>
+        <w:drawing>
+          <wp:inline distT="0" distB="0" distL="0" distR="0" wp14:anchorId="0038839B" wp14:editId="19CA2045">
+            <wp:extent cx="3711262" cy="510584"/>
+            <wp:effectExtent l="0" t="0" r="3810" b="3810"/>
+            <wp:docPr id="1682812693" name="Grafik 8"/>
+            <wp:cNvGraphicFramePr>
+              <a:graphicFrameLocks xmlns:a="http://schemas.openxmlformats.org/drawingml/2006/main" noChangeAspect="1"/>
+            </wp:cNvGraphicFramePr>
+            <a:graphic xmlns:a="http://schemas.openxmlformats.org/drawingml/2006/main">
+              <a:graphicData uri="http://schemas.openxmlformats.org/drawingml/2006/picture">
+                <pic:pic xmlns:pic="http://schemas.openxmlformats.org/drawingml/2006/picture">
+                  <pic:nvPicPr>
+                    <pic:cNvPr id="1682812693" name="Grafik 1682812693"/>
+                    <pic:cNvPicPr/>
+                  </pic:nvPicPr>
+                  <pic:blipFill>
+                    <a:blip r:embed="rId25">
+                      <a:extLst>
+                        <a:ext uri="{28A0092B-C50C-407E-A947-70E740481C1C}">
+                          <a14:useLocalDpi xmlns:a14="http://schemas.microsoft.com/office/drawing/2010/main" val="0"/>
+                        </a:ext>
+                      </a:extLst>
+                    </a:blip>
+                    <a:stretch>
+                      <a:fillRect/>
+                    </a:stretch>
+                  </pic:blipFill>
+                  <pic:spPr>
+                    <a:xfrm>
+                      <a:off x="0" y="0"/>
+                      <a:ext cx="3711262" cy="510584"/>
+                    </a:xfrm>
+                    <a:prstGeom prst="rect">
+                      <a:avLst/>
+                    </a:prstGeom>
+                  </pic:spPr>
+                </pic:pic>
+              </a:graphicData>
+            </a:graphic>
+          </wp:inline>
+        </w:drawing>
+      </w:r>
+    </w:p>
+    <w:p>
+      <w:pPr>
+        <w:pStyle w:val="Beschriftung"/>
+      </w:pPr>
+      <w:r>
+        <w:t xml:space="preserve">Abbildung </w:t>
+      </w:r>
+      <w:r>
+        <w:fldChar w:fldCharType="begin"/>
+      </w:r>
+      <w:r>
+        <w:instrText xml:space="preserve"> SEQ Abbildung \* ARABIC </w:instrText>
+      </w:r>
+      <w:r>
+        <w:fldChar w:fldCharType="separate"/>
+      </w:r>
+      <w:r>
+        <w:rPr>
+          <w:noProof/>
+        </w:rPr>
+        <w:t>14</w:t>
+      </w:r>
+      <w:r>
+        <w:fldChar w:fldCharType="end"/>
+      </w:r>
+      <w:r>
+        <w:t xml:space="preserve"> </w:t>
+      </w:r>
+      <w:r>
+        <w:t>Erfolgreicher Verbindungsaufbau zur SQLite-Datenbank</w:t>
+      </w:r>
+    </w:p>
+    <w:p/>
     <w:sectPr>
       <w:pgSz w:w="11906" w:h="16838"/>
       <w:pgMar w:top="1417" w:right="1417" w:bottom="1134" w:left="1417" w:header="708" w:footer="708" w:gutter="0"/>
@@ -4633,6 +4732,56 @@
     </w:sectPr>
   </w:body>
 </w:document>
+</file>
+
+<file path=word/endnotes.xml><?xml version="1.0" encoding="utf-8"?>
+<w:endnotes xmlns:wpc="http://schemas.microsoft.com/office/word/2010/wordprocessingCanvas" xmlns:cx="http://schemas.microsoft.com/office/drawing/2014/chartex" xmlns:cx1="http://schemas.microsoft.com/office/drawing/2015/9/8/chartex" xmlns:cx2="http://schemas.microsoft.com/office/drawing/2015/10/21/chartex" xmlns:cx3="http://schemas.microsoft.com/office/drawing/2016/5/9/chartex" xmlns:cx4="http://schemas.microsoft.com/office/drawing/2016/5/10/chartex" xmlns:cx5="http://schemas.microsoft.com/office/drawing/2016/5/11/chartex" xmlns:cx6="http://schemas.microsoft.com/office/drawing/2016/5/12/chartex" xmlns:cx7="http://schemas.microsoft.com/office/drawing/2016/5/13/chartex" xmlns:cx8="http://schemas.microsoft.com/office/drawing/2016/5/14/chartex" xmlns:mc="http://schemas.openxmlformats.org/markup-compatibility/2006" xmlns:aink="http://schemas.microsoft.com/office/drawing/2016/ink" xmlns:am3d="http://schemas.microsoft.com/office/drawing/2017/model3d" xmlns:o="urn:schemas-microsoft-com:office:office" xmlns:oel="http://schemas.microsoft.com/office/2019/extlst" xmlns:r="http://schemas.openxmlformats.org/officeDocument/2006/relationships" xmlns:m="http://schemas.openxmlformats.org/officeDocument/2006/math" xmlns:v="urn:schemas-microsoft-com:vml" xmlns:wp14="http://schemas.microsoft.com/office/word/2010/wordprocessingDrawing" xmlns:wp="http://schemas.openxmlformats.org/drawingml/2006/wordprocessingDrawing" xmlns:w10="urn:schemas-microsoft-com:office:word" xmlns:w="http://schemas.openxmlformats.org/wordprocessingml/2006/main" xmlns:w14="http://schemas.microsoft.com/office/word/2010/wordml" xmlns:w15="http://schemas.microsoft.com/office/word/2012/wordml" xmlns:w16cex="http://schemas.microsoft.com/office/word/2018/wordml/cex" xmlns:w16cid="http://schemas.microsoft.com/office/word/2016/wordml/cid" xmlns:w16="http://schemas.microsoft.com/office/word/2018/wordml" xmlns:w16du="http://schemas.microsoft.com/office/word/2023/wordml/word16du" xmlns:w16sdtdh="http://schemas.microsoft.com/office/word/2020/wordml/sdtdatahash" xmlns:w16sdtfl="http://schemas.microsoft.com/office/word/2024/wordml/sdtformatlock" xmlns:w16se="http://schemas.microsoft.com/office/word/2015/wordml/symex" xmlns:wpg="http://schemas.microsoft.com/office/word/2010/wordprocessingGroup" xmlns:wpi="http://schemas.microsoft.com/office/word/2010/wordprocessingInk" xmlns:wne="http://schemas.microsoft.com/office/word/2006/wordml" xmlns:wps="http://schemas.microsoft.com/office/word/2010/wordprocessingShape" mc:Ignorable="w14 w15 w16se w16cid w16 w16cex w16sdtdh w16sdtfl w16du wp14">
+  <w:endnote w:type="separator" w:id="-1">
+    <w:p>
+      <w:pPr>
+        <w:spacing w:after="0" w:line="240" w:lineRule="auto"/>
+      </w:pPr>
+      <w:r>
+        <w:separator/>
+      </w:r>
+    </w:p>
+  </w:endnote>
+  <w:endnote w:type="continuationSeparator" w:id="0">
+    <w:p>
+      <w:pPr>
+        <w:spacing w:after="0" w:line="240" w:lineRule="auto"/>
+      </w:pPr>
+      <w:r>
+        <w:continuationSeparator/>
+      </w:r>
+    </w:p>
+  </w:endnote>
+</w:endnotes>
+</file>
+
+<file path=word/footnotes.xml><?xml version="1.0" encoding="utf-8"?>
+<w:footnotes xmlns:wpc="http://schemas.microsoft.com/office/word/2010/wordprocessingCanvas" xmlns:cx="http://schemas.microsoft.com/office/drawing/2014/chartex" xmlns:cx1="http://schemas.microsoft.com/office/drawing/2015/9/8/chartex" xmlns:cx2="http://schemas.microsoft.com/office/drawing/2015/10/21/chartex" xmlns:cx3="http://schemas.microsoft.com/office/drawing/2016/5/9/chartex" xmlns:cx4="http://schemas.microsoft.com/office/drawing/2016/5/10/chartex" xmlns:cx5="http://schemas.microsoft.com/office/drawing/2016/5/11/chartex" xmlns:cx6="http://schemas.microsoft.com/office/drawing/2016/5/12/chartex" xmlns:cx7="http://schemas.microsoft.com/office/drawing/2016/5/13/chartex" xmlns:cx8="http://schemas.microsoft.com/office/drawing/2016/5/14/chartex" xmlns:mc="http://schemas.openxmlformats.org/markup-compatibility/2006" xmlns:aink="http://schemas.microsoft.com/office/drawing/2016/ink" xmlns:am3d="http://schemas.microsoft.com/office/drawing/2017/model3d" xmlns:o="urn:schemas-microsoft-com:office:office" xmlns:oel="http://schemas.microsoft.com/office/2019/extlst" xmlns:r="http://schemas.openxmlformats.org/officeDocument/2006/relationships" xmlns:m="http://schemas.openxmlformats.org/officeDocument/2006/math" xmlns:v="urn:schemas-microsoft-com:vml" xmlns:wp14="http://schemas.microsoft.com/office/word/2010/wordprocessingDrawing" xmlns:wp="http://schemas.openxmlformats.org/drawingml/2006/wordprocessingDrawing" xmlns:w10="urn:schemas-microsoft-com:office:word" xmlns:w="http://schemas.openxmlformats.org/wordprocessingml/2006/main" xmlns:w14="http://schemas.microsoft.com/office/word/2010/wordml" xmlns:w15="http://schemas.microsoft.com/office/word/2012/wordml" xmlns:w16cex="http://schemas.microsoft.com/office/word/2018/wordml/cex" xmlns:w16cid="http://schemas.microsoft.com/office/word/2016/wordml/cid" xmlns:w16="http://schemas.microsoft.com/office/word/2018/wordml" xmlns:w16du="http://schemas.microsoft.com/office/word/2023/wordml/word16du" xmlns:w16sdtdh="http://schemas.microsoft.com/office/word/2020/wordml/sdtdatahash" xmlns:w16sdtfl="http://schemas.microsoft.com/office/word/2024/wordml/sdtformatlock" xmlns:w16se="http://schemas.microsoft.com/office/word/2015/wordml/symex" xmlns:wpg="http://schemas.microsoft.com/office/word/2010/wordprocessingGroup" xmlns:wpi="http://schemas.microsoft.com/office/word/2010/wordprocessingInk" xmlns:wne="http://schemas.microsoft.com/office/word/2006/wordml" xmlns:wps="http://schemas.microsoft.com/office/word/2010/wordprocessingShape" mc:Ignorable="w14 w15 w16se w16cid w16 w16cex w16sdtdh w16sdtfl w16du wp14">
+  <w:footnote w:type="separator" w:id="-1">
+    <w:p>
+      <w:pPr>
+        <w:spacing w:after="0" w:line="240" w:lineRule="auto"/>
+      </w:pPr>
+      <w:r>
+        <w:separator/>
+      </w:r>
+    </w:p>
+  </w:footnote>
+  <w:footnote w:type="continuationSeparator" w:id="0">
+    <w:p>
+      <w:pPr>
+        <w:spacing w:after="0" w:line="240" w:lineRule="auto"/>
+      </w:pPr>
+      <w:r>
+        <w:continuationSeparator/>
+      </w:r>
+    </w:p>
+  </w:footnote>
+</w:footnotes>
 </file>
 
 <file path=word/numbering.xml><?xml version="1.0" encoding="utf-8"?>
@@ -7240,6 +7389,50 @@
       <w:szCs w:val="18"/>
     </w:rPr>
   </w:style>
+  <w:style w:type="paragraph" w:styleId="Kopfzeile">
+    <w:name w:val="header"/>
+    <w:basedOn w:val="Standard"/>
+    <w:link w:val="KopfzeileZchn"/>
+    <w:uiPriority w:val="99"/>
+    <w:unhideWhenUsed/>
+    <w:rsid w:val="00FE70AD"/>
+    <w:pPr>
+      <w:tabs>
+        <w:tab w:val="center" w:pos="4536"/>
+        <w:tab w:val="right" w:pos="9072"/>
+      </w:tabs>
+      <w:spacing w:after="0" w:line="240" w:lineRule="auto"/>
+    </w:pPr>
+  </w:style>
+  <w:style w:type="character" w:customStyle="1" w:styleId="KopfzeileZchn">
+    <w:name w:val="Kopfzeile Zchn"/>
+    <w:basedOn w:val="Absatz-Standardschriftart"/>
+    <w:link w:val="Kopfzeile"/>
+    <w:uiPriority w:val="99"/>
+    <w:rsid w:val="00FE70AD"/>
+  </w:style>
+  <w:style w:type="paragraph" w:styleId="Fuzeile">
+    <w:name w:val="footer"/>
+    <w:basedOn w:val="Standard"/>
+    <w:link w:val="FuzeileZchn"/>
+    <w:uiPriority w:val="99"/>
+    <w:unhideWhenUsed/>
+    <w:rsid w:val="00FE70AD"/>
+    <w:pPr>
+      <w:tabs>
+        <w:tab w:val="center" w:pos="4536"/>
+        <w:tab w:val="right" w:pos="9072"/>
+      </w:tabs>
+      <w:spacing w:after="0" w:line="240" w:lineRule="auto"/>
+    </w:pPr>
+  </w:style>
+  <w:style w:type="character" w:customStyle="1" w:styleId="FuzeileZchn">
+    <w:name w:val="Fußzeile Zchn"/>
+    <w:basedOn w:val="Absatz-Standardschriftart"/>
+    <w:link w:val="Fuzeile"/>
+    <w:uiPriority w:val="99"/>
+    <w:rsid w:val="00FE70AD"/>
+  </w:style>
 </w:styles>
 </file>
 

</xml_diff>

<commit_message>
SQLite Login und Logout implementiert
</commit_message>
<xml_diff>
--- a/Dokumentation.docx
+++ b/Dokumentation.docx
@@ -3920,8 +3920,13 @@
       <w:r>
         <w:t xml:space="preserve"> </w:t>
       </w:r>
-      <w:r>
-        <w:t>Automatisch erzeugte Ergebnisdatei eines Studierenden</w:t>
+      <w:proofErr w:type="gramStart"/>
+      <w:r>
+        <w:t>Automatisch</w:t>
+      </w:r>
+      <w:proofErr w:type="gramEnd"/>
+      <w:r>
+        <w:t xml:space="preserve"> erzeugte Ergebnisdatei eines Studierenden</w:t>
       </w:r>
     </w:p>
     <w:p>
@@ -4008,8 +4013,13 @@
       <w:r>
         <w:t xml:space="preserve"> </w:t>
       </w:r>
-      <w:r>
-        <w:t>Automatisch erzeugte Sammelübersicht der Prüfungsergebnisse.</w:t>
+      <w:proofErr w:type="gramStart"/>
+      <w:r>
+        <w:t>Automatisch</w:t>
+      </w:r>
+      <w:proofErr w:type="gramEnd"/>
+      <w:r>
+        <w:t xml:space="preserve"> erzeugte Sammelübersicht der Prüfungsergebnisse.</w:t>
       </w:r>
     </w:p>
     <w:p>
@@ -4096,8 +4106,13 @@
       <w:r>
         <w:t xml:space="preserve"> </w:t>
       </w:r>
-      <w:r>
-        <w:t>Automatisch erzeugte Ordnerstruktur für die Speicherung der Prüfungsergebnisse.</w:t>
+      <w:proofErr w:type="gramStart"/>
+      <w:r>
+        <w:t>Automatisch</w:t>
+      </w:r>
+      <w:proofErr w:type="gramEnd"/>
+      <w:r>
+        <w:t xml:space="preserve"> erzeugte Ordnerstruktur für die Speicherung der Prüfungsergebnisse.</w:t>
       </w:r>
     </w:p>
     <w:p>
@@ -4132,7 +4147,15 @@
     </w:p>
     <w:p>
       <w:r>
-        <w:t>Im Rahmen der Weiterentwicklung wurde die grafische Benutzeroberfläche überarbeitet. Hierzu wurden ein einheitliches Farbschema, das Unternehmenslogo sowie zentrale Designelemente in einer separaten Klasse (Style.java) ausgelagert. Dadurch können Farben, Schriftarten und Komponenten zentral verwaltet und wiederverwendet werden. Zusätzlich wurde das Layout der Anwendung optimiert, sodass sich die Oberfläche auch bei unterschiedlichen Fenstergrößen konsistent darstellt.</w:t>
+        <w:t xml:space="preserve">Im Rahmen der Weiterentwicklung wurde die grafische Benutzeroberfläche überarbeitet. Hierzu </w:t>
+      </w:r>
+      <w:proofErr w:type="gramStart"/>
+      <w:r>
+        <w:t>wurden</w:t>
+      </w:r>
+      <w:proofErr w:type="gramEnd"/>
+      <w:r>
+        <w:t xml:space="preserve"> ein einheitliches Farbschema, das Unternehmenslogo sowie zentrale Designelemente in einer separaten Klasse (Style.java) ausgelagert. Dadurch können Farben, Schriftarten und Komponenten zentral verwaltet und wiederverwendet werden. Zusätzlich wurde das Layout der Anwendung optimiert, sodass sich die Oberfläche auch bei unterschiedlichen Fenstergrößen konsistent darstellt.</w:t>
       </w:r>
     </w:p>
     <w:p>
@@ -4614,6 +4637,114 @@
           <w:bCs/>
         </w:rPr>
         <w:lastRenderedPageBreak/>
+        <w:t>Phase 5.</w:t>
+      </w:r>
+      <w:r>
+        <w:rPr>
+          <w:b/>
+          <w:bCs/>
+        </w:rPr>
+        <w:t>1 – Klassendiagramm</w:t>
+      </w:r>
+    </w:p>
+    <w:p>
+      <w:pPr>
+        <w:keepNext/>
+      </w:pPr>
+      <w:r>
+        <w:rPr>
+          <w:b/>
+          <w:bCs/>
+          <w:noProof/>
+        </w:rPr>
+        <w:drawing>
+          <wp:inline distT="0" distB="0" distL="0" distR="0" wp14:anchorId="302724BD" wp14:editId="7FCCB1EE">
+            <wp:extent cx="5760720" cy="2030730"/>
+            <wp:effectExtent l="0" t="0" r="0" b="7620"/>
+            <wp:docPr id="1439232671" name="Grafik 10"/>
+            <wp:cNvGraphicFramePr>
+              <a:graphicFrameLocks xmlns:a="http://schemas.openxmlformats.org/drawingml/2006/main" noChangeAspect="1"/>
+            </wp:cNvGraphicFramePr>
+            <a:graphic xmlns:a="http://schemas.openxmlformats.org/drawingml/2006/main">
+              <a:graphicData uri="http://schemas.openxmlformats.org/drawingml/2006/picture">
+                <pic:pic xmlns:pic="http://schemas.openxmlformats.org/drawingml/2006/picture">
+                  <pic:nvPicPr>
+                    <pic:cNvPr id="1439232671" name="Grafik 1439232671"/>
+                    <pic:cNvPicPr/>
+                  </pic:nvPicPr>
+                  <pic:blipFill>
+                    <a:blip r:embed="rId25">
+                      <a:extLst>
+                        <a:ext uri="{28A0092B-C50C-407E-A947-70E740481C1C}">
+                          <a14:useLocalDpi xmlns:a14="http://schemas.microsoft.com/office/drawing/2010/main" val="0"/>
+                        </a:ext>
+                      </a:extLst>
+                    </a:blip>
+                    <a:stretch>
+                      <a:fillRect/>
+                    </a:stretch>
+                  </pic:blipFill>
+                  <pic:spPr>
+                    <a:xfrm>
+                      <a:off x="0" y="0"/>
+                      <a:ext cx="5760720" cy="2030730"/>
+                    </a:xfrm>
+                    <a:prstGeom prst="rect">
+                      <a:avLst/>
+                    </a:prstGeom>
+                  </pic:spPr>
+                </pic:pic>
+              </a:graphicData>
+            </a:graphic>
+          </wp:inline>
+        </w:drawing>
+      </w:r>
+    </w:p>
+    <w:p>
+      <w:pPr>
+        <w:pStyle w:val="Beschriftung"/>
+        <w:rPr>
+          <w:b/>
+          <w:bCs/>
+        </w:rPr>
+      </w:pPr>
+      <w:r>
+        <w:t xml:space="preserve">Abbildung </w:t>
+      </w:r>
+      <w:r>
+        <w:fldChar w:fldCharType="begin"/>
+      </w:r>
+      <w:r>
+        <w:instrText xml:space="preserve"> SEQ Abbildung \* ARABIC </w:instrText>
+      </w:r>
+      <w:r>
+        <w:fldChar w:fldCharType="separate"/>
+      </w:r>
+      <w:r>
+        <w:rPr>
+          <w:noProof/>
+        </w:rPr>
+        <w:t>14</w:t>
+      </w:r>
+      <w:r>
+        <w:fldChar w:fldCharType="end"/>
+      </w:r>
+      <w:r>
+        <w:t xml:space="preserve"> Klassendiagram Datenbank</w:t>
+      </w:r>
+    </w:p>
+    <w:p>
+      <w:pPr>
+        <w:rPr>
+          <w:b/>
+          <w:bCs/>
+        </w:rPr>
+      </w:pPr>
+      <w:r>
+        <w:rPr>
+          <w:b/>
+          <w:bCs/>
+        </w:rPr>
         <w:t>Phase 5.2 – SQLite-Anbindung</w:t>
       </w:r>
     </w:p>
@@ -4662,7 +4793,7 @@
                     <pic:cNvPicPr/>
                   </pic:nvPicPr>
                   <pic:blipFill>
-                    <a:blip r:embed="rId25">
+                    <a:blip r:embed="rId26">
                       <a:extLst>
                         <a:ext uri="{28A0092B-C50C-407E-A947-70E740481C1C}">
                           <a14:useLocalDpi xmlns:a14="http://schemas.microsoft.com/office/drawing/2010/main" val="0"/>
@@ -4709,7 +4840,7 @@
         <w:rPr>
           <w:noProof/>
         </w:rPr>
-        <w:t>14</w:t>
+        <w:t>15</w:t>
       </w:r>
       <w:r>
         <w:fldChar w:fldCharType="end"/>
@@ -4719,6 +4850,113 @@
       </w:r>
       <w:r>
         <w:t>Erfolgreicher Verbindungsaufbau zur SQLite-Datenbank</w:t>
+      </w:r>
+    </w:p>
+    <w:p>
+      <w:pPr>
+        <w:keepNext/>
+      </w:pPr>
+      <w:r>
+        <w:rPr>
+          <w:noProof/>
+        </w:rPr>
+        <w:drawing>
+          <wp:inline distT="0" distB="0" distL="0" distR="0" wp14:anchorId="0B42F229" wp14:editId="4EE17CC3">
+            <wp:extent cx="3730752" cy="2335832"/>
+            <wp:effectExtent l="0" t="0" r="3175" b="7620"/>
+            <wp:docPr id="492860101" name="Grafik 11"/>
+            <wp:cNvGraphicFramePr>
+              <a:graphicFrameLocks xmlns:a="http://schemas.openxmlformats.org/drawingml/2006/main" noChangeAspect="1"/>
+            </wp:cNvGraphicFramePr>
+            <a:graphic xmlns:a="http://schemas.openxmlformats.org/drawingml/2006/main">
+              <a:graphicData uri="http://schemas.openxmlformats.org/drawingml/2006/picture">
+                <pic:pic xmlns:pic="http://schemas.openxmlformats.org/drawingml/2006/picture">
+                  <pic:nvPicPr>
+                    <pic:cNvPr id="492860101" name="Grafik 492860101"/>
+                    <pic:cNvPicPr/>
+                  </pic:nvPicPr>
+                  <pic:blipFill>
+                    <a:blip r:embed="rId27">
+                      <a:extLst>
+                        <a:ext uri="{28A0092B-C50C-407E-A947-70E740481C1C}">
+                          <a14:useLocalDpi xmlns:a14="http://schemas.microsoft.com/office/drawing/2010/main" val="0"/>
+                        </a:ext>
+                      </a:extLst>
+                    </a:blip>
+                    <a:stretch>
+                      <a:fillRect/>
+                    </a:stretch>
+                  </pic:blipFill>
+                  <pic:spPr>
+                    <a:xfrm>
+                      <a:off x="0" y="0"/>
+                      <a:ext cx="3746940" cy="2345967"/>
+                    </a:xfrm>
+                    <a:prstGeom prst="rect">
+                      <a:avLst/>
+                    </a:prstGeom>
+                  </pic:spPr>
+                </pic:pic>
+              </a:graphicData>
+            </a:graphic>
+          </wp:inline>
+        </w:drawing>
+      </w:r>
+    </w:p>
+    <w:p>
+      <w:pPr>
+        <w:pStyle w:val="Beschriftung"/>
+      </w:pPr>
+      <w:r>
+        <w:t xml:space="preserve">Abbildung </w:t>
+      </w:r>
+      <w:r>
+        <w:fldChar w:fldCharType="begin"/>
+      </w:r>
+      <w:r>
+        <w:instrText xml:space="preserve"> SEQ Abbildung \* ARABIC </w:instrText>
+      </w:r>
+      <w:r>
+        <w:fldChar w:fldCharType="separate"/>
+      </w:r>
+      <w:r>
+        <w:rPr>
+          <w:noProof/>
+        </w:rPr>
+        <w:t>16</w:t>
+      </w:r>
+      <w:r>
+        <w:fldChar w:fldCharType="end"/>
+      </w:r>
+      <w:r>
+        <w:t xml:space="preserve"> </w:t>
+      </w:r>
+      <w:r>
+        <w:t xml:space="preserve">Inhalt der SQLite-Tabelle </w:t>
+      </w:r>
+      <w:proofErr w:type="spellStart"/>
+      <w:r>
+        <w:t>users</w:t>
+      </w:r>
+      <w:proofErr w:type="spellEnd"/>
+      <w:r>
+        <w:t xml:space="preserve"> mit den Standardbenutzern </w:t>
+      </w:r>
+      <w:proofErr w:type="spellStart"/>
+      <w:r>
+        <w:t>student</w:t>
+      </w:r>
+      <w:proofErr w:type="spellEnd"/>
+      <w:r>
+        <w:t xml:space="preserve"> und </w:t>
+      </w:r>
+      <w:proofErr w:type="spellStart"/>
+      <w:r>
+        <w:t>dozent</w:t>
+      </w:r>
+      <w:proofErr w:type="spellEnd"/>
+      <w:r>
+        <w:t>.</w:t>
       </w:r>
     </w:p>
     <w:p/>

</xml_diff>

<commit_message>
Phase 6: GUI zum Anlegen von Prüfungen erstellt
</commit_message>
<xml_diff>
--- a/Dokumentation.docx
+++ b/Dokumentation.docx
@@ -3062,7 +3062,7 @@
           <w:noProof/>
         </w:rPr>
         <w:drawing>
-          <wp:anchor distT="0" distB="0" distL="114300" distR="114300" simplePos="0" relativeHeight="251666432" behindDoc="0" locked="0" layoutInCell="1" allowOverlap="1" wp14:anchorId="30414A45" wp14:editId="609C9E51">
+          <wp:anchor distT="0" distB="0" distL="114300" distR="114300" simplePos="0" relativeHeight="251666432" behindDoc="0" locked="0" layoutInCell="1" allowOverlap="1" wp14:anchorId="30414A45" wp14:editId="3632FC17">
             <wp:simplePos x="0" y="0"/>
             <wp:positionH relativeFrom="margin">
               <wp:align>right</wp:align>
@@ -3124,7 +3124,7 @@
           <w:noProof/>
         </w:rPr>
         <w:drawing>
-          <wp:anchor distT="0" distB="0" distL="114300" distR="114300" simplePos="0" relativeHeight="251667456" behindDoc="0" locked="0" layoutInCell="1" allowOverlap="1" wp14:anchorId="38FD9A55" wp14:editId="1E814765">
+          <wp:anchor distT="0" distB="0" distL="114300" distR="114300" simplePos="0" relativeHeight="251667456" behindDoc="0" locked="0" layoutInCell="1" allowOverlap="1" wp14:anchorId="38FD9A55" wp14:editId="4B1315AA">
             <wp:simplePos x="0" y="0"/>
             <wp:positionH relativeFrom="column">
               <wp:posOffset>90805</wp:posOffset>
@@ -3316,7 +3316,7 @@
           <w:noProof/>
         </w:rPr>
         <w:drawing>
-          <wp:anchor distT="0" distB="0" distL="114300" distR="114300" simplePos="0" relativeHeight="251668480" behindDoc="0" locked="0" layoutInCell="1" allowOverlap="1" wp14:anchorId="6F7F581A" wp14:editId="6E647249">
+          <wp:anchor distT="0" distB="0" distL="114300" distR="114300" simplePos="0" relativeHeight="251668480" behindDoc="0" locked="0" layoutInCell="1" allowOverlap="1" wp14:anchorId="6F7F581A" wp14:editId="0A4D1B0A">
             <wp:simplePos x="0" y="0"/>
             <wp:positionH relativeFrom="column">
               <wp:posOffset>147955</wp:posOffset>
@@ -3626,7 +3626,7 @@
         </w:rPr>
         <w:lastRenderedPageBreak/>
         <w:drawing>
-          <wp:anchor distT="0" distB="0" distL="114300" distR="114300" simplePos="0" relativeHeight="251671552" behindDoc="0" locked="0" layoutInCell="1" allowOverlap="1" wp14:anchorId="076D891D" wp14:editId="3019F1F8">
+          <wp:anchor distT="0" distB="0" distL="114300" distR="114300" simplePos="0" relativeHeight="251671552" behindDoc="0" locked="0" layoutInCell="1" allowOverlap="1" wp14:anchorId="076D891D" wp14:editId="4656C840">
             <wp:simplePos x="0" y="0"/>
             <wp:positionH relativeFrom="column">
               <wp:posOffset>3110230</wp:posOffset>
@@ -3685,7 +3685,7 @@
           <w:noProof/>
         </w:rPr>
         <w:drawing>
-          <wp:inline distT="0" distB="0" distL="0" distR="0" wp14:anchorId="2DDC6EE9" wp14:editId="26373C88">
+          <wp:inline distT="0" distB="0" distL="0" distR="0" wp14:anchorId="2DDC6EE9" wp14:editId="60F8DD83">
             <wp:extent cx="2469686" cy="1666875"/>
             <wp:effectExtent l="19050" t="19050" r="26035" b="9525"/>
             <wp:docPr id="1870732759" name="Grafik 9"/>
@@ -3850,7 +3850,7 @@
         </w:rPr>
         <w:lastRenderedPageBreak/>
         <w:drawing>
-          <wp:inline distT="0" distB="0" distL="0" distR="0" wp14:anchorId="7AA15A65" wp14:editId="5DA88D07">
+          <wp:inline distT="0" distB="0" distL="0" distR="0" wp14:anchorId="7AA15A65" wp14:editId="226D94F9">
             <wp:extent cx="2801815" cy="2603846"/>
             <wp:effectExtent l="0" t="0" r="0" b="6350"/>
             <wp:docPr id="422847558" name="Grafik 8"/>
@@ -3915,6 +3915,9 @@
         <w:t>8</w:t>
       </w:r>
       <w:r>
+        <w:rPr>
+          <w:noProof/>
+        </w:rPr>
         <w:fldChar w:fldCharType="end"/>
       </w:r>
       <w:r>
@@ -4008,6 +4011,9 @@
         <w:t>9</w:t>
       </w:r>
       <w:r>
+        <w:rPr>
+          <w:noProof/>
+        </w:rPr>
         <w:fldChar w:fldCharType="end"/>
       </w:r>
       <w:r>
@@ -4101,6 +4107,9 @@
         <w:t>10</w:t>
       </w:r>
       <w:r>
+        <w:rPr>
+          <w:noProof/>
+        </w:rPr>
         <w:fldChar w:fldCharType="end"/>
       </w:r>
       <w:r>
@@ -4167,7 +4176,7 @@
           <w:noProof/>
         </w:rPr>
         <w:drawing>
-          <wp:inline distT="0" distB="0" distL="0" distR="0" wp14:anchorId="7965622C" wp14:editId="1D799DD4">
+          <wp:inline distT="0" distB="0" distL="0" distR="0" wp14:anchorId="7965622C" wp14:editId="7DD65451">
             <wp:extent cx="3390900" cy="2397776"/>
             <wp:effectExtent l="19050" t="19050" r="19050" b="21590"/>
             <wp:docPr id="1745081094" name="Grafik 8"/>
@@ -4237,6 +4246,9 @@
         <w:t>11</w:t>
       </w:r>
       <w:r>
+        <w:rPr>
+          <w:noProof/>
+        </w:rPr>
         <w:fldChar w:fldCharType="end"/>
       </w:r>
       <w:r>
@@ -4526,6 +4538,9 @@
         <w:t>12</w:t>
       </w:r>
       <w:r>
+        <w:rPr>
+          <w:noProof/>
+        </w:rPr>
         <w:fldChar w:fldCharType="end"/>
       </w:r>
       <w:r>
@@ -4544,7 +4559,7 @@
           <w:noProof/>
         </w:rPr>
         <w:drawing>
-          <wp:inline distT="0" distB="0" distL="0" distR="0" wp14:anchorId="2CD4F620" wp14:editId="4BDAA1AF">
+          <wp:inline distT="0" distB="0" distL="0" distR="0" wp14:anchorId="2CD4F620" wp14:editId="45B9A406">
             <wp:extent cx="3543300" cy="2125901"/>
             <wp:effectExtent l="19050" t="19050" r="19050" b="27305"/>
             <wp:docPr id="2129645333" name="Grafik 9"/>
@@ -4614,6 +4629,9 @@
         <w:t>13</w:t>
       </w:r>
       <w:r>
+        <w:rPr>
+          <w:noProof/>
+        </w:rPr>
         <w:fldChar w:fldCharType="end"/>
       </w:r>
       <w:r>
@@ -4637,14 +4655,22 @@
           <w:bCs/>
         </w:rPr>
         <w:lastRenderedPageBreak/>
-        <w:t>Phase 5.</w:t>
-      </w:r>
-      <w:r>
+        <w:t>Phase 5</w:t>
+      </w:r>
+    </w:p>
+    <w:p>
+      <w:pPr>
         <w:rPr>
           <w:b/>
           <w:bCs/>
         </w:rPr>
-        <w:t>1 – Klassendiagramm</w:t>
+      </w:pPr>
+      <w:r>
+        <w:rPr>
+          <w:b/>
+          <w:bCs/>
+        </w:rPr>
+        <w:t>Klassendiagramm</w:t>
       </w:r>
     </w:p>
     <w:p>
@@ -4727,6 +4753,9 @@
         <w:t>14</w:t>
       </w:r>
       <w:r>
+        <w:rPr>
+          <w:noProof/>
+        </w:rPr>
         <w:fldChar w:fldCharType="end"/>
       </w:r>
       <w:r>
@@ -4745,7 +4774,7 @@
           <w:b/>
           <w:bCs/>
         </w:rPr>
-        <w:t>Phase 5.2 – SQLite-Anbindung</w:t>
+        <w:t>SQLite-Anbindung</w:t>
       </w:r>
     </w:p>
     <w:p>
@@ -4843,6 +4872,9 @@
         <w:t>15</w:t>
       </w:r>
       <w:r>
+        <w:rPr>
+          <w:noProof/>
+        </w:rPr>
         <w:fldChar w:fldCharType="end"/>
       </w:r>
       <w:r>
@@ -4926,6 +4958,9 @@
         <w:t>16</w:t>
       </w:r>
       <w:r>
+        <w:rPr>
+          <w:noProof/>
+        </w:rPr>
         <w:fldChar w:fldCharType="end"/>
       </w:r>
       <w:r>
@@ -4959,7 +4994,539 @@
         <w:t>.</w:t>
       </w:r>
     </w:p>
-    <w:p/>
+    <w:p>
+      <w:r>
+        <w:rPr>
+          <w:b/>
+          <w:bCs/>
+        </w:rPr>
+        <w:t>Repository-Muster</w:t>
+      </w:r>
+    </w:p>
+    <w:p>
+      <w:r>
+        <w:t xml:space="preserve">Der Datenzugriff wurde über die Klasse </w:t>
+      </w:r>
+      <w:proofErr w:type="spellStart"/>
+      <w:r>
+        <w:t>UserRepository</w:t>
+      </w:r>
+      <w:proofErr w:type="spellEnd"/>
+      <w:r>
+        <w:t xml:space="preserve"> umgesetzt. Dadurch sind Datenbankoperationen von der Benutzeroberfläche getrennt. Die Methode </w:t>
+      </w:r>
+      <w:proofErr w:type="spellStart"/>
+      <w:proofErr w:type="gramStart"/>
+      <w:r>
+        <w:lastRenderedPageBreak/>
+        <w:t>getUserByUsername</w:t>
+      </w:r>
+      <w:proofErr w:type="spellEnd"/>
+      <w:r>
+        <w:t>(</w:t>
+      </w:r>
+      <w:proofErr w:type="gramEnd"/>
+      <w:r>
+        <w:t>) ermöglicht das Auslesen eines Benutzers anhand seines Benutzernamens.</w:t>
+      </w:r>
+    </w:p>
+    <w:p>
+      <w:r>
+        <w:rPr>
+          <w:b/>
+          <w:bCs/>
+        </w:rPr>
+        <w:t>Login über Datenbank</w:t>
+      </w:r>
+    </w:p>
+    <w:p>
+      <w:r>
+        <w:t xml:space="preserve">Die bisher hartcodierten Benutzer wurden entfernt. Die Authentifizierung erfolgt nun über die SQLite-Datenbank. Der </w:t>
+      </w:r>
+      <w:proofErr w:type="spellStart"/>
+      <w:r>
+        <w:t>UserService</w:t>
+      </w:r>
+      <w:proofErr w:type="spellEnd"/>
+      <w:r>
+        <w:t xml:space="preserve"> greift dabei auf das </w:t>
+      </w:r>
+      <w:proofErr w:type="spellStart"/>
+      <w:r>
+        <w:t>UserRepository</w:t>
+      </w:r>
+      <w:proofErr w:type="spellEnd"/>
+      <w:r>
+        <w:t xml:space="preserve"> zu und überprüft die eingegebenen Zugangsdaten.</w:t>
+      </w:r>
+    </w:p>
+    <w:p>
+      <w:r>
+        <w:rPr>
+          <w:b/>
+          <w:bCs/>
+        </w:rPr>
+        <w:t>Logout-Funktion</w:t>
+      </w:r>
+    </w:p>
+    <w:p>
+      <w:r>
+        <w:t xml:space="preserve">Sowohl in der Studenten- als auch in der Dozentenoberfläche wurde eine Logout-Funktion integriert. Beim Logout wird der aktuell angemeldete Benutzer aus </w:t>
+      </w:r>
+      <w:proofErr w:type="spellStart"/>
+      <w:r>
+        <w:t>CurrentUser</w:t>
+      </w:r>
+      <w:proofErr w:type="spellEnd"/>
+      <w:r>
+        <w:t xml:space="preserve"> entfernt, das aktuelle Fenster geschlossen und die Login-Oberfläche erneut geöffnet.</w:t>
+      </w:r>
+    </w:p>
+    <w:p>
+      <w:pPr>
+        <w:keepNext/>
+      </w:pPr>
+      <w:r>
+        <w:rPr>
+          <w:noProof/>
+        </w:rPr>
+        <w:drawing>
+          <wp:anchor distT="0" distB="0" distL="114300" distR="114300" simplePos="0" relativeHeight="251675648" behindDoc="0" locked="0" layoutInCell="1" allowOverlap="1" wp14:anchorId="25EB19CA" wp14:editId="29F7223E">
+            <wp:simplePos x="0" y="0"/>
+            <wp:positionH relativeFrom="margin">
+              <wp:align>left</wp:align>
+            </wp:positionH>
+            <wp:positionV relativeFrom="paragraph">
+              <wp:posOffset>20955</wp:posOffset>
+            </wp:positionV>
+            <wp:extent cx="2995930" cy="1798955"/>
+            <wp:effectExtent l="19050" t="19050" r="13970" b="10795"/>
+            <wp:wrapSquare wrapText="bothSides"/>
+            <wp:docPr id="1601899060" name="Grafik 12"/>
+            <wp:cNvGraphicFramePr>
+              <a:graphicFrameLocks xmlns:a="http://schemas.openxmlformats.org/drawingml/2006/main" noChangeAspect="1"/>
+            </wp:cNvGraphicFramePr>
+            <a:graphic xmlns:a="http://schemas.openxmlformats.org/drawingml/2006/main">
+              <a:graphicData uri="http://schemas.openxmlformats.org/drawingml/2006/picture">
+                <pic:pic xmlns:pic="http://schemas.openxmlformats.org/drawingml/2006/picture">
+                  <pic:nvPicPr>
+                    <pic:cNvPr id="1601899060" name="Grafik 1601899060"/>
+                    <pic:cNvPicPr/>
+                  </pic:nvPicPr>
+                  <pic:blipFill>
+                    <a:blip r:embed="rId28" cstate="print">
+                      <a:extLst>
+                        <a:ext uri="{28A0092B-C50C-407E-A947-70E740481C1C}">
+                          <a14:useLocalDpi xmlns:a14="http://schemas.microsoft.com/office/drawing/2010/main" val="0"/>
+                        </a:ext>
+                      </a:extLst>
+                    </a:blip>
+                    <a:stretch>
+                      <a:fillRect/>
+                    </a:stretch>
+                  </pic:blipFill>
+                  <pic:spPr>
+                    <a:xfrm>
+                      <a:off x="0" y="0"/>
+                      <a:ext cx="2995930" cy="1798955"/>
+                    </a:xfrm>
+                    <a:prstGeom prst="rect">
+                      <a:avLst/>
+                    </a:prstGeom>
+                    <a:ln>
+                      <a:solidFill>
+                        <a:srgbClr val="EE0000"/>
+                      </a:solidFill>
+                    </a:ln>
+                  </pic:spPr>
+                </pic:pic>
+              </a:graphicData>
+            </a:graphic>
+            <wp14:sizeRelH relativeFrom="margin">
+              <wp14:pctWidth>0</wp14:pctWidth>
+            </wp14:sizeRelH>
+            <wp14:sizeRelV relativeFrom="margin">
+              <wp14:pctHeight>0</wp14:pctHeight>
+            </wp14:sizeRelV>
+          </wp:anchor>
+        </w:drawing>
+      </w:r>
+      <w:r>
+        <w:rPr>
+          <w:noProof/>
+        </w:rPr>
+        <w:drawing>
+          <wp:anchor distT="0" distB="0" distL="114300" distR="114300" simplePos="0" relativeHeight="251672576" behindDoc="0" locked="0" layoutInCell="1" allowOverlap="1" wp14:anchorId="302F5CF5" wp14:editId="77BA6B77">
+            <wp:simplePos x="0" y="0"/>
+            <wp:positionH relativeFrom="margin">
+              <wp:posOffset>3509501</wp:posOffset>
+            </wp:positionH>
+            <wp:positionV relativeFrom="paragraph">
+              <wp:posOffset>26670</wp:posOffset>
+            </wp:positionV>
+            <wp:extent cx="2579370" cy="1827530"/>
+            <wp:effectExtent l="19050" t="19050" r="11430" b="20320"/>
+            <wp:wrapSquare wrapText="bothSides"/>
+            <wp:docPr id="144422565" name="Grafik 13"/>
+            <wp:cNvGraphicFramePr>
+              <a:graphicFrameLocks xmlns:a="http://schemas.openxmlformats.org/drawingml/2006/main" noChangeAspect="1"/>
+            </wp:cNvGraphicFramePr>
+            <a:graphic xmlns:a="http://schemas.openxmlformats.org/drawingml/2006/main">
+              <a:graphicData uri="http://schemas.openxmlformats.org/drawingml/2006/picture">
+                <pic:pic xmlns:pic="http://schemas.openxmlformats.org/drawingml/2006/picture">
+                  <pic:nvPicPr>
+                    <pic:cNvPr id="144422565" name="Grafik 144422565"/>
+                    <pic:cNvPicPr/>
+                  </pic:nvPicPr>
+                  <pic:blipFill>
+                    <a:blip r:embed="rId29" cstate="print">
+                      <a:extLst>
+                        <a:ext uri="{28A0092B-C50C-407E-A947-70E740481C1C}">
+                          <a14:useLocalDpi xmlns:a14="http://schemas.microsoft.com/office/drawing/2010/main" val="0"/>
+                        </a:ext>
+                      </a:extLst>
+                    </a:blip>
+                    <a:stretch>
+                      <a:fillRect/>
+                    </a:stretch>
+                  </pic:blipFill>
+                  <pic:spPr>
+                    <a:xfrm>
+                      <a:off x="0" y="0"/>
+                      <a:ext cx="2579370" cy="1827530"/>
+                    </a:xfrm>
+                    <a:prstGeom prst="rect">
+                      <a:avLst/>
+                    </a:prstGeom>
+                    <a:ln>
+                      <a:solidFill>
+                        <a:srgbClr val="EE0000"/>
+                      </a:solidFill>
+                    </a:ln>
+                  </pic:spPr>
+                </pic:pic>
+              </a:graphicData>
+            </a:graphic>
+            <wp14:sizeRelH relativeFrom="margin">
+              <wp14:pctWidth>0</wp14:pctWidth>
+            </wp14:sizeRelH>
+            <wp14:sizeRelV relativeFrom="margin">
+              <wp14:pctHeight>0</wp14:pctHeight>
+            </wp14:sizeRelV>
+          </wp:anchor>
+        </w:drawing>
+      </w:r>
+      <w:r>
+        <w:t xml:space="preserve"> </w:t>
+      </w:r>
+    </w:p>
+    <w:p>
+      <w:pPr>
+        <w:pStyle w:val="Beschriftung"/>
+      </w:pPr>
+      <w:r>
+        <w:rPr>
+          <w:noProof/>
+        </w:rPr>
+        <mc:AlternateContent>
+          <mc:Choice Requires="wps">
+            <w:drawing>
+              <wp:anchor distT="0" distB="0" distL="114300" distR="114300" simplePos="0" relativeHeight="251674624" behindDoc="0" locked="0" layoutInCell="1" allowOverlap="1" wp14:anchorId="01235F58" wp14:editId="4BCBB0FF">
+                <wp:simplePos x="0" y="0"/>
+                <wp:positionH relativeFrom="column">
+                  <wp:posOffset>3502901</wp:posOffset>
+                </wp:positionH>
+                <wp:positionV relativeFrom="paragraph">
+                  <wp:posOffset>1567494</wp:posOffset>
+                </wp:positionV>
+                <wp:extent cx="2590800" cy="635"/>
+                <wp:effectExtent l="0" t="0" r="0" b="0"/>
+                <wp:wrapSquare wrapText="bothSides"/>
+                <wp:docPr id="1637318663" name="Textfeld 1"/>
+                <wp:cNvGraphicFramePr/>
+                <a:graphic xmlns:a="http://schemas.openxmlformats.org/drawingml/2006/main">
+                  <a:graphicData uri="http://schemas.microsoft.com/office/word/2010/wordprocessingShape">
+                    <wps:wsp>
+                      <wps:cNvSpPr txBox="1"/>
+                      <wps:spPr>
+                        <a:xfrm>
+                          <a:off x="0" y="0"/>
+                          <a:ext cx="2590800" cy="635"/>
+                        </a:xfrm>
+                        <a:prstGeom prst="rect">
+                          <a:avLst/>
+                        </a:prstGeom>
+                        <a:solidFill>
+                          <a:prstClr val="white"/>
+                        </a:solidFill>
+                        <a:ln>
+                          <a:noFill/>
+                        </a:ln>
+                      </wps:spPr>
+                      <wps:txbx>
+                        <w:txbxContent>
+                          <w:p>
+                            <w:pPr>
+                              <w:pStyle w:val="Beschriftung"/>
+                              <w:rPr>
+                                <w:noProof/>
+                              </w:rPr>
+                            </w:pPr>
+                            <w:r>
+                              <w:t xml:space="preserve">Abbildung </w:t>
+                            </w:r>
+                            <w:r>
+                              <w:fldChar w:fldCharType="begin"/>
+                            </w:r>
+                            <w:r>
+                              <w:instrText xml:space="preserve"> SEQ Abbildung \* ARABIC </w:instrText>
+                            </w:r>
+                            <w:r>
+                              <w:fldChar w:fldCharType="separate"/>
+                            </w:r>
+                            <w:r>
+                              <w:rPr>
+                                <w:noProof/>
+                              </w:rPr>
+                              <w:t>17</w:t>
+                            </w:r>
+                            <w:r>
+                              <w:rPr>
+                                <w:noProof/>
+                              </w:rPr>
+                              <w:fldChar w:fldCharType="end"/>
+                            </w:r>
+                            <w:r>
+                              <w:t xml:space="preserve"> </w:t>
+                            </w:r>
+                            <w:r>
+                              <w:t>Studentenoberfläche mit Benutzeranzeige und Logout-Funktion</w:t>
+                            </w:r>
+                          </w:p>
+                        </w:txbxContent>
+                      </wps:txbx>
+                      <wps:bodyPr rot="0" spcFirstLastPara="0" vertOverflow="overflow" horzOverflow="overflow" vert="horz" wrap="square" lIns="0" tIns="0" rIns="0" bIns="0" numCol="1" spcCol="0" rtlCol="0" fromWordArt="0" anchor="t" anchorCtr="0" forceAA="0" compatLnSpc="1">
+                        <a:prstTxWarp prst="textNoShape">
+                          <a:avLst/>
+                        </a:prstTxWarp>
+                        <a:spAutoFit/>
+                      </wps:bodyPr>
+                    </wps:wsp>
+                  </a:graphicData>
+                </a:graphic>
+              </wp:anchor>
+            </w:drawing>
+          </mc:Choice>
+          <mc:Fallback>
+            <w:pict>
+              <v:shape w14:anchorId="01235F58" id="_x0000_s1031" type="#_x0000_t202" style="position:absolute;margin-left:275.8pt;margin-top:123.4pt;width:204pt;height:.05pt;z-index:251674624;visibility:visible;mso-wrap-style:square;mso-wrap-distance-left:9pt;mso-wrap-distance-top:0;mso-wrap-distance-right:9pt;mso-wrap-distance-bottom:0;mso-position-horizontal:absolute;mso-position-horizontal-relative:text;mso-position-vertical:absolute;mso-position-vertical-relative:text;v-text-anchor:top" o:gfxdata="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" stroked="f">
+                <v:textbox style="mso-fit-shape-to-text:t" inset="0,0,0,0">
+                  <w:txbxContent>
+                    <w:p>
+                      <w:pPr>
+                        <w:pStyle w:val="Beschriftung"/>
+                        <w:rPr>
+                          <w:noProof/>
+                        </w:rPr>
+                      </w:pPr>
+                      <w:r>
+                        <w:t xml:space="preserve">Abbildung </w:t>
+                      </w:r>
+                      <w:r>
+                        <w:fldChar w:fldCharType="begin"/>
+                      </w:r>
+                      <w:r>
+                        <w:instrText xml:space="preserve"> SEQ Abbildung \* ARABIC </w:instrText>
+                      </w:r>
+                      <w:r>
+                        <w:fldChar w:fldCharType="separate"/>
+                      </w:r>
+                      <w:r>
+                        <w:rPr>
+                          <w:noProof/>
+                        </w:rPr>
+                        <w:t>17</w:t>
+                      </w:r>
+                      <w:r>
+                        <w:rPr>
+                          <w:noProof/>
+                        </w:rPr>
+                        <w:fldChar w:fldCharType="end"/>
+                      </w:r>
+                      <w:r>
+                        <w:t xml:space="preserve"> </w:t>
+                      </w:r>
+                      <w:r>
+                        <w:t>Studentenoberfläche mit Benutzeranzeige und Logout-Funktion</w:t>
+                      </w:r>
+                    </w:p>
+                  </w:txbxContent>
+                </v:textbox>
+                <w10:wrap type="square"/>
+              </v:shape>
+            </w:pict>
+          </mc:Fallback>
+        </mc:AlternateContent>
+      </w:r>
+      <w:r>
+        <w:t xml:space="preserve">Abbildung </w:t>
+      </w:r>
+      <w:r>
+        <w:fldChar w:fldCharType="begin"/>
+      </w:r>
+      <w:r>
+        <w:instrText xml:space="preserve"> SEQ Abbildung \* ARABIC </w:instrText>
+      </w:r>
+      <w:r>
+        <w:fldChar w:fldCharType="separate"/>
+      </w:r>
+      <w:r>
+        <w:rPr>
+          <w:noProof/>
+        </w:rPr>
+        <w:t>18</w:t>
+      </w:r>
+      <w:r>
+        <w:rPr>
+          <w:noProof/>
+        </w:rPr>
+        <w:fldChar w:fldCharType="end"/>
+      </w:r>
+      <w:r>
+        <w:t xml:space="preserve"> </w:t>
+      </w:r>
+      <w:r>
+        <w:t>Dozentenoberfläche mit Benutzeranzeige,</w:t>
+      </w:r>
+      <w:r>
+        <w:t xml:space="preserve"> </w:t>
+      </w:r>
+      <w:r>
+        <w:t>Logout-Funktio</w:t>
+      </w:r>
+      <w:r>
+        <w:t>n</w:t>
+      </w:r>
+    </w:p>
+    <w:p>
+      <w:pPr>
+        <w:rPr>
+          <w:b/>
+          <w:bCs/>
+        </w:rPr>
+      </w:pPr>
+      <w:r>
+        <w:rPr>
+          <w:b/>
+          <w:bCs/>
+        </w:rPr>
+        <w:t>GUI zum Anlegen einer Prüfung</w:t>
+      </w:r>
+    </w:p>
+    <w:p>
+      <w:r>
+        <w:t xml:space="preserve">Mit der Einführung der </w:t>
+      </w:r>
+      <w:proofErr w:type="spellStart"/>
+      <w:r>
+        <w:t>PruefungAnlegenGUI</w:t>
+      </w:r>
+      <w:proofErr w:type="spellEnd"/>
+      <w:r>
+        <w:t xml:space="preserve"> wurde die Grundlage für die digitale Prüfungsverwaltung geschaffen. Der Dozent kann alle für eine Prüfung benötigten Informationen erfassen und die erforderlichen Dateien auswählen. In den nächsten Schritten werden diese Daten dauerhaft in der SQLite-Datenbank gespeichert und für die Prüfungsdurchführung verwendet.</w:t>
+      </w:r>
+    </w:p>
+    <w:p>
+      <w:pPr>
+        <w:keepNext/>
+      </w:pPr>
+      <w:r>
+        <w:rPr>
+          <w:noProof/>
+        </w:rPr>
+        <w:drawing>
+          <wp:inline distT="0" distB="0" distL="0" distR="0" wp14:anchorId="2C86FB31" wp14:editId="1E4FD566">
+            <wp:extent cx="2100805" cy="1893549"/>
+            <wp:effectExtent l="19050" t="19050" r="13970" b="12065"/>
+            <wp:docPr id="1348833077" name="Grafik 9"/>
+            <wp:cNvGraphicFramePr>
+              <a:graphicFrameLocks xmlns:a="http://schemas.openxmlformats.org/drawingml/2006/main" noChangeAspect="1"/>
+            </wp:cNvGraphicFramePr>
+            <a:graphic xmlns:a="http://schemas.openxmlformats.org/drawingml/2006/main">
+              <a:graphicData uri="http://schemas.openxmlformats.org/drawingml/2006/picture">
+                <pic:pic xmlns:pic="http://schemas.openxmlformats.org/drawingml/2006/picture">
+                  <pic:nvPicPr>
+                    <pic:cNvPr id="1348833077" name="Grafik 1348833077"/>
+                    <pic:cNvPicPr/>
+                  </pic:nvPicPr>
+                  <pic:blipFill>
+                    <a:blip r:embed="rId30" cstate="print">
+                      <a:extLst>
+                        <a:ext uri="{28A0092B-C50C-407E-A947-70E740481C1C}">
+                          <a14:useLocalDpi xmlns:a14="http://schemas.microsoft.com/office/drawing/2010/main" val="0"/>
+                        </a:ext>
+                      </a:extLst>
+                    </a:blip>
+                    <a:stretch>
+                      <a:fillRect/>
+                    </a:stretch>
+                  </pic:blipFill>
+                  <pic:spPr>
+                    <a:xfrm>
+                      <a:off x="0" y="0"/>
+                      <a:ext cx="2100805" cy="1893549"/>
+                    </a:xfrm>
+                    <a:prstGeom prst="rect">
+                      <a:avLst/>
+                    </a:prstGeom>
+                    <a:ln>
+                      <a:solidFill>
+                        <a:srgbClr val="EE0000"/>
+                      </a:solidFill>
+                    </a:ln>
+                  </pic:spPr>
+                </pic:pic>
+              </a:graphicData>
+            </a:graphic>
+          </wp:inline>
+        </w:drawing>
+      </w:r>
+    </w:p>
+    <w:p>
+      <w:pPr>
+        <w:pStyle w:val="Beschriftung"/>
+      </w:pPr>
+      <w:r>
+        <w:t xml:space="preserve">Abbildung </w:t>
+      </w:r>
+      <w:r>
+        <w:fldChar w:fldCharType="begin"/>
+      </w:r>
+      <w:r>
+        <w:instrText xml:space="preserve"> SEQ Abbildung \* ARABIC </w:instrText>
+      </w:r>
+      <w:r>
+        <w:fldChar w:fldCharType="separate"/>
+      </w:r>
+      <w:r>
+        <w:rPr>
+          <w:noProof/>
+        </w:rPr>
+        <w:t>19</w:t>
+      </w:r>
+      <w:r>
+        <w:rPr>
+          <w:noProof/>
+        </w:rPr>
+        <w:fldChar w:fldCharType="end"/>
+      </w:r>
+      <w:r>
+        <w:t xml:space="preserve"> </w:t>
+      </w:r>
+      <w:r>
+        <w:t>GUI zum Anlegen einer Prüfung</w:t>
+      </w:r>
+    </w:p>
     <w:sectPr>
       <w:pgSz w:w="11906" w:h="16838"/>
       <w:pgMar w:top="1417" w:right="1417" w:bottom="1134" w:left="1417" w:header="708" w:footer="708" w:gutter="0"/>

</xml_diff>

<commit_message>
Prüfungsverwaltung: Prüfungen in SQLite speichern
</commit_message>
<xml_diff>
--- a/Dokumentation.docx
+++ b/Dokumentation.docx
@@ -2629,27 +2629,14 @@
       <w:r>
         <w:t xml:space="preserve">Abbildung </w:t>
       </w:r>
-      <w:r>
-        <w:fldChar w:fldCharType="begin"/>
-      </w:r>
-      <w:r>
-        <w:instrText xml:space="preserve"> SEQ Abbildung \* ARABIC </w:instrText>
-      </w:r>
-      <w:r>
-        <w:fldChar w:fldCharType="separate"/>
-      </w:r>
-      <w:r>
-        <w:rPr>
-          <w:noProof/>
-        </w:rPr>
-        <w:t>1</w:t>
-      </w:r>
-      <w:r>
-        <w:rPr>
-          <w:noProof/>
-        </w:rPr>
-        <w:fldChar w:fldCharType="end"/>
-      </w:r>
+      <w:fldSimple w:instr=" SEQ Abbildung \* ARABIC ">
+        <w:r>
+          <w:rPr>
+            <w:noProof/>
+          </w:rPr>
+          <w:t>1</w:t>
+        </w:r>
+      </w:fldSimple>
       <w:r>
         <w:t xml:space="preserve"> </w:t>
       </w:r>
@@ -2796,27 +2783,14 @@
       <w:r>
         <w:t xml:space="preserve">Abbildung </w:t>
       </w:r>
-      <w:r>
-        <w:fldChar w:fldCharType="begin"/>
-      </w:r>
-      <w:r>
-        <w:instrText xml:space="preserve"> SEQ Abbildung \* ARABIC </w:instrText>
-      </w:r>
-      <w:r>
-        <w:fldChar w:fldCharType="separate"/>
-      </w:r>
-      <w:r>
-        <w:rPr>
-          <w:noProof/>
-        </w:rPr>
-        <w:t>2</w:t>
-      </w:r>
-      <w:r>
-        <w:rPr>
-          <w:noProof/>
-        </w:rPr>
-        <w:fldChar w:fldCharType="end"/>
-      </w:r>
+      <w:fldSimple w:instr=" SEQ Abbildung \* ARABIC ">
+        <w:r>
+          <w:rPr>
+            <w:noProof/>
+          </w:rPr>
+          <w:t>2</w:t>
+        </w:r>
+      </w:fldSimple>
       <w:r>
         <w:t xml:space="preserve"> </w:t>
       </w:r>
@@ -2908,27 +2882,14 @@
                             <w:r>
                               <w:t xml:space="preserve">Abbildung </w:t>
                             </w:r>
-                            <w:r>
-                              <w:fldChar w:fldCharType="begin"/>
-                            </w:r>
-                            <w:r>
-                              <w:instrText xml:space="preserve"> SEQ Abbildung \* ARABIC </w:instrText>
-                            </w:r>
-                            <w:r>
-                              <w:fldChar w:fldCharType="separate"/>
-                            </w:r>
-                            <w:r>
-                              <w:rPr>
-                                <w:noProof/>
-                              </w:rPr>
-                              <w:t>3</w:t>
-                            </w:r>
-                            <w:r>
-                              <w:rPr>
-                                <w:noProof/>
-                              </w:rPr>
-                              <w:fldChar w:fldCharType="end"/>
-                            </w:r>
+                            <w:fldSimple w:instr=" SEQ Abbildung \* ARABIC ">
+                              <w:r>
+                                <w:rPr>
+                                  <w:noProof/>
+                                </w:rPr>
+                                <w:t>3</w:t>
+                              </w:r>
+                            </w:fldSimple>
                             <w:r>
                               <w:t xml:space="preserve"> Falsche Gesamtpunktenberechnung</w:t>
                             </w:r>
@@ -2949,7 +2910,11 @@
           </mc:Choice>
           <mc:Fallback>
             <w:pict>
-              <v:shape w14:anchorId="61EE233F" id="Textfeld 1" o:spid="_x0000_s1029" type="#_x0000_t202" style="position:absolute;left:0;text-align:left;margin-left:35.65pt;margin-top:147.65pt;width:342.75pt;height:.05pt;z-index:251665408;visibility:visible;mso-wrap-style:square;mso-wrap-distance-left:9pt;mso-wrap-distance-top:0;mso-wrap-distance-right:9pt;mso-wrap-distance-bottom:0;mso-position-horizontal:absolute;mso-position-horizontal-relative:text;mso-position-vertical:absolute;mso-position-vertical-relative:text;v-text-anchor:top" o:gfxdata="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" stroked="f">
+              <v:shapetype w14:anchorId="61EE233F" id="_x0000_t202" coordsize="21600,21600" o:spt="202" path="m,l,21600r21600,l21600,xe">
+                <v:stroke joinstyle="miter"/>
+                <v:path gradientshapeok="t" o:connecttype="rect"/>
+              </v:shapetype>
+              <v:shape id="Textfeld 1" o:spid="_x0000_s1029" type="#_x0000_t202" style="position:absolute;left:0;text-align:left;margin-left:35.65pt;margin-top:147.65pt;width:342.75pt;height:.05pt;z-index:251665408;visibility:visible;mso-wrap-style:square;mso-wrap-distance-left:9pt;mso-wrap-distance-top:0;mso-wrap-distance-right:9pt;mso-wrap-distance-bottom:0;mso-position-horizontal:absolute;mso-position-horizontal-relative:text;mso-position-vertical:absolute;mso-position-vertical-relative:text;v-text-anchor:top" o:gfxdata="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" stroked="f">
                 <v:textbox style="mso-fit-shape-to-text:t" inset="0,0,0,0">
                   <w:txbxContent>
                     <w:p>
@@ -2962,27 +2927,14 @@
                       <w:r>
                         <w:t xml:space="preserve">Abbildung </w:t>
                       </w:r>
-                      <w:r>
-                        <w:fldChar w:fldCharType="begin"/>
-                      </w:r>
-                      <w:r>
-                        <w:instrText xml:space="preserve"> SEQ Abbildung \* ARABIC </w:instrText>
-                      </w:r>
-                      <w:r>
-                        <w:fldChar w:fldCharType="separate"/>
-                      </w:r>
-                      <w:r>
-                        <w:rPr>
-                          <w:noProof/>
-                        </w:rPr>
-                        <w:t>3</w:t>
-                      </w:r>
-                      <w:r>
-                        <w:rPr>
-                          <w:noProof/>
-                        </w:rPr>
-                        <w:fldChar w:fldCharType="end"/>
-                      </w:r>
+                      <w:fldSimple w:instr=" SEQ Abbildung \* ARABIC ">
+                        <w:r>
+                          <w:rPr>
+                            <w:noProof/>
+                          </w:rPr>
+                          <w:t>3</w:t>
+                        </w:r>
+                      </w:fldSimple>
                       <w:r>
                         <w:t xml:space="preserve"> Falsche Gesamtpunktenberechnung</w:t>
                       </w:r>
@@ -3062,7 +3014,7 @@
           <w:noProof/>
         </w:rPr>
         <w:drawing>
-          <wp:anchor distT="0" distB="0" distL="114300" distR="114300" simplePos="0" relativeHeight="251666432" behindDoc="0" locked="0" layoutInCell="1" allowOverlap="1" wp14:anchorId="30414A45" wp14:editId="3632FC17">
+          <wp:anchor distT="0" distB="0" distL="114300" distR="114300" simplePos="0" relativeHeight="251666432" behindDoc="0" locked="0" layoutInCell="1" allowOverlap="1" wp14:anchorId="30414A45" wp14:editId="7DAD48C0">
             <wp:simplePos x="0" y="0"/>
             <wp:positionH relativeFrom="margin">
               <wp:align>right</wp:align>
@@ -3124,7 +3076,7 @@
           <w:noProof/>
         </w:rPr>
         <w:drawing>
-          <wp:anchor distT="0" distB="0" distL="114300" distR="114300" simplePos="0" relativeHeight="251667456" behindDoc="0" locked="0" layoutInCell="1" allowOverlap="1" wp14:anchorId="38FD9A55" wp14:editId="4B1315AA">
+          <wp:anchor distT="0" distB="0" distL="114300" distR="114300" simplePos="0" relativeHeight="251667456" behindDoc="0" locked="0" layoutInCell="1" allowOverlap="1" wp14:anchorId="38FD9A55" wp14:editId="05CF52EF">
             <wp:simplePos x="0" y="0"/>
             <wp:positionH relativeFrom="column">
               <wp:posOffset>90805</wp:posOffset>
@@ -3224,27 +3176,14 @@
                             <w:r>
                               <w:t xml:space="preserve">Abbildung </w:t>
                             </w:r>
-                            <w:r>
-                              <w:fldChar w:fldCharType="begin"/>
-                            </w:r>
-                            <w:r>
-                              <w:instrText xml:space="preserve"> SEQ Abbildung \* ARABIC </w:instrText>
-                            </w:r>
-                            <w:r>
-                              <w:fldChar w:fldCharType="separate"/>
-                            </w:r>
-                            <w:r>
-                              <w:rPr>
-                                <w:noProof/>
-                              </w:rPr>
-                              <w:t>4</w:t>
-                            </w:r>
-                            <w:r>
-                              <w:rPr>
-                                <w:noProof/>
-                              </w:rPr>
-                              <w:fldChar w:fldCharType="end"/>
-                            </w:r>
+                            <w:fldSimple w:instr=" SEQ Abbildung \* ARABIC ">
+                              <w:r>
+                                <w:rPr>
+                                  <w:noProof/>
+                                </w:rPr>
+                                <w:t>4</w:t>
+                              </w:r>
+                            </w:fldSimple>
                             <w:r>
                               <w:t xml:space="preserve"> Richtige Gesamtpunktbewertung</w:t>
                             </w:r>
@@ -3278,27 +3217,14 @@
                       <w:r>
                         <w:t xml:space="preserve">Abbildung </w:t>
                       </w:r>
-                      <w:r>
-                        <w:fldChar w:fldCharType="begin"/>
-                      </w:r>
-                      <w:r>
-                        <w:instrText xml:space="preserve"> SEQ Abbildung \* ARABIC </w:instrText>
-                      </w:r>
-                      <w:r>
-                        <w:fldChar w:fldCharType="separate"/>
-                      </w:r>
-                      <w:r>
-                        <w:rPr>
-                          <w:noProof/>
-                        </w:rPr>
-                        <w:t>4</w:t>
-                      </w:r>
-                      <w:r>
-                        <w:rPr>
-                          <w:noProof/>
-                        </w:rPr>
-                        <w:fldChar w:fldCharType="end"/>
-                      </w:r>
+                      <w:fldSimple w:instr=" SEQ Abbildung \* ARABIC ">
+                        <w:r>
+                          <w:rPr>
+                            <w:noProof/>
+                          </w:rPr>
+                          <w:t>4</w:t>
+                        </w:r>
+                      </w:fldSimple>
                       <w:r>
                         <w:t xml:space="preserve"> Richtige Gesamtpunktbewertung</w:t>
                       </w:r>
@@ -3316,7 +3242,7 @@
           <w:noProof/>
         </w:rPr>
         <w:drawing>
-          <wp:anchor distT="0" distB="0" distL="114300" distR="114300" simplePos="0" relativeHeight="251668480" behindDoc="0" locked="0" layoutInCell="1" allowOverlap="1" wp14:anchorId="6F7F581A" wp14:editId="0A4D1B0A">
+          <wp:anchor distT="0" distB="0" distL="114300" distR="114300" simplePos="0" relativeHeight="251668480" behindDoc="0" locked="0" layoutInCell="1" allowOverlap="1" wp14:anchorId="6F7F581A" wp14:editId="3F99AEAF">
             <wp:simplePos x="0" y="0"/>
             <wp:positionH relativeFrom="column">
               <wp:posOffset>147955</wp:posOffset>
@@ -3527,27 +3453,14 @@
       <w:r>
         <w:t xml:space="preserve">Abbildung </w:t>
       </w:r>
-      <w:r>
-        <w:fldChar w:fldCharType="begin"/>
-      </w:r>
-      <w:r>
-        <w:instrText xml:space="preserve"> SEQ Abbildung \* ARABIC </w:instrText>
-      </w:r>
-      <w:r>
-        <w:fldChar w:fldCharType="separate"/>
-      </w:r>
-      <w:r>
-        <w:rPr>
-          <w:noProof/>
-        </w:rPr>
-        <w:t>5</w:t>
-      </w:r>
-      <w:r>
-        <w:rPr>
-          <w:noProof/>
-        </w:rPr>
-        <w:fldChar w:fldCharType="end"/>
-      </w:r>
+      <w:fldSimple w:instr=" SEQ Abbildung \* ARABIC ">
+        <w:r>
+          <w:rPr>
+            <w:noProof/>
+          </w:rPr>
+          <w:t>5</w:t>
+        </w:r>
+      </w:fldSimple>
       <w:r>
         <w:t xml:space="preserve"> </w:t>
       </w:r>
@@ -3626,7 +3539,7 @@
         </w:rPr>
         <w:lastRenderedPageBreak/>
         <w:drawing>
-          <wp:anchor distT="0" distB="0" distL="114300" distR="114300" simplePos="0" relativeHeight="251671552" behindDoc="0" locked="0" layoutInCell="1" allowOverlap="1" wp14:anchorId="076D891D" wp14:editId="4656C840">
+          <wp:anchor distT="0" distB="0" distL="114300" distR="114300" simplePos="0" relativeHeight="251671552" behindDoc="0" locked="0" layoutInCell="1" allowOverlap="1" wp14:anchorId="076D891D" wp14:editId="13084708">
             <wp:simplePos x="0" y="0"/>
             <wp:positionH relativeFrom="column">
               <wp:posOffset>3110230</wp:posOffset>
@@ -3685,7 +3598,7 @@
           <w:noProof/>
         </w:rPr>
         <w:drawing>
-          <wp:inline distT="0" distB="0" distL="0" distR="0" wp14:anchorId="2DDC6EE9" wp14:editId="60F8DD83">
+          <wp:inline distT="0" distB="0" distL="0" distR="0" wp14:anchorId="2DDC6EE9" wp14:editId="6F07A315">
             <wp:extent cx="2469686" cy="1666875"/>
             <wp:effectExtent l="19050" t="19050" r="26035" b="9525"/>
             <wp:docPr id="1870732759" name="Grafik 9"/>
@@ -3739,27 +3652,14 @@
       <w:r>
         <w:t xml:space="preserve">Abbildung </w:t>
       </w:r>
-      <w:r>
-        <w:fldChar w:fldCharType="begin"/>
-      </w:r>
-      <w:r>
-        <w:instrText xml:space="preserve"> SEQ Abbildung \* ARABIC </w:instrText>
-      </w:r>
-      <w:r>
-        <w:fldChar w:fldCharType="separate"/>
-      </w:r>
-      <w:r>
-        <w:rPr>
-          <w:noProof/>
-        </w:rPr>
-        <w:t>6</w:t>
-      </w:r>
-      <w:r>
-        <w:rPr>
-          <w:noProof/>
-        </w:rPr>
-        <w:fldChar w:fldCharType="end"/>
-      </w:r>
+      <w:fldSimple w:instr=" SEQ Abbildung \* ARABIC ">
+        <w:r>
+          <w:rPr>
+            <w:noProof/>
+          </w:rPr>
+          <w:t>6</w:t>
+        </w:r>
+      </w:fldSimple>
       <w:r>
         <w:t xml:space="preserve"> </w:t>
       </w:r>
@@ -3772,27 +3672,14 @@
       <w:r>
         <w:t xml:space="preserve">Abbildung </w:t>
       </w:r>
-      <w:r>
-        <w:fldChar w:fldCharType="begin"/>
-      </w:r>
-      <w:r>
-        <w:instrText xml:space="preserve"> SEQ Abbildung \* ARABIC </w:instrText>
-      </w:r>
-      <w:r>
-        <w:fldChar w:fldCharType="separate"/>
-      </w:r>
-      <w:r>
-        <w:rPr>
-          <w:noProof/>
-        </w:rPr>
-        <w:t>7</w:t>
-      </w:r>
-      <w:r>
-        <w:rPr>
-          <w:noProof/>
-        </w:rPr>
-        <w:fldChar w:fldCharType="end"/>
-      </w:r>
+      <w:fldSimple w:instr=" SEQ Abbildung \* ARABIC ">
+        <w:r>
+          <w:rPr>
+            <w:noProof/>
+          </w:rPr>
+          <w:t>7</w:t>
+        </w:r>
+      </w:fldSimple>
       <w:r>
         <w:t xml:space="preserve"> </w:t>
       </w:r>
@@ -3850,7 +3737,7 @@
         </w:rPr>
         <w:lastRenderedPageBreak/>
         <w:drawing>
-          <wp:inline distT="0" distB="0" distL="0" distR="0" wp14:anchorId="7AA15A65" wp14:editId="226D94F9">
+          <wp:inline distT="0" distB="0" distL="0" distR="0" wp14:anchorId="7AA15A65" wp14:editId="2C4BB265">
             <wp:extent cx="2801815" cy="2603846"/>
             <wp:effectExtent l="0" t="0" r="0" b="6350"/>
             <wp:docPr id="422847558" name="Grafik 8"/>
@@ -3899,27 +3786,14 @@
       <w:r>
         <w:t xml:space="preserve">Abbildung </w:t>
       </w:r>
-      <w:r>
-        <w:fldChar w:fldCharType="begin"/>
-      </w:r>
-      <w:r>
-        <w:instrText xml:space="preserve"> SEQ Abbildung \* ARABIC </w:instrText>
-      </w:r>
-      <w:r>
-        <w:fldChar w:fldCharType="separate"/>
-      </w:r>
-      <w:r>
-        <w:rPr>
-          <w:noProof/>
-        </w:rPr>
-        <w:t>8</w:t>
-      </w:r>
-      <w:r>
-        <w:rPr>
-          <w:noProof/>
-        </w:rPr>
-        <w:fldChar w:fldCharType="end"/>
-      </w:r>
+      <w:fldSimple w:instr=" SEQ Abbildung \* ARABIC ">
+        <w:r>
+          <w:rPr>
+            <w:noProof/>
+          </w:rPr>
+          <w:t>8</w:t>
+        </w:r>
+      </w:fldSimple>
       <w:r>
         <w:t xml:space="preserve"> </w:t>
       </w:r>
@@ -3995,27 +3869,14 @@
       <w:r>
         <w:t xml:space="preserve">Abbildung </w:t>
       </w:r>
-      <w:r>
-        <w:fldChar w:fldCharType="begin"/>
-      </w:r>
-      <w:r>
-        <w:instrText xml:space="preserve"> SEQ Abbildung \* ARABIC </w:instrText>
-      </w:r>
-      <w:r>
-        <w:fldChar w:fldCharType="separate"/>
-      </w:r>
-      <w:r>
-        <w:rPr>
-          <w:noProof/>
-        </w:rPr>
-        <w:t>9</w:t>
-      </w:r>
-      <w:r>
-        <w:rPr>
-          <w:noProof/>
-        </w:rPr>
-        <w:fldChar w:fldCharType="end"/>
-      </w:r>
+      <w:fldSimple w:instr=" SEQ Abbildung \* ARABIC ">
+        <w:r>
+          <w:rPr>
+            <w:noProof/>
+          </w:rPr>
+          <w:t>9</w:t>
+        </w:r>
+      </w:fldSimple>
       <w:r>
         <w:t xml:space="preserve"> </w:t>
       </w:r>
@@ -4091,27 +3952,14 @@
       <w:r>
         <w:t xml:space="preserve">Abbildung </w:t>
       </w:r>
-      <w:r>
-        <w:fldChar w:fldCharType="begin"/>
-      </w:r>
-      <w:r>
-        <w:instrText xml:space="preserve"> SEQ Abbildung \* ARABIC </w:instrText>
-      </w:r>
-      <w:r>
-        <w:fldChar w:fldCharType="separate"/>
-      </w:r>
-      <w:r>
-        <w:rPr>
-          <w:noProof/>
-        </w:rPr>
-        <w:t>10</w:t>
-      </w:r>
-      <w:r>
-        <w:rPr>
-          <w:noProof/>
-        </w:rPr>
-        <w:fldChar w:fldCharType="end"/>
-      </w:r>
+      <w:fldSimple w:instr=" SEQ Abbildung \* ARABIC ">
+        <w:r>
+          <w:rPr>
+            <w:noProof/>
+          </w:rPr>
+          <w:t>10</w:t>
+        </w:r>
+      </w:fldSimple>
       <w:r>
         <w:t xml:space="preserve"> </w:t>
       </w:r>
@@ -4176,7 +4024,7 @@
           <w:noProof/>
         </w:rPr>
         <w:drawing>
-          <wp:inline distT="0" distB="0" distL="0" distR="0" wp14:anchorId="7965622C" wp14:editId="7DD65451">
+          <wp:inline distT="0" distB="0" distL="0" distR="0" wp14:anchorId="7965622C" wp14:editId="483820B6">
             <wp:extent cx="3390900" cy="2397776"/>
             <wp:effectExtent l="19050" t="19050" r="19050" b="21590"/>
             <wp:docPr id="1745081094" name="Grafik 8"/>
@@ -4230,27 +4078,14 @@
       <w:r>
         <w:t xml:space="preserve">Abbildung </w:t>
       </w:r>
-      <w:r>
-        <w:fldChar w:fldCharType="begin"/>
-      </w:r>
-      <w:r>
-        <w:instrText xml:space="preserve"> SEQ Abbildung \* ARABIC </w:instrText>
-      </w:r>
-      <w:r>
-        <w:fldChar w:fldCharType="separate"/>
-      </w:r>
-      <w:r>
-        <w:rPr>
-          <w:noProof/>
-        </w:rPr>
-        <w:t>11</w:t>
-      </w:r>
-      <w:r>
-        <w:rPr>
-          <w:noProof/>
-        </w:rPr>
-        <w:fldChar w:fldCharType="end"/>
-      </w:r>
+      <w:fldSimple w:instr=" SEQ Abbildung \* ARABIC ">
+        <w:r>
+          <w:rPr>
+            <w:noProof/>
+          </w:rPr>
+          <w:t>11</w:t>
+        </w:r>
+      </w:fldSimple>
       <w:r>
         <w:t>Überarbeitete Benutzeroberfläche des Prüfungssystems mit integriertem Unternehmensdesign.</w:t>
       </w:r>
@@ -4522,44 +4357,31 @@
       <w:r>
         <w:t xml:space="preserve">Abbildung </w:t>
       </w:r>
-      <w:r>
-        <w:fldChar w:fldCharType="begin"/>
-      </w:r>
-      <w:r>
-        <w:instrText xml:space="preserve"> SEQ Abbildung \* ARABIC </w:instrText>
-      </w:r>
-      <w:r>
-        <w:fldChar w:fldCharType="separate"/>
-      </w:r>
+      <w:fldSimple w:instr=" SEQ Abbildung \* ARABIC ">
+        <w:r>
+          <w:rPr>
+            <w:noProof/>
+          </w:rPr>
+          <w:t>12</w:t>
+        </w:r>
+      </w:fldSimple>
+      <w:r>
+        <w:t xml:space="preserve"> </w:t>
+      </w:r>
+      <w:r>
+        <w:t>Login-Oberfläche der Prüfungsplattform</w:t>
+      </w:r>
+    </w:p>
+    <w:p>
+      <w:pPr>
+        <w:keepNext/>
+      </w:pPr>
       <w:r>
         <w:rPr>
           <w:noProof/>
         </w:rPr>
-        <w:t>12</w:t>
-      </w:r>
-      <w:r>
-        <w:rPr>
-          <w:noProof/>
-        </w:rPr>
-        <w:fldChar w:fldCharType="end"/>
-      </w:r>
-      <w:r>
-        <w:t xml:space="preserve"> </w:t>
-      </w:r>
-      <w:r>
-        <w:t>Login-Oberfläche der Prüfungsplattform</w:t>
-      </w:r>
-    </w:p>
-    <w:p>
-      <w:pPr>
-        <w:keepNext/>
-      </w:pPr>
-      <w:r>
-        <w:rPr>
-          <w:noProof/>
-        </w:rPr>
         <w:drawing>
-          <wp:inline distT="0" distB="0" distL="0" distR="0" wp14:anchorId="2CD4F620" wp14:editId="45B9A406">
+          <wp:inline distT="0" distB="0" distL="0" distR="0" wp14:anchorId="2CD4F620" wp14:editId="49CC9334">
             <wp:extent cx="3543300" cy="2125901"/>
             <wp:effectExtent l="19050" t="19050" r="19050" b="27305"/>
             <wp:docPr id="2129645333" name="Grafik 9"/>
@@ -4613,27 +4435,14 @@
       <w:r>
         <w:t xml:space="preserve">Abbildung </w:t>
       </w:r>
-      <w:r>
-        <w:fldChar w:fldCharType="begin"/>
-      </w:r>
-      <w:r>
-        <w:instrText xml:space="preserve"> SEQ Abbildung \* ARABIC </w:instrText>
-      </w:r>
-      <w:r>
-        <w:fldChar w:fldCharType="separate"/>
-      </w:r>
-      <w:r>
-        <w:rPr>
-          <w:noProof/>
-        </w:rPr>
-        <w:t>13</w:t>
-      </w:r>
-      <w:r>
-        <w:rPr>
-          <w:noProof/>
-        </w:rPr>
-        <w:fldChar w:fldCharType="end"/>
-      </w:r>
+      <w:fldSimple w:instr=" SEQ Abbildung \* ARABIC ">
+        <w:r>
+          <w:rPr>
+            <w:noProof/>
+          </w:rPr>
+          <w:t>13</w:t>
+        </w:r>
+      </w:fldSimple>
       <w:r>
         <w:t xml:space="preserve"> </w:t>
       </w:r>
@@ -4737,27 +4546,14 @@
       <w:r>
         <w:t xml:space="preserve">Abbildung </w:t>
       </w:r>
-      <w:r>
-        <w:fldChar w:fldCharType="begin"/>
-      </w:r>
-      <w:r>
-        <w:instrText xml:space="preserve"> SEQ Abbildung \* ARABIC </w:instrText>
-      </w:r>
-      <w:r>
-        <w:fldChar w:fldCharType="separate"/>
-      </w:r>
-      <w:r>
-        <w:rPr>
-          <w:noProof/>
-        </w:rPr>
-        <w:t>14</w:t>
-      </w:r>
-      <w:r>
-        <w:rPr>
-          <w:noProof/>
-        </w:rPr>
-        <w:fldChar w:fldCharType="end"/>
-      </w:r>
+      <w:fldSimple w:instr=" SEQ Abbildung \* ARABIC ">
+        <w:r>
+          <w:rPr>
+            <w:noProof/>
+          </w:rPr>
+          <w:t>14</w:t>
+        </w:r>
+      </w:fldSimple>
       <w:r>
         <w:t xml:space="preserve"> Klassendiagram Datenbank</w:t>
       </w:r>
@@ -4856,27 +4652,14 @@
       <w:r>
         <w:t xml:space="preserve">Abbildung </w:t>
       </w:r>
-      <w:r>
-        <w:fldChar w:fldCharType="begin"/>
-      </w:r>
-      <w:r>
-        <w:instrText xml:space="preserve"> SEQ Abbildung \* ARABIC </w:instrText>
-      </w:r>
-      <w:r>
-        <w:fldChar w:fldCharType="separate"/>
-      </w:r>
-      <w:r>
-        <w:rPr>
-          <w:noProof/>
-        </w:rPr>
-        <w:t>15</w:t>
-      </w:r>
-      <w:r>
-        <w:rPr>
-          <w:noProof/>
-        </w:rPr>
-        <w:fldChar w:fldCharType="end"/>
-      </w:r>
+      <w:fldSimple w:instr=" SEQ Abbildung \* ARABIC ">
+        <w:r>
+          <w:rPr>
+            <w:noProof/>
+          </w:rPr>
+          <w:t>15</w:t>
+        </w:r>
+      </w:fldSimple>
       <w:r>
         <w:t xml:space="preserve"> </w:t>
       </w:r>
@@ -4942,27 +4725,14 @@
       <w:r>
         <w:t xml:space="preserve">Abbildung </w:t>
       </w:r>
-      <w:r>
-        <w:fldChar w:fldCharType="begin"/>
-      </w:r>
-      <w:r>
-        <w:instrText xml:space="preserve"> SEQ Abbildung \* ARABIC </w:instrText>
-      </w:r>
-      <w:r>
-        <w:fldChar w:fldCharType="separate"/>
-      </w:r>
-      <w:r>
-        <w:rPr>
-          <w:noProof/>
-        </w:rPr>
-        <w:t>16</w:t>
-      </w:r>
-      <w:r>
-        <w:rPr>
-          <w:noProof/>
-        </w:rPr>
-        <w:fldChar w:fldCharType="end"/>
-      </w:r>
+      <w:fldSimple w:instr=" SEQ Abbildung \* ARABIC ">
+        <w:r>
+          <w:rPr>
+            <w:noProof/>
+          </w:rPr>
+          <w:t>16</w:t>
+        </w:r>
+      </w:fldSimple>
       <w:r>
         <w:t xml:space="preserve"> </w:t>
       </w:r>
@@ -5156,7 +4926,7 @@
           <w:noProof/>
         </w:rPr>
         <w:drawing>
-          <wp:anchor distT="0" distB="0" distL="114300" distR="114300" simplePos="0" relativeHeight="251672576" behindDoc="0" locked="0" layoutInCell="1" allowOverlap="1" wp14:anchorId="302F5CF5" wp14:editId="77BA6B77">
+          <wp:anchor distT="0" distB="0" distL="114300" distR="114300" simplePos="0" relativeHeight="251672576" behindDoc="0" locked="0" layoutInCell="1" allowOverlap="1" wp14:anchorId="302F5CF5" wp14:editId="40F9CA24">
             <wp:simplePos x="0" y="0"/>
             <wp:positionH relativeFrom="margin">
               <wp:posOffset>3509501</wp:posOffset>
@@ -5275,27 +5045,14 @@
                             <w:r>
                               <w:t xml:space="preserve">Abbildung </w:t>
                             </w:r>
-                            <w:r>
-                              <w:fldChar w:fldCharType="begin"/>
-                            </w:r>
-                            <w:r>
-                              <w:instrText xml:space="preserve"> SEQ Abbildung \* ARABIC </w:instrText>
-                            </w:r>
-                            <w:r>
-                              <w:fldChar w:fldCharType="separate"/>
-                            </w:r>
-                            <w:r>
-                              <w:rPr>
-                                <w:noProof/>
-                              </w:rPr>
-                              <w:t>17</w:t>
-                            </w:r>
-                            <w:r>
-                              <w:rPr>
-                                <w:noProof/>
-                              </w:rPr>
-                              <w:fldChar w:fldCharType="end"/>
-                            </w:r>
+                            <w:fldSimple w:instr=" SEQ Abbildung \* ARABIC ">
+                              <w:r>
+                                <w:rPr>
+                                  <w:noProof/>
+                                </w:rPr>
+                                <w:t>17</w:t>
+                              </w:r>
+                            </w:fldSimple>
                             <w:r>
                               <w:t xml:space="preserve"> </w:t>
                             </w:r>
@@ -5332,27 +5089,14 @@
                       <w:r>
                         <w:t xml:space="preserve">Abbildung </w:t>
                       </w:r>
-                      <w:r>
-                        <w:fldChar w:fldCharType="begin"/>
-                      </w:r>
-                      <w:r>
-                        <w:instrText xml:space="preserve"> SEQ Abbildung \* ARABIC </w:instrText>
-                      </w:r>
-                      <w:r>
-                        <w:fldChar w:fldCharType="separate"/>
-                      </w:r>
-                      <w:r>
-                        <w:rPr>
-                          <w:noProof/>
-                        </w:rPr>
-                        <w:t>17</w:t>
-                      </w:r>
-                      <w:r>
-                        <w:rPr>
-                          <w:noProof/>
-                        </w:rPr>
-                        <w:fldChar w:fldCharType="end"/>
-                      </w:r>
+                      <w:fldSimple w:instr=" SEQ Abbildung \* ARABIC ">
+                        <w:r>
+                          <w:rPr>
+                            <w:noProof/>
+                          </w:rPr>
+                          <w:t>17</w:t>
+                        </w:r>
+                      </w:fldSimple>
                       <w:r>
                         <w:t xml:space="preserve"> </w:t>
                       </w:r>
@@ -5371,27 +5115,14 @@
       <w:r>
         <w:t xml:space="preserve">Abbildung </w:t>
       </w:r>
-      <w:r>
-        <w:fldChar w:fldCharType="begin"/>
-      </w:r>
-      <w:r>
-        <w:instrText xml:space="preserve"> SEQ Abbildung \* ARABIC </w:instrText>
-      </w:r>
-      <w:r>
-        <w:fldChar w:fldCharType="separate"/>
-      </w:r>
-      <w:r>
-        <w:rPr>
-          <w:noProof/>
-        </w:rPr>
-        <w:t>18</w:t>
-      </w:r>
-      <w:r>
-        <w:rPr>
-          <w:noProof/>
-        </w:rPr>
-        <w:fldChar w:fldCharType="end"/>
-      </w:r>
+      <w:fldSimple w:instr=" SEQ Abbildung \* ARABIC ">
+        <w:r>
+          <w:rPr>
+            <w:noProof/>
+          </w:rPr>
+          <w:t>18</w:t>
+        </w:r>
+      </w:fldSimple>
       <w:r>
         <w:t xml:space="preserve"> </w:t>
       </w:r>
@@ -5445,7 +5176,7 @@
           <w:noProof/>
         </w:rPr>
         <w:drawing>
-          <wp:inline distT="0" distB="0" distL="0" distR="0" wp14:anchorId="2C86FB31" wp14:editId="1E4FD566">
+          <wp:inline distT="0" distB="0" distL="0" distR="0" wp14:anchorId="2C86FB31" wp14:editId="6956C614">
             <wp:extent cx="2100805" cy="1893549"/>
             <wp:effectExtent l="19050" t="19050" r="13970" b="12065"/>
             <wp:docPr id="1348833077" name="Grafik 9"/>
@@ -5499,32 +5230,101 @@
       <w:r>
         <w:t xml:space="preserve">Abbildung </w:t>
       </w:r>
-      <w:r>
-        <w:fldChar w:fldCharType="begin"/>
-      </w:r>
-      <w:r>
-        <w:instrText xml:space="preserve"> SEQ Abbildung \* ARABIC </w:instrText>
-      </w:r>
-      <w:r>
-        <w:fldChar w:fldCharType="separate"/>
-      </w:r>
+      <w:fldSimple w:instr=" SEQ Abbildung \* ARABIC ">
+        <w:r>
+          <w:rPr>
+            <w:noProof/>
+          </w:rPr>
+          <w:t>19</w:t>
+        </w:r>
+      </w:fldSimple>
+      <w:r>
+        <w:t xml:space="preserve"> </w:t>
+      </w:r>
+      <w:r>
+        <w:t>GUI zum Anlegen einer Prüfung</w:t>
+      </w:r>
+    </w:p>
+    <w:p/>
+    <w:p>
+      <w:r>
+        <w:lastRenderedPageBreak/>
+        <w:t>Die vom Dozenten angelegte Prüfung wird nach Betätigung des Speichern-Buttons in der SQLite-Datenbank abgelegt. Gespeichert werden Prüfungsname, Datum, Gruppe, Bearbeitungsdauer sowie die Pfade zur Prüfungsaufgabe, Musterlösung und Teilnehmerliste</w:t>
+      </w:r>
+    </w:p>
+    <w:p>
+      <w:pPr>
+        <w:keepNext/>
+      </w:pPr>
       <w:r>
         <w:rPr>
           <w:noProof/>
         </w:rPr>
-        <w:t>19</w:t>
-      </w:r>
-      <w:r>
-        <w:rPr>
-          <w:noProof/>
-        </w:rPr>
-        <w:fldChar w:fldCharType="end"/>
-      </w:r>
-      <w:r>
-        <w:t xml:space="preserve"> </w:t>
-      </w:r>
-      <w:r>
-        <w:t>GUI zum Anlegen einer Prüfung</w:t>
+        <w:drawing>
+          <wp:inline distT="0" distB="0" distL="0" distR="0" wp14:anchorId="0DEC43F7" wp14:editId="19A4FBA6">
+            <wp:extent cx="2000732" cy="2301547"/>
+            <wp:effectExtent l="19050" t="19050" r="19050" b="22860"/>
+            <wp:docPr id="772296981" name="Grafik 9"/>
+            <wp:cNvGraphicFramePr>
+              <a:graphicFrameLocks xmlns:a="http://schemas.openxmlformats.org/drawingml/2006/main" noChangeAspect="1"/>
+            </wp:cNvGraphicFramePr>
+            <a:graphic xmlns:a="http://schemas.openxmlformats.org/drawingml/2006/main">
+              <a:graphicData uri="http://schemas.openxmlformats.org/drawingml/2006/picture">
+                <pic:pic xmlns:pic="http://schemas.openxmlformats.org/drawingml/2006/picture">
+                  <pic:nvPicPr>
+                    <pic:cNvPr id="772296981" name="Grafik 772296981"/>
+                    <pic:cNvPicPr/>
+                  </pic:nvPicPr>
+                  <pic:blipFill>
+                    <a:blip r:embed="rId31" cstate="print">
+                      <a:extLst>
+                        <a:ext uri="{28A0092B-C50C-407E-A947-70E740481C1C}">
+                          <a14:useLocalDpi xmlns:a14="http://schemas.microsoft.com/office/drawing/2010/main" val="0"/>
+                        </a:ext>
+                      </a:extLst>
+                    </a:blip>
+                    <a:stretch>
+                      <a:fillRect/>
+                    </a:stretch>
+                  </pic:blipFill>
+                  <pic:spPr>
+                    <a:xfrm>
+                      <a:off x="0" y="0"/>
+                      <a:ext cx="2017963" cy="2321369"/>
+                    </a:xfrm>
+                    <a:prstGeom prst="rect">
+                      <a:avLst/>
+                    </a:prstGeom>
+                    <a:ln>
+                      <a:solidFill>
+                        <a:srgbClr val="EE0000"/>
+                      </a:solidFill>
+                    </a:ln>
+                  </pic:spPr>
+                </pic:pic>
+              </a:graphicData>
+            </a:graphic>
+          </wp:inline>
+        </w:drawing>
+      </w:r>
+    </w:p>
+    <w:p>
+      <w:pPr>
+        <w:pStyle w:val="Beschriftung"/>
+      </w:pPr>
+      <w:r>
+        <w:t xml:space="preserve">Abbildung </w:t>
+      </w:r>
+      <w:fldSimple w:instr=" SEQ Abbildung \* ARABIC ">
+        <w:r>
+          <w:rPr>
+            <w:noProof/>
+          </w:rPr>
+          <w:t>20</w:t>
+        </w:r>
+      </w:fldSimple>
+      <w:r>
+        <w:t xml:space="preserve"> Angelegte Prüfung wird gespeichert</w:t>
       </w:r>
     </w:p>
     <w:sectPr>

</xml_diff>

<commit_message>
Phase 6: Dynamische Prüfungsverwaltung implementiert
Prüfungen aus SQLite laden und automatisch nach Datum kategorisieren
</commit_message>
<xml_diff>
--- a/Dokumentation.docx
+++ b/Dokumentation.docx
@@ -2629,14 +2629,27 @@
       <w:r>
         <w:t xml:space="preserve">Abbildung </w:t>
       </w:r>
-      <w:fldSimple w:instr=" SEQ Abbildung \* ARABIC ">
-        <w:r>
-          <w:rPr>
-            <w:noProof/>
-          </w:rPr>
-          <w:t>1</w:t>
-        </w:r>
-      </w:fldSimple>
+      <w:r>
+        <w:fldChar w:fldCharType="begin"/>
+      </w:r>
+      <w:r>
+        <w:instrText xml:space="preserve"> SEQ Abbildung \* ARABIC </w:instrText>
+      </w:r>
+      <w:r>
+        <w:fldChar w:fldCharType="separate"/>
+      </w:r>
+      <w:r>
+        <w:rPr>
+          <w:noProof/>
+        </w:rPr>
+        <w:t>1</w:t>
+      </w:r>
+      <w:r>
+        <w:rPr>
+          <w:noProof/>
+        </w:rPr>
+        <w:fldChar w:fldCharType="end"/>
+      </w:r>
       <w:r>
         <w:t xml:space="preserve"> </w:t>
       </w:r>
@@ -2783,14 +2796,27 @@
       <w:r>
         <w:t xml:space="preserve">Abbildung </w:t>
       </w:r>
-      <w:fldSimple w:instr=" SEQ Abbildung \* ARABIC ">
-        <w:r>
-          <w:rPr>
-            <w:noProof/>
-          </w:rPr>
-          <w:t>2</w:t>
-        </w:r>
-      </w:fldSimple>
+      <w:r>
+        <w:fldChar w:fldCharType="begin"/>
+      </w:r>
+      <w:r>
+        <w:instrText xml:space="preserve"> SEQ Abbildung \* ARABIC </w:instrText>
+      </w:r>
+      <w:r>
+        <w:fldChar w:fldCharType="separate"/>
+      </w:r>
+      <w:r>
+        <w:rPr>
+          <w:noProof/>
+        </w:rPr>
+        <w:t>2</w:t>
+      </w:r>
+      <w:r>
+        <w:rPr>
+          <w:noProof/>
+        </w:rPr>
+        <w:fldChar w:fldCharType="end"/>
+      </w:r>
       <w:r>
         <w:t xml:space="preserve"> </w:t>
       </w:r>
@@ -2882,14 +2908,27 @@
                             <w:r>
                               <w:t xml:space="preserve">Abbildung </w:t>
                             </w:r>
-                            <w:fldSimple w:instr=" SEQ Abbildung \* ARABIC ">
-                              <w:r>
-                                <w:rPr>
-                                  <w:noProof/>
-                                </w:rPr>
-                                <w:t>3</w:t>
-                              </w:r>
-                            </w:fldSimple>
+                            <w:r>
+                              <w:fldChar w:fldCharType="begin"/>
+                            </w:r>
+                            <w:r>
+                              <w:instrText xml:space="preserve"> SEQ Abbildung \* ARABIC </w:instrText>
+                            </w:r>
+                            <w:r>
+                              <w:fldChar w:fldCharType="separate"/>
+                            </w:r>
+                            <w:r>
+                              <w:rPr>
+                                <w:noProof/>
+                              </w:rPr>
+                              <w:t>3</w:t>
+                            </w:r>
+                            <w:r>
+                              <w:rPr>
+                                <w:noProof/>
+                              </w:rPr>
+                              <w:fldChar w:fldCharType="end"/>
+                            </w:r>
                             <w:r>
                               <w:t xml:space="preserve"> Falsche Gesamtpunktenberechnung</w:t>
                             </w:r>
@@ -2910,11 +2949,7 @@
           </mc:Choice>
           <mc:Fallback>
             <w:pict>
-              <v:shapetype w14:anchorId="61EE233F" id="_x0000_t202" coordsize="21600,21600" o:spt="202" path="m,l,21600r21600,l21600,xe">
-                <v:stroke joinstyle="miter"/>
-                <v:path gradientshapeok="t" o:connecttype="rect"/>
-              </v:shapetype>
-              <v:shape id="Textfeld 1" o:spid="_x0000_s1029" type="#_x0000_t202" style="position:absolute;left:0;text-align:left;margin-left:35.65pt;margin-top:147.65pt;width:342.75pt;height:.05pt;z-index:251665408;visibility:visible;mso-wrap-style:square;mso-wrap-distance-left:9pt;mso-wrap-distance-top:0;mso-wrap-distance-right:9pt;mso-wrap-distance-bottom:0;mso-position-horizontal:absolute;mso-position-horizontal-relative:text;mso-position-vertical:absolute;mso-position-vertical-relative:text;v-text-anchor:top" o:gfxdata="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" stroked="f">
+              <v:shape w14:anchorId="61EE233F" id="Textfeld 1" o:spid="_x0000_s1029" type="#_x0000_t202" style="position:absolute;left:0;text-align:left;margin-left:35.65pt;margin-top:147.65pt;width:342.75pt;height:.05pt;z-index:251665408;visibility:visible;mso-wrap-style:square;mso-wrap-distance-left:9pt;mso-wrap-distance-top:0;mso-wrap-distance-right:9pt;mso-wrap-distance-bottom:0;mso-position-horizontal:absolute;mso-position-horizontal-relative:text;mso-position-vertical:absolute;mso-position-vertical-relative:text;v-text-anchor:top" o:gfxdata="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" stroked="f">
                 <v:textbox style="mso-fit-shape-to-text:t" inset="0,0,0,0">
                   <w:txbxContent>
                     <w:p>
@@ -2927,14 +2962,27 @@
                       <w:r>
                         <w:t xml:space="preserve">Abbildung </w:t>
                       </w:r>
-                      <w:fldSimple w:instr=" SEQ Abbildung \* ARABIC ">
-                        <w:r>
-                          <w:rPr>
-                            <w:noProof/>
-                          </w:rPr>
-                          <w:t>3</w:t>
-                        </w:r>
-                      </w:fldSimple>
+                      <w:r>
+                        <w:fldChar w:fldCharType="begin"/>
+                      </w:r>
+                      <w:r>
+                        <w:instrText xml:space="preserve"> SEQ Abbildung \* ARABIC </w:instrText>
+                      </w:r>
+                      <w:r>
+                        <w:fldChar w:fldCharType="separate"/>
+                      </w:r>
+                      <w:r>
+                        <w:rPr>
+                          <w:noProof/>
+                        </w:rPr>
+                        <w:t>3</w:t>
+                      </w:r>
+                      <w:r>
+                        <w:rPr>
+                          <w:noProof/>
+                        </w:rPr>
+                        <w:fldChar w:fldCharType="end"/>
+                      </w:r>
                       <w:r>
                         <w:t xml:space="preserve"> Falsche Gesamtpunktenberechnung</w:t>
                       </w:r>
@@ -3014,7 +3062,7 @@
           <w:noProof/>
         </w:rPr>
         <w:drawing>
-          <wp:anchor distT="0" distB="0" distL="114300" distR="114300" simplePos="0" relativeHeight="251666432" behindDoc="0" locked="0" layoutInCell="1" allowOverlap="1" wp14:anchorId="30414A45" wp14:editId="7DAD48C0">
+          <wp:anchor distT="0" distB="0" distL="114300" distR="114300" simplePos="0" relativeHeight="251666432" behindDoc="0" locked="0" layoutInCell="1" allowOverlap="1" wp14:anchorId="30414A45" wp14:editId="28BD57C7">
             <wp:simplePos x="0" y="0"/>
             <wp:positionH relativeFrom="margin">
               <wp:align>right</wp:align>
@@ -3076,7 +3124,7 @@
           <w:noProof/>
         </w:rPr>
         <w:drawing>
-          <wp:anchor distT="0" distB="0" distL="114300" distR="114300" simplePos="0" relativeHeight="251667456" behindDoc="0" locked="0" layoutInCell="1" allowOverlap="1" wp14:anchorId="38FD9A55" wp14:editId="05CF52EF">
+          <wp:anchor distT="0" distB="0" distL="114300" distR="114300" simplePos="0" relativeHeight="251667456" behindDoc="0" locked="0" layoutInCell="1" allowOverlap="1" wp14:anchorId="38FD9A55" wp14:editId="4DB4B62A">
             <wp:simplePos x="0" y="0"/>
             <wp:positionH relativeFrom="column">
               <wp:posOffset>90805</wp:posOffset>
@@ -3176,14 +3224,27 @@
                             <w:r>
                               <w:t xml:space="preserve">Abbildung </w:t>
                             </w:r>
-                            <w:fldSimple w:instr=" SEQ Abbildung \* ARABIC ">
-                              <w:r>
-                                <w:rPr>
-                                  <w:noProof/>
-                                </w:rPr>
-                                <w:t>4</w:t>
-                              </w:r>
-                            </w:fldSimple>
+                            <w:r>
+                              <w:fldChar w:fldCharType="begin"/>
+                            </w:r>
+                            <w:r>
+                              <w:instrText xml:space="preserve"> SEQ Abbildung \* ARABIC </w:instrText>
+                            </w:r>
+                            <w:r>
+                              <w:fldChar w:fldCharType="separate"/>
+                            </w:r>
+                            <w:r>
+                              <w:rPr>
+                                <w:noProof/>
+                              </w:rPr>
+                              <w:t>4</w:t>
+                            </w:r>
+                            <w:r>
+                              <w:rPr>
+                                <w:noProof/>
+                              </w:rPr>
+                              <w:fldChar w:fldCharType="end"/>
+                            </w:r>
                             <w:r>
                               <w:t xml:space="preserve"> Richtige Gesamtpunktbewertung</w:t>
                             </w:r>
@@ -3217,14 +3278,27 @@
                       <w:r>
                         <w:t xml:space="preserve">Abbildung </w:t>
                       </w:r>
-                      <w:fldSimple w:instr=" SEQ Abbildung \* ARABIC ">
-                        <w:r>
-                          <w:rPr>
-                            <w:noProof/>
-                          </w:rPr>
-                          <w:t>4</w:t>
-                        </w:r>
-                      </w:fldSimple>
+                      <w:r>
+                        <w:fldChar w:fldCharType="begin"/>
+                      </w:r>
+                      <w:r>
+                        <w:instrText xml:space="preserve"> SEQ Abbildung \* ARABIC </w:instrText>
+                      </w:r>
+                      <w:r>
+                        <w:fldChar w:fldCharType="separate"/>
+                      </w:r>
+                      <w:r>
+                        <w:rPr>
+                          <w:noProof/>
+                        </w:rPr>
+                        <w:t>4</w:t>
+                      </w:r>
+                      <w:r>
+                        <w:rPr>
+                          <w:noProof/>
+                        </w:rPr>
+                        <w:fldChar w:fldCharType="end"/>
+                      </w:r>
                       <w:r>
                         <w:t xml:space="preserve"> Richtige Gesamtpunktbewertung</w:t>
                       </w:r>
@@ -3242,7 +3316,7 @@
           <w:noProof/>
         </w:rPr>
         <w:drawing>
-          <wp:anchor distT="0" distB="0" distL="114300" distR="114300" simplePos="0" relativeHeight="251668480" behindDoc="0" locked="0" layoutInCell="1" allowOverlap="1" wp14:anchorId="6F7F581A" wp14:editId="3F99AEAF">
+          <wp:anchor distT="0" distB="0" distL="114300" distR="114300" simplePos="0" relativeHeight="251668480" behindDoc="0" locked="0" layoutInCell="1" allowOverlap="1" wp14:anchorId="6F7F581A" wp14:editId="53DFD9D6">
             <wp:simplePos x="0" y="0"/>
             <wp:positionH relativeFrom="column">
               <wp:posOffset>147955</wp:posOffset>
@@ -3453,14 +3527,27 @@
       <w:r>
         <w:t xml:space="preserve">Abbildung </w:t>
       </w:r>
-      <w:fldSimple w:instr=" SEQ Abbildung \* ARABIC ">
-        <w:r>
-          <w:rPr>
-            <w:noProof/>
-          </w:rPr>
-          <w:t>5</w:t>
-        </w:r>
-      </w:fldSimple>
+      <w:r>
+        <w:fldChar w:fldCharType="begin"/>
+      </w:r>
+      <w:r>
+        <w:instrText xml:space="preserve"> SEQ Abbildung \* ARABIC </w:instrText>
+      </w:r>
+      <w:r>
+        <w:fldChar w:fldCharType="separate"/>
+      </w:r>
+      <w:r>
+        <w:rPr>
+          <w:noProof/>
+        </w:rPr>
+        <w:t>5</w:t>
+      </w:r>
+      <w:r>
+        <w:rPr>
+          <w:noProof/>
+        </w:rPr>
+        <w:fldChar w:fldCharType="end"/>
+      </w:r>
       <w:r>
         <w:t xml:space="preserve"> </w:t>
       </w:r>
@@ -3539,7 +3626,7 @@
         </w:rPr>
         <w:lastRenderedPageBreak/>
         <w:drawing>
-          <wp:anchor distT="0" distB="0" distL="114300" distR="114300" simplePos="0" relativeHeight="251671552" behindDoc="0" locked="0" layoutInCell="1" allowOverlap="1" wp14:anchorId="076D891D" wp14:editId="13084708">
+          <wp:anchor distT="0" distB="0" distL="114300" distR="114300" simplePos="0" relativeHeight="251671552" behindDoc="0" locked="0" layoutInCell="1" allowOverlap="1" wp14:anchorId="076D891D" wp14:editId="1622E60A">
             <wp:simplePos x="0" y="0"/>
             <wp:positionH relativeFrom="column">
               <wp:posOffset>3110230</wp:posOffset>
@@ -3598,7 +3685,7 @@
           <w:noProof/>
         </w:rPr>
         <w:drawing>
-          <wp:inline distT="0" distB="0" distL="0" distR="0" wp14:anchorId="2DDC6EE9" wp14:editId="6F07A315">
+          <wp:inline distT="0" distB="0" distL="0" distR="0" wp14:anchorId="2DDC6EE9" wp14:editId="0F7EFFAA">
             <wp:extent cx="2469686" cy="1666875"/>
             <wp:effectExtent l="19050" t="19050" r="26035" b="9525"/>
             <wp:docPr id="1870732759" name="Grafik 9"/>
@@ -3652,14 +3739,27 @@
       <w:r>
         <w:t xml:space="preserve">Abbildung </w:t>
       </w:r>
-      <w:fldSimple w:instr=" SEQ Abbildung \* ARABIC ">
-        <w:r>
-          <w:rPr>
-            <w:noProof/>
-          </w:rPr>
-          <w:t>6</w:t>
-        </w:r>
-      </w:fldSimple>
+      <w:r>
+        <w:fldChar w:fldCharType="begin"/>
+      </w:r>
+      <w:r>
+        <w:instrText xml:space="preserve"> SEQ Abbildung \* ARABIC </w:instrText>
+      </w:r>
+      <w:r>
+        <w:fldChar w:fldCharType="separate"/>
+      </w:r>
+      <w:r>
+        <w:rPr>
+          <w:noProof/>
+        </w:rPr>
+        <w:t>6</w:t>
+      </w:r>
+      <w:r>
+        <w:rPr>
+          <w:noProof/>
+        </w:rPr>
+        <w:fldChar w:fldCharType="end"/>
+      </w:r>
       <w:r>
         <w:t xml:space="preserve"> </w:t>
       </w:r>
@@ -3672,14 +3772,27 @@
       <w:r>
         <w:t xml:space="preserve">Abbildung </w:t>
       </w:r>
-      <w:fldSimple w:instr=" SEQ Abbildung \* ARABIC ">
-        <w:r>
-          <w:rPr>
-            <w:noProof/>
-          </w:rPr>
-          <w:t>7</w:t>
-        </w:r>
-      </w:fldSimple>
+      <w:r>
+        <w:fldChar w:fldCharType="begin"/>
+      </w:r>
+      <w:r>
+        <w:instrText xml:space="preserve"> SEQ Abbildung \* ARABIC </w:instrText>
+      </w:r>
+      <w:r>
+        <w:fldChar w:fldCharType="separate"/>
+      </w:r>
+      <w:r>
+        <w:rPr>
+          <w:noProof/>
+        </w:rPr>
+        <w:t>7</w:t>
+      </w:r>
+      <w:r>
+        <w:rPr>
+          <w:noProof/>
+        </w:rPr>
+        <w:fldChar w:fldCharType="end"/>
+      </w:r>
       <w:r>
         <w:t xml:space="preserve"> </w:t>
       </w:r>
@@ -3737,7 +3850,7 @@
         </w:rPr>
         <w:lastRenderedPageBreak/>
         <w:drawing>
-          <wp:inline distT="0" distB="0" distL="0" distR="0" wp14:anchorId="7AA15A65" wp14:editId="2C4BB265">
+          <wp:inline distT="0" distB="0" distL="0" distR="0" wp14:anchorId="7AA15A65" wp14:editId="40FEF161">
             <wp:extent cx="2801815" cy="2603846"/>
             <wp:effectExtent l="0" t="0" r="0" b="6350"/>
             <wp:docPr id="422847558" name="Grafik 8"/>
@@ -3786,14 +3899,27 @@
       <w:r>
         <w:t xml:space="preserve">Abbildung </w:t>
       </w:r>
-      <w:fldSimple w:instr=" SEQ Abbildung \* ARABIC ">
-        <w:r>
-          <w:rPr>
-            <w:noProof/>
-          </w:rPr>
-          <w:t>8</w:t>
-        </w:r>
-      </w:fldSimple>
+      <w:r>
+        <w:fldChar w:fldCharType="begin"/>
+      </w:r>
+      <w:r>
+        <w:instrText xml:space="preserve"> SEQ Abbildung \* ARABIC </w:instrText>
+      </w:r>
+      <w:r>
+        <w:fldChar w:fldCharType="separate"/>
+      </w:r>
+      <w:r>
+        <w:rPr>
+          <w:noProof/>
+        </w:rPr>
+        <w:t>8</w:t>
+      </w:r>
+      <w:r>
+        <w:rPr>
+          <w:noProof/>
+        </w:rPr>
+        <w:fldChar w:fldCharType="end"/>
+      </w:r>
       <w:r>
         <w:t xml:space="preserve"> </w:t>
       </w:r>
@@ -3869,14 +3995,27 @@
       <w:r>
         <w:t xml:space="preserve">Abbildung </w:t>
       </w:r>
-      <w:fldSimple w:instr=" SEQ Abbildung \* ARABIC ">
-        <w:r>
-          <w:rPr>
-            <w:noProof/>
-          </w:rPr>
-          <w:t>9</w:t>
-        </w:r>
-      </w:fldSimple>
+      <w:r>
+        <w:fldChar w:fldCharType="begin"/>
+      </w:r>
+      <w:r>
+        <w:instrText xml:space="preserve"> SEQ Abbildung \* ARABIC </w:instrText>
+      </w:r>
+      <w:r>
+        <w:fldChar w:fldCharType="separate"/>
+      </w:r>
+      <w:r>
+        <w:rPr>
+          <w:noProof/>
+        </w:rPr>
+        <w:t>9</w:t>
+      </w:r>
+      <w:r>
+        <w:rPr>
+          <w:noProof/>
+        </w:rPr>
+        <w:fldChar w:fldCharType="end"/>
+      </w:r>
       <w:r>
         <w:t xml:space="preserve"> </w:t>
       </w:r>
@@ -3952,14 +4091,27 @@
       <w:r>
         <w:t xml:space="preserve">Abbildung </w:t>
       </w:r>
-      <w:fldSimple w:instr=" SEQ Abbildung \* ARABIC ">
-        <w:r>
-          <w:rPr>
-            <w:noProof/>
-          </w:rPr>
-          <w:t>10</w:t>
-        </w:r>
-      </w:fldSimple>
+      <w:r>
+        <w:fldChar w:fldCharType="begin"/>
+      </w:r>
+      <w:r>
+        <w:instrText xml:space="preserve"> SEQ Abbildung \* ARABIC </w:instrText>
+      </w:r>
+      <w:r>
+        <w:fldChar w:fldCharType="separate"/>
+      </w:r>
+      <w:r>
+        <w:rPr>
+          <w:noProof/>
+        </w:rPr>
+        <w:t>10</w:t>
+      </w:r>
+      <w:r>
+        <w:rPr>
+          <w:noProof/>
+        </w:rPr>
+        <w:fldChar w:fldCharType="end"/>
+      </w:r>
       <w:r>
         <w:t xml:space="preserve"> </w:t>
       </w:r>
@@ -4024,7 +4176,7 @@
           <w:noProof/>
         </w:rPr>
         <w:drawing>
-          <wp:inline distT="0" distB="0" distL="0" distR="0" wp14:anchorId="7965622C" wp14:editId="483820B6">
+          <wp:inline distT="0" distB="0" distL="0" distR="0" wp14:anchorId="7965622C" wp14:editId="483C00FE">
             <wp:extent cx="3390900" cy="2397776"/>
             <wp:effectExtent l="19050" t="19050" r="19050" b="21590"/>
             <wp:docPr id="1745081094" name="Grafik 8"/>
@@ -4078,14 +4230,27 @@
       <w:r>
         <w:t xml:space="preserve">Abbildung </w:t>
       </w:r>
-      <w:fldSimple w:instr=" SEQ Abbildung \* ARABIC ">
-        <w:r>
-          <w:rPr>
-            <w:noProof/>
-          </w:rPr>
-          <w:t>11</w:t>
-        </w:r>
-      </w:fldSimple>
+      <w:r>
+        <w:fldChar w:fldCharType="begin"/>
+      </w:r>
+      <w:r>
+        <w:instrText xml:space="preserve"> SEQ Abbildung \* ARABIC </w:instrText>
+      </w:r>
+      <w:r>
+        <w:fldChar w:fldCharType="separate"/>
+      </w:r>
+      <w:r>
+        <w:rPr>
+          <w:noProof/>
+        </w:rPr>
+        <w:t>11</w:t>
+      </w:r>
+      <w:r>
+        <w:rPr>
+          <w:noProof/>
+        </w:rPr>
+        <w:fldChar w:fldCharType="end"/>
+      </w:r>
       <w:r>
         <w:t>Überarbeitete Benutzeroberfläche des Prüfungssystems mit integriertem Unternehmensdesign.</w:t>
       </w:r>
@@ -4357,14 +4522,27 @@
       <w:r>
         <w:t xml:space="preserve">Abbildung </w:t>
       </w:r>
-      <w:fldSimple w:instr=" SEQ Abbildung \* ARABIC ">
-        <w:r>
-          <w:rPr>
-            <w:noProof/>
-          </w:rPr>
-          <w:t>12</w:t>
-        </w:r>
-      </w:fldSimple>
+      <w:r>
+        <w:fldChar w:fldCharType="begin"/>
+      </w:r>
+      <w:r>
+        <w:instrText xml:space="preserve"> SEQ Abbildung \* ARABIC </w:instrText>
+      </w:r>
+      <w:r>
+        <w:fldChar w:fldCharType="separate"/>
+      </w:r>
+      <w:r>
+        <w:rPr>
+          <w:noProof/>
+        </w:rPr>
+        <w:t>12</w:t>
+      </w:r>
+      <w:r>
+        <w:rPr>
+          <w:noProof/>
+        </w:rPr>
+        <w:fldChar w:fldCharType="end"/>
+      </w:r>
       <w:r>
         <w:t xml:space="preserve"> </w:t>
       </w:r>
@@ -4381,7 +4559,7 @@
           <w:noProof/>
         </w:rPr>
         <w:drawing>
-          <wp:inline distT="0" distB="0" distL="0" distR="0" wp14:anchorId="2CD4F620" wp14:editId="49CC9334">
+          <wp:inline distT="0" distB="0" distL="0" distR="0" wp14:anchorId="2CD4F620" wp14:editId="4CF403A0">
             <wp:extent cx="3543300" cy="2125901"/>
             <wp:effectExtent l="19050" t="19050" r="19050" b="27305"/>
             <wp:docPr id="2129645333" name="Grafik 9"/>
@@ -4435,14 +4613,27 @@
       <w:r>
         <w:t xml:space="preserve">Abbildung </w:t>
       </w:r>
-      <w:fldSimple w:instr=" SEQ Abbildung \* ARABIC ">
-        <w:r>
-          <w:rPr>
-            <w:noProof/>
-          </w:rPr>
-          <w:t>13</w:t>
-        </w:r>
-      </w:fldSimple>
+      <w:r>
+        <w:fldChar w:fldCharType="begin"/>
+      </w:r>
+      <w:r>
+        <w:instrText xml:space="preserve"> SEQ Abbildung \* ARABIC </w:instrText>
+      </w:r>
+      <w:r>
+        <w:fldChar w:fldCharType="separate"/>
+      </w:r>
+      <w:r>
+        <w:rPr>
+          <w:noProof/>
+        </w:rPr>
+        <w:t>13</w:t>
+      </w:r>
+      <w:r>
+        <w:rPr>
+          <w:noProof/>
+        </w:rPr>
+        <w:fldChar w:fldCharType="end"/>
+      </w:r>
       <w:r>
         <w:t xml:space="preserve"> </w:t>
       </w:r>
@@ -4546,14 +4737,27 @@
       <w:r>
         <w:t xml:space="preserve">Abbildung </w:t>
       </w:r>
-      <w:fldSimple w:instr=" SEQ Abbildung \* ARABIC ">
-        <w:r>
-          <w:rPr>
-            <w:noProof/>
-          </w:rPr>
-          <w:t>14</w:t>
-        </w:r>
-      </w:fldSimple>
+      <w:r>
+        <w:fldChar w:fldCharType="begin"/>
+      </w:r>
+      <w:r>
+        <w:instrText xml:space="preserve"> SEQ Abbildung \* ARABIC </w:instrText>
+      </w:r>
+      <w:r>
+        <w:fldChar w:fldCharType="separate"/>
+      </w:r>
+      <w:r>
+        <w:rPr>
+          <w:noProof/>
+        </w:rPr>
+        <w:t>14</w:t>
+      </w:r>
+      <w:r>
+        <w:rPr>
+          <w:noProof/>
+        </w:rPr>
+        <w:fldChar w:fldCharType="end"/>
+      </w:r>
       <w:r>
         <w:t xml:space="preserve"> Klassendiagram Datenbank</w:t>
       </w:r>
@@ -4652,14 +4856,27 @@
       <w:r>
         <w:t xml:space="preserve">Abbildung </w:t>
       </w:r>
-      <w:fldSimple w:instr=" SEQ Abbildung \* ARABIC ">
-        <w:r>
-          <w:rPr>
-            <w:noProof/>
-          </w:rPr>
-          <w:t>15</w:t>
-        </w:r>
-      </w:fldSimple>
+      <w:r>
+        <w:fldChar w:fldCharType="begin"/>
+      </w:r>
+      <w:r>
+        <w:instrText xml:space="preserve"> SEQ Abbildung \* ARABIC </w:instrText>
+      </w:r>
+      <w:r>
+        <w:fldChar w:fldCharType="separate"/>
+      </w:r>
+      <w:r>
+        <w:rPr>
+          <w:noProof/>
+        </w:rPr>
+        <w:t>15</w:t>
+      </w:r>
+      <w:r>
+        <w:rPr>
+          <w:noProof/>
+        </w:rPr>
+        <w:fldChar w:fldCharType="end"/>
+      </w:r>
       <w:r>
         <w:t xml:space="preserve"> </w:t>
       </w:r>
@@ -4725,14 +4942,27 @@
       <w:r>
         <w:t xml:space="preserve">Abbildung </w:t>
       </w:r>
-      <w:fldSimple w:instr=" SEQ Abbildung \* ARABIC ">
-        <w:r>
-          <w:rPr>
-            <w:noProof/>
-          </w:rPr>
-          <w:t>16</w:t>
-        </w:r>
-      </w:fldSimple>
+      <w:r>
+        <w:fldChar w:fldCharType="begin"/>
+      </w:r>
+      <w:r>
+        <w:instrText xml:space="preserve"> SEQ Abbildung \* ARABIC </w:instrText>
+      </w:r>
+      <w:r>
+        <w:fldChar w:fldCharType="separate"/>
+      </w:r>
+      <w:r>
+        <w:rPr>
+          <w:noProof/>
+        </w:rPr>
+        <w:t>16</w:t>
+      </w:r>
+      <w:r>
+        <w:rPr>
+          <w:noProof/>
+        </w:rPr>
+        <w:fldChar w:fldCharType="end"/>
+      </w:r>
       <w:r>
         <w:t xml:space="preserve"> </w:t>
       </w:r>
@@ -4926,7 +5156,7 @@
           <w:noProof/>
         </w:rPr>
         <w:drawing>
-          <wp:anchor distT="0" distB="0" distL="114300" distR="114300" simplePos="0" relativeHeight="251672576" behindDoc="0" locked="0" layoutInCell="1" allowOverlap="1" wp14:anchorId="302F5CF5" wp14:editId="40F9CA24">
+          <wp:anchor distT="0" distB="0" distL="114300" distR="114300" simplePos="0" relativeHeight="251672576" behindDoc="0" locked="0" layoutInCell="1" allowOverlap="1" wp14:anchorId="302F5CF5" wp14:editId="10FCCA92">
             <wp:simplePos x="0" y="0"/>
             <wp:positionH relativeFrom="margin">
               <wp:posOffset>3509501</wp:posOffset>
@@ -5045,14 +5275,27 @@
                             <w:r>
                               <w:t xml:space="preserve">Abbildung </w:t>
                             </w:r>
-                            <w:fldSimple w:instr=" SEQ Abbildung \* ARABIC ">
-                              <w:r>
-                                <w:rPr>
-                                  <w:noProof/>
-                                </w:rPr>
-                                <w:t>17</w:t>
-                              </w:r>
-                            </w:fldSimple>
+                            <w:r>
+                              <w:fldChar w:fldCharType="begin"/>
+                            </w:r>
+                            <w:r>
+                              <w:instrText xml:space="preserve"> SEQ Abbildung \* ARABIC </w:instrText>
+                            </w:r>
+                            <w:r>
+                              <w:fldChar w:fldCharType="separate"/>
+                            </w:r>
+                            <w:r>
+                              <w:rPr>
+                                <w:noProof/>
+                              </w:rPr>
+                              <w:t>17</w:t>
+                            </w:r>
+                            <w:r>
+                              <w:rPr>
+                                <w:noProof/>
+                              </w:rPr>
+                              <w:fldChar w:fldCharType="end"/>
+                            </w:r>
                             <w:r>
                               <w:t xml:space="preserve"> </w:t>
                             </w:r>
@@ -5089,14 +5332,27 @@
                       <w:r>
                         <w:t xml:space="preserve">Abbildung </w:t>
                       </w:r>
-                      <w:fldSimple w:instr=" SEQ Abbildung \* ARABIC ">
-                        <w:r>
-                          <w:rPr>
-                            <w:noProof/>
-                          </w:rPr>
-                          <w:t>17</w:t>
-                        </w:r>
-                      </w:fldSimple>
+                      <w:r>
+                        <w:fldChar w:fldCharType="begin"/>
+                      </w:r>
+                      <w:r>
+                        <w:instrText xml:space="preserve"> SEQ Abbildung \* ARABIC </w:instrText>
+                      </w:r>
+                      <w:r>
+                        <w:fldChar w:fldCharType="separate"/>
+                      </w:r>
+                      <w:r>
+                        <w:rPr>
+                          <w:noProof/>
+                        </w:rPr>
+                        <w:t>17</w:t>
+                      </w:r>
+                      <w:r>
+                        <w:rPr>
+                          <w:noProof/>
+                        </w:rPr>
+                        <w:fldChar w:fldCharType="end"/>
+                      </w:r>
                       <w:r>
                         <w:t xml:space="preserve"> </w:t>
                       </w:r>
@@ -5115,14 +5371,27 @@
       <w:r>
         <w:t xml:space="preserve">Abbildung </w:t>
       </w:r>
-      <w:fldSimple w:instr=" SEQ Abbildung \* ARABIC ">
-        <w:r>
-          <w:rPr>
-            <w:noProof/>
-          </w:rPr>
-          <w:t>18</w:t>
-        </w:r>
-      </w:fldSimple>
+      <w:r>
+        <w:fldChar w:fldCharType="begin"/>
+      </w:r>
+      <w:r>
+        <w:instrText xml:space="preserve"> SEQ Abbildung \* ARABIC </w:instrText>
+      </w:r>
+      <w:r>
+        <w:fldChar w:fldCharType="separate"/>
+      </w:r>
+      <w:r>
+        <w:rPr>
+          <w:noProof/>
+        </w:rPr>
+        <w:t>18</w:t>
+      </w:r>
+      <w:r>
+        <w:rPr>
+          <w:noProof/>
+        </w:rPr>
+        <w:fldChar w:fldCharType="end"/>
+      </w:r>
       <w:r>
         <w:t xml:space="preserve"> </w:t>
       </w:r>
@@ -5155,6 +5424,9 @@
       </w:r>
     </w:p>
     <w:p>
+      <w:pPr>
+        <w:keepNext/>
+      </w:pPr>
       <w:r>
         <w:t xml:space="preserve">Mit der Einführung der </w:t>
       </w:r>
@@ -5164,7 +5436,7 @@
       </w:r>
       <w:proofErr w:type="spellEnd"/>
       <w:r>
-        <w:t xml:space="preserve"> wurde die Grundlage für die digitale Prüfungsverwaltung geschaffen. Der Dozent kann alle für eine Prüfung benötigten Informationen erfassen und die erforderlichen Dateien auswählen. In den nächsten Schritten werden diese Daten dauerhaft in der SQLite-Datenbank gespeichert und für die Prüfungsdurchführung verwendet.</w:t>
+        <w:t xml:space="preserve"> wurde die Prüfungsverwaltung des Systems erweitert. Dozenten können neue Prüfungen anlegen und alle relevanten Informationen erfassen. Dazu gehören der Prüfungsname, das Prüfungsdatum, die zugehörige Gruppe sowie die Bearbeitungsdauer. Zusätzlich können die Prüfungsaufgabe, die Musterlösung und eine Teilnehmerliste über einen Dateiauswahldialog ausgewählt werden.</w:t>
       </w:r>
     </w:p>
     <w:p>
@@ -5172,11 +5444,23 @@
         <w:keepNext/>
       </w:pPr>
       <w:r>
+        <w:t xml:space="preserve">Nach dem Betätigen des Speichern-Buttons werden die eingegebenen Daten validiert und in der SQLite-Datenbank gespeichert. Nach erfolgreicher Speicherung wird der Benutzer durch eine Meldung informiert und das Formular automatisch für die Anlage weiterer Prüfungen zurückgesetzt. Über den Abbrechen-Button kann der Vorgang </w:t>
+      </w:r>
+      <w:r>
+        <w:lastRenderedPageBreak/>
+        <w:t>jederzeit beendet werden. Vor dem Schließen des Fensters wird zur Vermeidung unbeabsichtigter Eingaben eine Sicherheitsabfrage angezeigt.</w:t>
+      </w:r>
+    </w:p>
+    <w:p>
+      <w:pPr>
+        <w:keepNext/>
+      </w:pPr>
+      <w:r>
         <w:rPr>
           <w:noProof/>
         </w:rPr>
         <w:drawing>
-          <wp:inline distT="0" distB="0" distL="0" distR="0" wp14:anchorId="2C86FB31" wp14:editId="6956C614">
+          <wp:inline distT="0" distB="0" distL="0" distR="0" wp14:anchorId="2C86FB31" wp14:editId="65733D1F">
             <wp:extent cx="2100805" cy="1893549"/>
             <wp:effectExtent l="19050" t="19050" r="13970" b="12065"/>
             <wp:docPr id="1348833077" name="Grafik 9"/>
@@ -5230,14 +5514,27 @@
       <w:r>
         <w:t xml:space="preserve">Abbildung </w:t>
       </w:r>
-      <w:fldSimple w:instr=" SEQ Abbildung \* ARABIC ">
-        <w:r>
-          <w:rPr>
-            <w:noProof/>
-          </w:rPr>
-          <w:t>19</w:t>
-        </w:r>
-      </w:fldSimple>
+      <w:r>
+        <w:fldChar w:fldCharType="begin"/>
+      </w:r>
+      <w:r>
+        <w:instrText xml:space="preserve"> SEQ Abbildung \* ARABIC </w:instrText>
+      </w:r>
+      <w:r>
+        <w:fldChar w:fldCharType="separate"/>
+      </w:r>
+      <w:r>
+        <w:rPr>
+          <w:noProof/>
+        </w:rPr>
+        <w:t>19</w:t>
+      </w:r>
+      <w:r>
+        <w:rPr>
+          <w:noProof/>
+        </w:rPr>
+        <w:fldChar w:fldCharType="end"/>
+      </w:r>
       <w:r>
         <w:t xml:space="preserve"> </w:t>
       </w:r>
@@ -5247,12 +5544,6 @@
     </w:p>
     <w:p/>
     <w:p>
-      <w:r>
-        <w:lastRenderedPageBreak/>
-        <w:t>Die vom Dozenten angelegte Prüfung wird nach Betätigung des Speichern-Buttons in der SQLite-Datenbank abgelegt. Gespeichert werden Prüfungsname, Datum, Gruppe, Bearbeitungsdauer sowie die Pfade zur Prüfungsaufgabe, Musterlösung und Teilnehmerliste</w:t>
-      </w:r>
-    </w:p>
-    <w:p>
       <w:pPr>
         <w:keepNext/>
       </w:pPr>
@@ -5261,9 +5552,17 @@
           <w:noProof/>
         </w:rPr>
         <w:drawing>
-          <wp:inline distT="0" distB="0" distL="0" distR="0" wp14:anchorId="0DEC43F7" wp14:editId="19A4FBA6">
-            <wp:extent cx="2000732" cy="2301547"/>
+          <wp:anchor distT="0" distB="0" distL="114300" distR="114300" simplePos="0" relativeHeight="251676672" behindDoc="0" locked="0" layoutInCell="1" allowOverlap="1" wp14:anchorId="0DEC43F7" wp14:editId="5A32AF12">
+            <wp:simplePos x="0" y="0"/>
+            <wp:positionH relativeFrom="column">
+              <wp:posOffset>224155</wp:posOffset>
+            </wp:positionH>
+            <wp:positionV relativeFrom="paragraph">
+              <wp:posOffset>24765</wp:posOffset>
+            </wp:positionV>
+            <wp:extent cx="2000250" cy="2301240"/>
             <wp:effectExtent l="19050" t="19050" r="19050" b="22860"/>
+            <wp:wrapSquare wrapText="bothSides"/>
             <wp:docPr id="772296981" name="Grafik 9"/>
             <wp:cNvGraphicFramePr>
               <a:graphicFrameLocks xmlns:a="http://schemas.openxmlformats.org/drawingml/2006/main" noChangeAspect="1"/>
@@ -5290,7 +5589,148 @@
                   <pic:spPr>
                     <a:xfrm>
                       <a:off x="0" y="0"/>
-                      <a:ext cx="2017963" cy="2321369"/>
+                      <a:ext cx="2000250" cy="2301240"/>
+                    </a:xfrm>
+                    <a:prstGeom prst="rect">
+                      <a:avLst/>
+                    </a:prstGeom>
+                    <a:ln>
+                      <a:solidFill>
+                        <a:srgbClr val="EE0000"/>
+                      </a:solidFill>
+                    </a:ln>
+                  </pic:spPr>
+                </pic:pic>
+              </a:graphicData>
+            </a:graphic>
+          </wp:anchor>
+        </w:drawing>
+      </w:r>
+      <w:r>
+        <w:t xml:space="preserve">Die vom Dozenten angelegte Prüfung wird in der Tabelle </w:t>
+      </w:r>
+      <w:proofErr w:type="spellStart"/>
+      <w:r>
+        <w:t>pruefungen</w:t>
+      </w:r>
+      <w:proofErr w:type="spellEnd"/>
+      <w:r>
+        <w:t xml:space="preserve"> der SQLite-Datenbank gespeichert. Gespeichert werden der Prüfungsname, das Prüfungsdatum, die Gruppe, die Bearbeitungsdauer sowie die Pfade zur Prüfungsaufgabe, zur Musterlösung und zur Teilnehmerliste. Dadurch stehen die Prüfungsdaten dauerhaft zur Verfügung und können in späteren Entwicklungsschritten für die dynamische Anzeige und Durchführung von Prüfungen verwendet werden.</w:t>
+      </w:r>
+      <w:r>
+        <w:t xml:space="preserve"> </w:t>
+      </w:r>
+    </w:p>
+    <w:p>
+      <w:pPr>
+        <w:pStyle w:val="Beschriftung"/>
+      </w:pPr>
+      <w:r>
+        <w:t xml:space="preserve">Abbildung </w:t>
+      </w:r>
+      <w:r>
+        <w:fldChar w:fldCharType="begin"/>
+      </w:r>
+      <w:r>
+        <w:instrText xml:space="preserve"> SEQ Abbildung \* ARABIC </w:instrText>
+      </w:r>
+      <w:r>
+        <w:fldChar w:fldCharType="separate"/>
+      </w:r>
+      <w:r>
+        <w:rPr>
+          <w:noProof/>
+        </w:rPr>
+        <w:t>20</w:t>
+      </w:r>
+      <w:r>
+        <w:rPr>
+          <w:noProof/>
+        </w:rPr>
+        <w:fldChar w:fldCharType="end"/>
+      </w:r>
+      <w:r>
+        <w:t xml:space="preserve"> Angelegte Prüfung wird gespeichert</w:t>
+      </w:r>
+    </w:p>
+    <w:p>
+      <w:pPr>
+        <w:rPr>
+          <w:b/>
+          <w:bCs/>
+        </w:rPr>
+      </w:pPr>
+      <w:r>
+        <w:rPr>
+          <w:b/>
+          <w:bCs/>
+        </w:rPr>
+        <w:t>Dynamische Anzeige von Prüfungen</w:t>
+      </w:r>
+    </w:p>
+    <w:p>
+      <w:r>
+        <w:t xml:space="preserve">Nach der Umsetzung der Prüfungsverwaltung </w:t>
+      </w:r>
+      <w:proofErr w:type="gramStart"/>
+      <w:r>
+        <w:t>wurden</w:t>
+      </w:r>
+      <w:proofErr w:type="gramEnd"/>
+      <w:r>
+        <w:t xml:space="preserve"> die zuvor fest im Quellcode hinterlegten Beispielprüfungen durch Datenbankabfragen ersetzt. Beim Öffnen des Dozentenbereichs werden alle in der SQLite-Datenbank gespeicherten Prüfungen geladen und automatisch angezeigt.</w:t>
+      </w:r>
+    </w:p>
+    <w:p>
+      <w:r>
+        <w:t>Die Prüfungen werden anhand ihres Datums kategorisiert. Liegt das Prüfungsdatum vor dem aktuellen Datum, wird die Prüfung in der Liste „Vergangene Prüfungen“ angezeigt. Prüfungen mit einem aktuellen oder zukünftigen Datum werden automatisch der Liste „Geplante Prüfungen“ zugeordnet.</w:t>
+      </w:r>
+    </w:p>
+    <w:p>
+      <w:r>
+        <w:t>Dadurch erfolgt die Anzeige der Prüfungen vollständig datenbankgestützt. Neu angelegte Prüfungen erscheinen ohne weitere Anpassungen des Quellcodes automatisch im Dozentenbereich.</w:t>
+      </w:r>
+    </w:p>
+    <w:p>
+      <w:pPr>
+        <w:keepNext/>
+      </w:pPr>
+      <w:r>
+        <w:rPr>
+          <w:noProof/>
+        </w:rPr>
+        <w:lastRenderedPageBreak/>
+        <w:drawing>
+          <wp:inline distT="0" distB="0" distL="0" distR="0" wp14:anchorId="6DDEC299" wp14:editId="1087AB7D">
+            <wp:extent cx="3857625" cy="2299182"/>
+            <wp:effectExtent l="19050" t="19050" r="9525" b="25400"/>
+            <wp:docPr id="968413297" name="Grafik 9"/>
+            <wp:cNvGraphicFramePr>
+              <a:graphicFrameLocks xmlns:a="http://schemas.openxmlformats.org/drawingml/2006/main" noChangeAspect="1"/>
+            </wp:cNvGraphicFramePr>
+            <a:graphic xmlns:a="http://schemas.openxmlformats.org/drawingml/2006/main">
+              <a:graphicData uri="http://schemas.openxmlformats.org/drawingml/2006/picture">
+                <pic:pic xmlns:pic="http://schemas.openxmlformats.org/drawingml/2006/picture">
+                  <pic:nvPicPr>
+                    <pic:cNvPr id="968413297" name="Grafik 968413297"/>
+                    <pic:cNvPicPr/>
+                  </pic:nvPicPr>
+                  <pic:blipFill>
+                    <a:blip r:embed="rId32" cstate="print">
+                      <a:extLst>
+                        <a:ext uri="{28A0092B-C50C-407E-A947-70E740481C1C}">
+                          <a14:useLocalDpi xmlns:a14="http://schemas.microsoft.com/office/drawing/2010/main" val="0"/>
+                        </a:ext>
+                      </a:extLst>
+                    </a:blip>
+                    <a:stretch>
+                      <a:fillRect/>
+                    </a:stretch>
+                  </pic:blipFill>
+                  <pic:spPr>
+                    <a:xfrm>
+                      <a:off x="0" y="0"/>
+                      <a:ext cx="3863353" cy="2302596"/>
                     </a:xfrm>
                     <a:prstGeom prst="rect">
                       <a:avLst/>
@@ -5315,18 +5755,29 @@
       <w:r>
         <w:t xml:space="preserve">Abbildung </w:t>
       </w:r>
-      <w:fldSimple w:instr=" SEQ Abbildung \* ARABIC ">
-        <w:r>
-          <w:rPr>
-            <w:noProof/>
-          </w:rPr>
-          <w:t>20</w:t>
-        </w:r>
-      </w:fldSimple>
-      <w:r>
-        <w:t xml:space="preserve"> Angelegte Prüfung wird gespeichert</w:t>
-      </w:r>
-    </w:p>
+      <w:r>
+        <w:fldChar w:fldCharType="begin"/>
+      </w:r>
+      <w:r>
+        <w:instrText xml:space="preserve"> SEQ Abbildung \* ARABIC </w:instrText>
+      </w:r>
+      <w:r>
+        <w:fldChar w:fldCharType="separate"/>
+      </w:r>
+      <w:r>
+        <w:rPr>
+          <w:noProof/>
+        </w:rPr>
+        <w:t>21</w:t>
+      </w:r>
+      <w:r>
+        <w:fldChar w:fldCharType="end"/>
+      </w:r>
+      <w:r>
+        <w:t>Dynamische Anzeige geplanter und vergangener Prüfungen</w:t>
+      </w:r>
+    </w:p>
+    <w:p/>
     <w:sectPr>
       <w:pgSz w:w="11906" w:h="16838"/>
       <w:pgMar w:top="1417" w:right="1417" w:bottom="1134" w:left="1417" w:header="708" w:footer="708" w:gutter="0"/>

</xml_diff>

<commit_message>
Prüfungsteilnehmer-Tabelle und benutzerspezifische StudentGUI umgesetzt
</commit_message>
<xml_diff>
--- a/Dokumentation.docx
+++ b/Dokumentation.docx
@@ -3062,7 +3062,7 @@
           <w:noProof/>
         </w:rPr>
         <w:drawing>
-          <wp:anchor distT="0" distB="0" distL="114300" distR="114300" simplePos="0" relativeHeight="251666432" behindDoc="0" locked="0" layoutInCell="1" allowOverlap="1" wp14:anchorId="30414A45" wp14:editId="28BD57C7">
+          <wp:anchor distT="0" distB="0" distL="114300" distR="114300" simplePos="0" relativeHeight="251666432" behindDoc="0" locked="0" layoutInCell="1" allowOverlap="1" wp14:anchorId="30414A45" wp14:editId="3C9ED7A4">
             <wp:simplePos x="0" y="0"/>
             <wp:positionH relativeFrom="margin">
               <wp:align>right</wp:align>
@@ -3124,7 +3124,7 @@
           <w:noProof/>
         </w:rPr>
         <w:drawing>
-          <wp:anchor distT="0" distB="0" distL="114300" distR="114300" simplePos="0" relativeHeight="251667456" behindDoc="0" locked="0" layoutInCell="1" allowOverlap="1" wp14:anchorId="38FD9A55" wp14:editId="4DB4B62A">
+          <wp:anchor distT="0" distB="0" distL="114300" distR="114300" simplePos="0" relativeHeight="251667456" behindDoc="0" locked="0" layoutInCell="1" allowOverlap="1" wp14:anchorId="38FD9A55" wp14:editId="7A4ED06D">
             <wp:simplePos x="0" y="0"/>
             <wp:positionH relativeFrom="column">
               <wp:posOffset>90805</wp:posOffset>
@@ -3316,7 +3316,7 @@
           <w:noProof/>
         </w:rPr>
         <w:drawing>
-          <wp:anchor distT="0" distB="0" distL="114300" distR="114300" simplePos="0" relativeHeight="251668480" behindDoc="0" locked="0" layoutInCell="1" allowOverlap="1" wp14:anchorId="6F7F581A" wp14:editId="53DFD9D6">
+          <wp:anchor distT="0" distB="0" distL="114300" distR="114300" simplePos="0" relativeHeight="251668480" behindDoc="0" locked="0" layoutInCell="1" allowOverlap="1" wp14:anchorId="6F7F581A" wp14:editId="4E9D0ED5">
             <wp:simplePos x="0" y="0"/>
             <wp:positionH relativeFrom="column">
               <wp:posOffset>147955</wp:posOffset>
@@ -3626,7 +3626,7 @@
         </w:rPr>
         <w:lastRenderedPageBreak/>
         <w:drawing>
-          <wp:anchor distT="0" distB="0" distL="114300" distR="114300" simplePos="0" relativeHeight="251671552" behindDoc="0" locked="0" layoutInCell="1" allowOverlap="1" wp14:anchorId="076D891D" wp14:editId="1622E60A">
+          <wp:anchor distT="0" distB="0" distL="114300" distR="114300" simplePos="0" relativeHeight="251671552" behindDoc="0" locked="0" layoutInCell="1" allowOverlap="1" wp14:anchorId="076D891D" wp14:editId="75440C69">
             <wp:simplePos x="0" y="0"/>
             <wp:positionH relativeFrom="column">
               <wp:posOffset>3110230</wp:posOffset>
@@ -3685,7 +3685,7 @@
           <w:noProof/>
         </w:rPr>
         <w:drawing>
-          <wp:inline distT="0" distB="0" distL="0" distR="0" wp14:anchorId="2DDC6EE9" wp14:editId="0F7EFFAA">
+          <wp:inline distT="0" distB="0" distL="0" distR="0" wp14:anchorId="2DDC6EE9" wp14:editId="20BC5CE2">
             <wp:extent cx="2469686" cy="1666875"/>
             <wp:effectExtent l="19050" t="19050" r="26035" b="9525"/>
             <wp:docPr id="1870732759" name="Grafik 9"/>
@@ -3850,7 +3850,7 @@
         </w:rPr>
         <w:lastRenderedPageBreak/>
         <w:drawing>
-          <wp:inline distT="0" distB="0" distL="0" distR="0" wp14:anchorId="7AA15A65" wp14:editId="40FEF161">
+          <wp:inline distT="0" distB="0" distL="0" distR="0" wp14:anchorId="7AA15A65" wp14:editId="0A2DF929">
             <wp:extent cx="2801815" cy="2603846"/>
             <wp:effectExtent l="0" t="0" r="0" b="6350"/>
             <wp:docPr id="422847558" name="Grafik 8"/>
@@ -4176,7 +4176,7 @@
           <w:noProof/>
         </w:rPr>
         <w:drawing>
-          <wp:inline distT="0" distB="0" distL="0" distR="0" wp14:anchorId="7965622C" wp14:editId="483C00FE">
+          <wp:inline distT="0" distB="0" distL="0" distR="0" wp14:anchorId="7965622C" wp14:editId="23B24C83">
             <wp:extent cx="3390900" cy="2397776"/>
             <wp:effectExtent l="19050" t="19050" r="19050" b="21590"/>
             <wp:docPr id="1745081094" name="Grafik 8"/>
@@ -4559,7 +4559,7 @@
           <w:noProof/>
         </w:rPr>
         <w:drawing>
-          <wp:inline distT="0" distB="0" distL="0" distR="0" wp14:anchorId="2CD4F620" wp14:editId="4CF403A0">
+          <wp:inline distT="0" distB="0" distL="0" distR="0" wp14:anchorId="2CD4F620" wp14:editId="222C973A">
             <wp:extent cx="3543300" cy="2125901"/>
             <wp:effectExtent l="19050" t="19050" r="19050" b="27305"/>
             <wp:docPr id="2129645333" name="Grafik 9"/>
@@ -5156,7 +5156,7 @@
           <w:noProof/>
         </w:rPr>
         <w:drawing>
-          <wp:anchor distT="0" distB="0" distL="114300" distR="114300" simplePos="0" relativeHeight="251672576" behindDoc="0" locked="0" layoutInCell="1" allowOverlap="1" wp14:anchorId="302F5CF5" wp14:editId="10FCCA92">
+          <wp:anchor distT="0" distB="0" distL="114300" distR="114300" simplePos="0" relativeHeight="251672576" behindDoc="0" locked="0" layoutInCell="1" allowOverlap="1" wp14:anchorId="302F5CF5" wp14:editId="2D33400A">
             <wp:simplePos x="0" y="0"/>
             <wp:positionH relativeFrom="margin">
               <wp:posOffset>3509501</wp:posOffset>
@@ -5460,7 +5460,7 @@
           <w:noProof/>
         </w:rPr>
         <w:drawing>
-          <wp:inline distT="0" distB="0" distL="0" distR="0" wp14:anchorId="2C86FB31" wp14:editId="65733D1F">
+          <wp:inline distT="0" distB="0" distL="0" distR="0" wp14:anchorId="2C86FB31" wp14:editId="6C485008">
             <wp:extent cx="2100805" cy="1893549"/>
             <wp:effectExtent l="19050" t="19050" r="13970" b="12065"/>
             <wp:docPr id="1348833077" name="Grafik 9"/>
@@ -5552,7 +5552,7 @@
           <w:noProof/>
         </w:rPr>
         <w:drawing>
-          <wp:anchor distT="0" distB="0" distL="114300" distR="114300" simplePos="0" relativeHeight="251676672" behindDoc="0" locked="0" layoutInCell="1" allowOverlap="1" wp14:anchorId="0DEC43F7" wp14:editId="5A32AF12">
+          <wp:anchor distT="0" distB="0" distL="114300" distR="114300" simplePos="0" relativeHeight="251676672" behindDoc="0" locked="0" layoutInCell="1" allowOverlap="1" wp14:anchorId="0DEC43F7" wp14:editId="02074756">
             <wp:simplePos x="0" y="0"/>
             <wp:positionH relativeFrom="column">
               <wp:posOffset>224155</wp:posOffset>
@@ -5615,10 +5615,7 @@
       </w:r>
       <w:proofErr w:type="spellEnd"/>
       <w:r>
-        <w:t xml:space="preserve"> der SQLite-Datenbank gespeichert. Gespeichert werden der Prüfungsname, das Prüfungsdatum, die Gruppe, die Bearbeitungsdauer sowie die Pfade zur Prüfungsaufgabe, zur Musterlösung und zur Teilnehmerliste. Dadurch stehen die Prüfungsdaten dauerhaft zur Verfügung und können in späteren Entwicklungsschritten für die dynamische Anzeige und Durchführung von Prüfungen verwendet werden.</w:t>
-      </w:r>
-      <w:r>
-        <w:t xml:space="preserve"> </w:t>
+        <w:t xml:space="preserve"> der SQLite-Datenbank gespeichert. Gespeichert werden der Prüfungsname, das Prüfungsdatum, die Gruppe, die Bearbeitungsdauer sowie die Pfade zur Prüfungsaufgabe, zur Musterlösung und zur Teilnehmerliste. Dadurch stehen die Prüfungsdaten dauerhaft zur Verfügung und können in späteren Entwicklungsschritten für die dynamische Anzeige und Durchführung von Prüfungen verwendet werden. </w:t>
       </w:r>
     </w:p>
     <w:p>
@@ -5701,7 +5698,7 @@
         </w:rPr>
         <w:lastRenderedPageBreak/>
         <w:drawing>
-          <wp:inline distT="0" distB="0" distL="0" distR="0" wp14:anchorId="6DDEC299" wp14:editId="1087AB7D">
+          <wp:inline distT="0" distB="0" distL="0" distR="0" wp14:anchorId="6DDEC299" wp14:editId="62200907">
             <wp:extent cx="3857625" cy="2299182"/>
             <wp:effectExtent l="19050" t="19050" r="9525" b="25400"/>
             <wp:docPr id="968413297" name="Grafik 9"/>
@@ -5777,7 +5774,175 @@
         <w:t>Dynamische Anzeige geplanter und vergangener Prüfungen</w:t>
       </w:r>
     </w:p>
-    <w:p/>
+    <w:p>
+      <w:pPr>
+        <w:rPr>
+          <w:b/>
+          <w:bCs/>
+        </w:rPr>
+      </w:pPr>
+      <w:r>
+        <w:rPr>
+          <w:b/>
+          <w:bCs/>
+        </w:rPr>
+        <w:t>Individuelle Prüfungszuordnung für Studenten</w:t>
+      </w:r>
+    </w:p>
+    <w:p>
+      <w:r>
+        <w:t xml:space="preserve">Nach der Einführung der Datenbanktabelle </w:t>
+      </w:r>
+      <w:proofErr w:type="spellStart"/>
+      <w:r>
+        <w:t>pruefungsteilnehmer</w:t>
+      </w:r>
+      <w:proofErr w:type="spellEnd"/>
+      <w:r>
+        <w:t xml:space="preserve"> wurde die bisherige Logik ersetzt, bei der allen Studenten die nächste geplante Prüfung angezeigt wurde. Stattdessen erfolgt die Zuordnung nun individuell über die Datenbank.</w:t>
+      </w:r>
+    </w:p>
+    <w:p>
+      <w:r>
+        <w:t xml:space="preserve">Beim Anlegen einer Prüfung werden die Teilnehmer aus der hochgeladenen Teilnehmerliste automatisch eingelesen. Für jeden Teilnehmer wird ein Benutzerkonto erzeugt und gleichzeitig eine Verknüpfung zwischen Benutzername und Prüfungs-ID in der Tabelle </w:t>
+      </w:r>
+      <w:proofErr w:type="spellStart"/>
+      <w:r>
+        <w:t>pruefungsteilnehmer</w:t>
+      </w:r>
+      <w:proofErr w:type="spellEnd"/>
+      <w:r>
+        <w:t xml:space="preserve"> gespeichert.</w:t>
+      </w:r>
+    </w:p>
+    <w:p>
+      <w:r>
+        <w:t xml:space="preserve">Meldet sich ein Student am System an, wird zunächst der Benutzername des aktuell angemeldeten Benutzers ermittelt. Anschließend wird über die Tabelle </w:t>
+      </w:r>
+      <w:proofErr w:type="spellStart"/>
+      <w:r>
+        <w:t>pruefungsteilnehmer</w:t>
+      </w:r>
+      <w:proofErr w:type="spellEnd"/>
+      <w:r>
+        <w:t xml:space="preserve"> die zugehörige Prüfungs-ID gesucht und die passende Prüfung aus der Tabelle </w:t>
+      </w:r>
+      <w:proofErr w:type="spellStart"/>
+      <w:r>
+        <w:t>pruefungen</w:t>
+      </w:r>
+      <w:proofErr w:type="spellEnd"/>
+      <w:r>
+        <w:t xml:space="preserve"> geladen.</w:t>
+      </w:r>
+    </w:p>
+    <w:p>
+      <w:r>
+        <w:t>Dadurch sieht jeder Student ausschließlich die ihm zugewiesene Prüfung mit den zugehörigen Informationen wie Prüfungsname, Prüfungsdatum und Prüfungsdauer. Die Anzeige erfolgt vollständig datenbankgestützt und ist nicht mehr von fest hinterlegten Beispieldaten oder der nächsten verfügbaren Prüfung abhängig.</w:t>
+      </w:r>
+    </w:p>
+    <w:p>
+      <w:r>
+        <w:t>Diese Erweiterung bildet die Grundlage für eine benutzerspezifische Prüfungsverwaltung und ermöglicht eine eindeutige Zuordnung von Studenten zu ihren Prüfungen.</w:t>
+      </w:r>
+    </w:p>
+    <w:p>
+      <w:pPr>
+        <w:keepNext/>
+      </w:pPr>
+      <w:r>
+        <w:rPr>
+          <w:noProof/>
+        </w:rPr>
+        <w:lastRenderedPageBreak/>
+        <w:drawing>
+          <wp:inline distT="0" distB="0" distL="0" distR="0" wp14:anchorId="7F161648" wp14:editId="1BF06229">
+            <wp:extent cx="4381500" cy="2922932"/>
+            <wp:effectExtent l="19050" t="19050" r="19050" b="10795"/>
+            <wp:docPr id="1397250810" name="Grafik 9"/>
+            <wp:cNvGraphicFramePr>
+              <a:graphicFrameLocks xmlns:a="http://schemas.openxmlformats.org/drawingml/2006/main" noChangeAspect="1"/>
+            </wp:cNvGraphicFramePr>
+            <a:graphic xmlns:a="http://schemas.openxmlformats.org/drawingml/2006/main">
+              <a:graphicData uri="http://schemas.openxmlformats.org/drawingml/2006/picture">
+                <pic:pic xmlns:pic="http://schemas.openxmlformats.org/drawingml/2006/picture">
+                  <pic:nvPicPr>
+                    <pic:cNvPr id="1397250810" name="Grafik 1397250810"/>
+                    <pic:cNvPicPr/>
+                  </pic:nvPicPr>
+                  <pic:blipFill>
+                    <a:blip r:embed="rId33" cstate="print">
+                      <a:extLst>
+                        <a:ext uri="{28A0092B-C50C-407E-A947-70E740481C1C}">
+                          <a14:useLocalDpi xmlns:a14="http://schemas.microsoft.com/office/drawing/2010/main" val="0"/>
+                        </a:ext>
+                      </a:extLst>
+                    </a:blip>
+                    <a:stretch>
+                      <a:fillRect/>
+                    </a:stretch>
+                  </pic:blipFill>
+                  <pic:spPr>
+                    <a:xfrm>
+                      <a:off x="0" y="0"/>
+                      <a:ext cx="4385726" cy="2925751"/>
+                    </a:xfrm>
+                    <a:prstGeom prst="rect">
+                      <a:avLst/>
+                    </a:prstGeom>
+                    <a:ln>
+                      <a:solidFill>
+                        <a:srgbClr val="EE0000"/>
+                      </a:solidFill>
+                    </a:ln>
+                  </pic:spPr>
+                </pic:pic>
+              </a:graphicData>
+            </a:graphic>
+          </wp:inline>
+        </w:drawing>
+      </w:r>
+    </w:p>
+    <w:p>
+      <w:pPr>
+        <w:pStyle w:val="Beschriftung"/>
+      </w:pPr>
+      <w:r>
+        <w:t xml:space="preserve">Abbildung </w:t>
+      </w:r>
+      <w:r>
+        <w:fldChar w:fldCharType="begin"/>
+      </w:r>
+      <w:r>
+        <w:instrText xml:space="preserve"> SEQ Abbildung \* ARABIC </w:instrText>
+      </w:r>
+      <w:r>
+        <w:fldChar w:fldCharType="separate"/>
+      </w:r>
+      <w:r>
+        <w:rPr>
+          <w:noProof/>
+        </w:rPr>
+        <w:t>22</w:t>
+      </w:r>
+      <w:r>
+        <w:fldChar w:fldCharType="end"/>
+      </w:r>
+      <w:r>
+        <w:t xml:space="preserve"> </w:t>
+      </w:r>
+      <w:r>
+        <w:t xml:space="preserve">Datenbankgestützte Zuordnung von Studenten zu Prüfungen und automatische Anzeige der zugewiesenen Prüfung in der </w:t>
+      </w:r>
+      <w:proofErr w:type="spellStart"/>
+      <w:r>
+        <w:t>StudentGUI</w:t>
+      </w:r>
+      <w:proofErr w:type="spellEnd"/>
+      <w:r>
+        <w:t>.</w:t>
+      </w:r>
+    </w:p>
     <w:sectPr>
       <w:pgSz w:w="11906" w:h="16838"/>
       <w:pgMar w:top="1417" w:right="1417" w:bottom="1134" w:left="1417" w:header="708" w:footer="708" w:gutter="0"/>

</xml_diff>

<commit_message>
Refactor Bewertungsengine auf aufgabenbasierten Vergleich
- Musterlösung und Studentenlösung generisch vergleichen
- Aufgaben automatisch erkennen
- Formeln auf Aufgabenebene bewerten
- Hartcodierte Bewertungslogik schrittweise ersetzen
</commit_message>
<xml_diff>
--- a/Dokumentation.docx
+++ b/Dokumentation.docx
@@ -3062,7 +3062,7 @@
           <w:noProof/>
         </w:rPr>
         <w:drawing>
-          <wp:anchor distT="0" distB="0" distL="114300" distR="114300" simplePos="0" relativeHeight="251666432" behindDoc="0" locked="0" layoutInCell="1" allowOverlap="1" wp14:anchorId="30414A45" wp14:editId="5483AFE4">
+          <wp:anchor distT="0" distB="0" distL="114300" distR="114300" simplePos="0" relativeHeight="251666432" behindDoc="0" locked="0" layoutInCell="1" allowOverlap="1" wp14:anchorId="30414A45" wp14:editId="6DE0084C">
             <wp:simplePos x="0" y="0"/>
             <wp:positionH relativeFrom="margin">
               <wp:align>right</wp:align>
@@ -3124,7 +3124,7 @@
           <w:noProof/>
         </w:rPr>
         <w:drawing>
-          <wp:anchor distT="0" distB="0" distL="114300" distR="114300" simplePos="0" relativeHeight="251667456" behindDoc="0" locked="0" layoutInCell="1" allowOverlap="1" wp14:anchorId="38FD9A55" wp14:editId="69B15E83">
+          <wp:anchor distT="0" distB="0" distL="114300" distR="114300" simplePos="0" relativeHeight="251667456" behindDoc="0" locked="0" layoutInCell="1" allowOverlap="1" wp14:anchorId="38FD9A55" wp14:editId="5AA7AE8C">
             <wp:simplePos x="0" y="0"/>
             <wp:positionH relativeFrom="column">
               <wp:posOffset>90805</wp:posOffset>
@@ -3316,7 +3316,7 @@
           <w:noProof/>
         </w:rPr>
         <w:drawing>
-          <wp:anchor distT="0" distB="0" distL="114300" distR="114300" simplePos="0" relativeHeight="251668480" behindDoc="0" locked="0" layoutInCell="1" allowOverlap="1" wp14:anchorId="6F7F581A" wp14:editId="24A1AE88">
+          <wp:anchor distT="0" distB="0" distL="114300" distR="114300" simplePos="0" relativeHeight="251668480" behindDoc="0" locked="0" layoutInCell="1" allowOverlap="1" wp14:anchorId="6F7F581A" wp14:editId="782C683C">
             <wp:simplePos x="0" y="0"/>
             <wp:positionH relativeFrom="column">
               <wp:posOffset>147955</wp:posOffset>
@@ -3626,7 +3626,7 @@
         </w:rPr>
         <w:lastRenderedPageBreak/>
         <w:drawing>
-          <wp:anchor distT="0" distB="0" distL="114300" distR="114300" simplePos="0" relativeHeight="251671552" behindDoc="0" locked="0" layoutInCell="1" allowOverlap="1" wp14:anchorId="076D891D" wp14:editId="7859B5D5">
+          <wp:anchor distT="0" distB="0" distL="114300" distR="114300" simplePos="0" relativeHeight="251671552" behindDoc="0" locked="0" layoutInCell="1" allowOverlap="1" wp14:anchorId="076D891D" wp14:editId="115B572F">
             <wp:simplePos x="0" y="0"/>
             <wp:positionH relativeFrom="column">
               <wp:posOffset>3110230</wp:posOffset>
@@ -3685,7 +3685,7 @@
           <w:noProof/>
         </w:rPr>
         <w:drawing>
-          <wp:inline distT="0" distB="0" distL="0" distR="0" wp14:anchorId="2DDC6EE9" wp14:editId="37B6BC11">
+          <wp:inline distT="0" distB="0" distL="0" distR="0" wp14:anchorId="2DDC6EE9" wp14:editId="786D3A1D">
             <wp:extent cx="2469686" cy="1666875"/>
             <wp:effectExtent l="19050" t="19050" r="26035" b="9525"/>
             <wp:docPr id="1870732759" name="Grafik 9"/>
@@ -3850,7 +3850,7 @@
         </w:rPr>
         <w:lastRenderedPageBreak/>
         <w:drawing>
-          <wp:inline distT="0" distB="0" distL="0" distR="0" wp14:anchorId="7AA15A65" wp14:editId="341228DF">
+          <wp:inline distT="0" distB="0" distL="0" distR="0" wp14:anchorId="7AA15A65" wp14:editId="52D9610E">
             <wp:extent cx="2801815" cy="2603846"/>
             <wp:effectExtent l="0" t="0" r="0" b="6350"/>
             <wp:docPr id="422847558" name="Grafik 8"/>
@@ -4176,7 +4176,7 @@
           <w:noProof/>
         </w:rPr>
         <w:drawing>
-          <wp:inline distT="0" distB="0" distL="0" distR="0" wp14:anchorId="7965622C" wp14:editId="497F4F4D">
+          <wp:inline distT="0" distB="0" distL="0" distR="0" wp14:anchorId="7965622C" wp14:editId="4AF27759">
             <wp:extent cx="3390900" cy="2397776"/>
             <wp:effectExtent l="19050" t="19050" r="19050" b="21590"/>
             <wp:docPr id="1745081094" name="Grafik 8"/>
@@ -4559,7 +4559,7 @@
           <w:noProof/>
         </w:rPr>
         <w:drawing>
-          <wp:inline distT="0" distB="0" distL="0" distR="0" wp14:anchorId="2CD4F620" wp14:editId="54FEAEA8">
+          <wp:inline distT="0" distB="0" distL="0" distR="0" wp14:anchorId="2CD4F620" wp14:editId="12B87F25">
             <wp:extent cx="3543300" cy="2125901"/>
             <wp:effectExtent l="19050" t="19050" r="19050" b="27305"/>
             <wp:docPr id="2129645333" name="Grafik 9"/>
@@ -5156,7 +5156,7 @@
           <w:noProof/>
         </w:rPr>
         <w:drawing>
-          <wp:anchor distT="0" distB="0" distL="114300" distR="114300" simplePos="0" relativeHeight="251672576" behindDoc="0" locked="0" layoutInCell="1" allowOverlap="1" wp14:anchorId="302F5CF5" wp14:editId="4B03346A">
+          <wp:anchor distT="0" distB="0" distL="114300" distR="114300" simplePos="0" relativeHeight="251672576" behindDoc="0" locked="0" layoutInCell="1" allowOverlap="1" wp14:anchorId="302F5CF5" wp14:editId="365C6C6E">
             <wp:simplePos x="0" y="0"/>
             <wp:positionH relativeFrom="margin">
               <wp:posOffset>3509501</wp:posOffset>
@@ -5460,7 +5460,7 @@
           <w:noProof/>
         </w:rPr>
         <w:drawing>
-          <wp:inline distT="0" distB="0" distL="0" distR="0" wp14:anchorId="2C86FB31" wp14:editId="0C4EEDBD">
+          <wp:inline distT="0" distB="0" distL="0" distR="0" wp14:anchorId="2C86FB31" wp14:editId="657AE2D2">
             <wp:extent cx="2100805" cy="1893549"/>
             <wp:effectExtent l="19050" t="19050" r="13970" b="12065"/>
             <wp:docPr id="1348833077" name="Grafik 9"/>
@@ -5552,7 +5552,7 @@
           <w:noProof/>
         </w:rPr>
         <w:drawing>
-          <wp:anchor distT="0" distB="0" distL="114300" distR="114300" simplePos="0" relativeHeight="251676672" behindDoc="0" locked="0" layoutInCell="1" allowOverlap="1" wp14:anchorId="0DEC43F7" wp14:editId="26119A08">
+          <wp:anchor distT="0" distB="0" distL="114300" distR="114300" simplePos="0" relativeHeight="251676672" behindDoc="0" locked="0" layoutInCell="1" allowOverlap="1" wp14:anchorId="0DEC43F7" wp14:editId="042DA0B5">
             <wp:simplePos x="0" y="0"/>
             <wp:positionH relativeFrom="column">
               <wp:posOffset>224155</wp:posOffset>
@@ -5698,7 +5698,7 @@
         </w:rPr>
         <w:lastRenderedPageBreak/>
         <w:drawing>
-          <wp:inline distT="0" distB="0" distL="0" distR="0" wp14:anchorId="6DDEC299" wp14:editId="3E322DBE">
+          <wp:inline distT="0" distB="0" distL="0" distR="0" wp14:anchorId="6DDEC299" wp14:editId="3B4293D2">
             <wp:extent cx="3857625" cy="2299182"/>
             <wp:effectExtent l="19050" t="19050" r="9525" b="25400"/>
             <wp:docPr id="968413297" name="Grafik 9"/>
@@ -6019,7 +6019,183 @@
         <w:t>Durch diese Erweiterung verfügt das Prüfungssystem erstmals über eine zentrale Prüfungsfreigabe. Die Steuerung erfolgt vollständig datenbankgestützt und bildet die Grundlage für die weitere Entwicklung der Prüfungssteuerung, Teilnehmerüberwachung und automatisierten Prüfungsabläufe.</w:t>
       </w:r>
     </w:p>
-    <w:p/>
+    <w:p>
+      <w:pPr>
+        <w:rPr>
+          <w:b/>
+          <w:bCs/>
+        </w:rPr>
+      </w:pPr>
+      <w:r>
+        <w:rPr>
+          <w:b/>
+          <w:bCs/>
+        </w:rPr>
+        <w:t xml:space="preserve">Generische </w:t>
+      </w:r>
+      <w:proofErr w:type="spellStart"/>
+      <w:r>
+        <w:rPr>
+          <w:b/>
+          <w:bCs/>
+        </w:rPr>
+        <w:t>Bewertungsengine</w:t>
+      </w:r>
+      <w:proofErr w:type="spellEnd"/>
+      <w:r>
+        <w:rPr>
+          <w:b/>
+          <w:bCs/>
+        </w:rPr>
+        <w:t xml:space="preserve"> für Excel-Prüfungen</w:t>
+      </w:r>
+    </w:p>
+    <w:p>
+      <w:r>
+        <w:t>Im bisherigen Prüfungssystem erfolgte die Auswertung anhand einer fest programmierten Beispielklausur. Die Bewertungslogik war auf einzelne Aufgaben und Zellpositionen abgestimmt und konnte daher nicht für andere Prüfungen verwendet werden.</w:t>
+      </w:r>
+    </w:p>
+    <w:p>
+      <w:r>
+        <w:t>Im Rahmen dieser Erweiterung wurde die Bewertungslogik grundlegend überarbeitet. Die Musterlösung wird nun anhand der in der Datenbank gespeicherten Prüfung geladen. Anschließend werden sowohl die Musterlösung als auch die vom Studenten abgegebene Excel-Datei gleichzeitig geöffnet und automatisch miteinander verglichen.</w:t>
+      </w:r>
+    </w:p>
+    <w:p>
+      <w:r>
+        <w:t xml:space="preserve">Hierfür wurde im </w:t>
+      </w:r>
+      <w:proofErr w:type="spellStart"/>
+      <w:r>
+        <w:t>PruefungsService</w:t>
+      </w:r>
+      <w:proofErr w:type="spellEnd"/>
+      <w:r>
+        <w:t xml:space="preserve"> eine neue Methode </w:t>
+      </w:r>
+      <w:proofErr w:type="spellStart"/>
+      <w:proofErr w:type="gramStart"/>
+      <w:r>
+        <w:t>vergleicheArbeitsmappe</w:t>
+      </w:r>
+      <w:proofErr w:type="spellEnd"/>
+      <w:r>
+        <w:t>(</w:t>
+      </w:r>
+      <w:proofErr w:type="gramEnd"/>
+      <w:r>
+        <w:t>) implementiert. Diese durchläuft sämtliche Arbeitsblätter, Zeilen und Zellen der Arbeitsmappe. Der Zelltyp wird dabei dynamisch erkannt, wodurch Formeln, Texte und numerische Werte unabhängig von ihrer Position verarbeitet werden können. Die bisherige Abhängigkeit von fest programmierten Zelladressen wurde damit aufgehoben.</w:t>
+      </w:r>
+    </w:p>
+    <w:p>
+      <w:r>
+        <w:t>Zusätzlich wurde eine aufgabenbasierte Bewertungslogik eingeführt. Aufgaben werden anhand ihrer Überschrift in der Musterlösung automatisch erkannt. Alle zu einer Aufgabe gehörenden Formeln werden gemeinsam bewertet. Weicht mindestens eine Formel von der Musterlösung ab, wird die gesamte Aufgabe als fehlerhaft bewertet. Dadurch orientiert sich die Bewertung deutlich stärker am tatsächlichen Korrekturverfahren einer Excel-Prüfung als die vorherige zellenbasierte Auswertung.</w:t>
+      </w:r>
+    </w:p>
+    <w:p>
+      <w:r>
+        <w:t xml:space="preserve">Während des Vergleichs werden fehlerhafte Formeln mit Angabe von Arbeitsblatt, Zeile und Spalte ausgegeben. Gleichzeitig zählt das System automatisch die Anzahl richtig und falsch gelöster Aufgaben. Dadurch steht erstmals eine generische </w:t>
+      </w:r>
+      <w:proofErr w:type="spellStart"/>
+      <w:r>
+        <w:t>Bewertungsengine</w:t>
+      </w:r>
+      <w:proofErr w:type="spellEnd"/>
+      <w:r>
+        <w:t xml:space="preserve"> zur Verfügung, die ohne Anpassung des Quellcodes für unterschiedliche Excel-Prüfungen eingesetzt werden kann, sofern diese dieselbe Aufgabenstruktur verwenden.</w:t>
+      </w:r>
+    </w:p>
+    <w:p>
+      <w:pPr>
+        <w:keepNext/>
+      </w:pPr>
+      <w:r>
+        <w:rPr>
+          <w:noProof/>
+        </w:rPr>
+        <w:lastRenderedPageBreak/>
+        <w:drawing>
+          <wp:inline distT="0" distB="0" distL="0" distR="0" wp14:anchorId="67EAFC50" wp14:editId="3D0671A5">
+            <wp:extent cx="3880884" cy="2015653"/>
+            <wp:effectExtent l="0" t="0" r="5715" b="3810"/>
+            <wp:docPr id="511322921" name="Grafik 9"/>
+            <wp:cNvGraphicFramePr>
+              <a:graphicFrameLocks xmlns:a="http://schemas.openxmlformats.org/drawingml/2006/main" noChangeAspect="1"/>
+            </wp:cNvGraphicFramePr>
+            <a:graphic xmlns:a="http://schemas.openxmlformats.org/drawingml/2006/main">
+              <a:graphicData uri="http://schemas.openxmlformats.org/drawingml/2006/picture">
+                <pic:pic xmlns:pic="http://schemas.openxmlformats.org/drawingml/2006/picture">
+                  <pic:nvPicPr>
+                    <pic:cNvPr id="511322921" name="Grafik 511322921"/>
+                    <pic:cNvPicPr/>
+                  </pic:nvPicPr>
+                  <pic:blipFill>
+                    <a:blip r:embed="rId34">
+                      <a:extLst>
+                        <a:ext uri="{28A0092B-C50C-407E-A947-70E740481C1C}">
+                          <a14:useLocalDpi xmlns:a14="http://schemas.microsoft.com/office/drawing/2010/main" val="0"/>
+                        </a:ext>
+                      </a:extLst>
+                    </a:blip>
+                    <a:stretch>
+                      <a:fillRect/>
+                    </a:stretch>
+                  </pic:blipFill>
+                  <pic:spPr>
+                    <a:xfrm>
+                      <a:off x="0" y="0"/>
+                      <a:ext cx="3914317" cy="2033018"/>
+                    </a:xfrm>
+                    <a:prstGeom prst="rect">
+                      <a:avLst/>
+                    </a:prstGeom>
+                  </pic:spPr>
+                </pic:pic>
+              </a:graphicData>
+            </a:graphic>
+          </wp:inline>
+        </w:drawing>
+      </w:r>
+    </w:p>
+    <w:p>
+      <w:pPr>
+        <w:pStyle w:val="Beschriftung"/>
+      </w:pPr>
+      <w:r>
+        <w:t xml:space="preserve">Abbildung </w:t>
+      </w:r>
+      <w:r>
+        <w:fldChar w:fldCharType="begin"/>
+      </w:r>
+      <w:r>
+        <w:instrText xml:space="preserve"> SEQ Abbildung \* ARABIC </w:instrText>
+      </w:r>
+      <w:r>
+        <w:fldChar w:fldCharType="separate"/>
+      </w:r>
+      <w:r>
+        <w:rPr>
+          <w:noProof/>
+        </w:rPr>
+        <w:t>23</w:t>
+      </w:r>
+      <w:r>
+        <w:fldChar w:fldCharType="end"/>
+      </w:r>
+      <w:r>
+        <w:t xml:space="preserve"> </w:t>
+      </w:r>
+      <w:r>
+        <w:t xml:space="preserve">Konsolenausgabe der generischen </w:t>
+      </w:r>
+      <w:proofErr w:type="spellStart"/>
+      <w:r>
+        <w:t>Bewertungsengine</w:t>
+      </w:r>
+      <w:proofErr w:type="spellEnd"/>
+      <w:r>
+        <w:t xml:space="preserve"> während des Vergleichs von Musterlösung und Studentenlösung. Das System erkennt Aufgaben automatisch und ordnet fehlerhafte Formeln der entsprechenden Aufgabe zu.</w:t>
+      </w:r>
+    </w:p>
     <w:sectPr>
       <w:pgSz w:w="11906" w:h="16838"/>
       <w:pgMar w:top="1417" w:right="1417" w:bottom="1134" w:left="1417" w:header="708" w:footer="708" w:gutter="0"/>

</xml_diff>

<commit_message>
Bewertungsengine für manuelle Korrektur vorbereitet
- AufgabeErgebnis erweitert
- Bewertungsengine auf List<AufgabeErgebnis> umgestellt
- Punkteberechnung auf Ergebnisobjekte umgestellt
- Grundlage für manuelle Korrektur geschaffen
</commit_message>
<xml_diff>
--- a/Dokumentation.docx
+++ b/Dokumentation.docx
@@ -3062,7 +3062,7 @@
           <w:noProof/>
         </w:rPr>
         <w:drawing>
-          <wp:anchor distT="0" distB="0" distL="114300" distR="114300" simplePos="0" relativeHeight="251666432" behindDoc="0" locked="0" layoutInCell="1" allowOverlap="1" wp14:anchorId="30414A45" wp14:editId="6DE0084C">
+          <wp:anchor distT="0" distB="0" distL="114300" distR="114300" simplePos="0" relativeHeight="251666432" behindDoc="0" locked="0" layoutInCell="1" allowOverlap="1" wp14:anchorId="30414A45" wp14:editId="57A628A7">
             <wp:simplePos x="0" y="0"/>
             <wp:positionH relativeFrom="margin">
               <wp:align>right</wp:align>
@@ -3124,7 +3124,7 @@
           <w:noProof/>
         </w:rPr>
         <w:drawing>
-          <wp:anchor distT="0" distB="0" distL="114300" distR="114300" simplePos="0" relativeHeight="251667456" behindDoc="0" locked="0" layoutInCell="1" allowOverlap="1" wp14:anchorId="38FD9A55" wp14:editId="5AA7AE8C">
+          <wp:anchor distT="0" distB="0" distL="114300" distR="114300" simplePos="0" relativeHeight="251667456" behindDoc="0" locked="0" layoutInCell="1" allowOverlap="1" wp14:anchorId="38FD9A55" wp14:editId="44CBC089">
             <wp:simplePos x="0" y="0"/>
             <wp:positionH relativeFrom="column">
               <wp:posOffset>90805</wp:posOffset>
@@ -3316,7 +3316,7 @@
           <w:noProof/>
         </w:rPr>
         <w:drawing>
-          <wp:anchor distT="0" distB="0" distL="114300" distR="114300" simplePos="0" relativeHeight="251668480" behindDoc="0" locked="0" layoutInCell="1" allowOverlap="1" wp14:anchorId="6F7F581A" wp14:editId="782C683C">
+          <wp:anchor distT="0" distB="0" distL="114300" distR="114300" simplePos="0" relativeHeight="251668480" behindDoc="0" locked="0" layoutInCell="1" allowOverlap="1" wp14:anchorId="6F7F581A" wp14:editId="78648EEB">
             <wp:simplePos x="0" y="0"/>
             <wp:positionH relativeFrom="column">
               <wp:posOffset>147955</wp:posOffset>
@@ -3626,7 +3626,7 @@
         </w:rPr>
         <w:lastRenderedPageBreak/>
         <w:drawing>
-          <wp:anchor distT="0" distB="0" distL="114300" distR="114300" simplePos="0" relativeHeight="251671552" behindDoc="0" locked="0" layoutInCell="1" allowOverlap="1" wp14:anchorId="076D891D" wp14:editId="115B572F">
+          <wp:anchor distT="0" distB="0" distL="114300" distR="114300" simplePos="0" relativeHeight="251671552" behindDoc="0" locked="0" layoutInCell="1" allowOverlap="1" wp14:anchorId="076D891D" wp14:editId="71E8507C">
             <wp:simplePos x="0" y="0"/>
             <wp:positionH relativeFrom="column">
               <wp:posOffset>3110230</wp:posOffset>
@@ -3685,7 +3685,7 @@
           <w:noProof/>
         </w:rPr>
         <w:drawing>
-          <wp:inline distT="0" distB="0" distL="0" distR="0" wp14:anchorId="2DDC6EE9" wp14:editId="786D3A1D">
+          <wp:inline distT="0" distB="0" distL="0" distR="0" wp14:anchorId="2DDC6EE9" wp14:editId="3964FA6F">
             <wp:extent cx="2469686" cy="1666875"/>
             <wp:effectExtent l="19050" t="19050" r="26035" b="9525"/>
             <wp:docPr id="1870732759" name="Grafik 9"/>
@@ -3850,7 +3850,7 @@
         </w:rPr>
         <w:lastRenderedPageBreak/>
         <w:drawing>
-          <wp:inline distT="0" distB="0" distL="0" distR="0" wp14:anchorId="7AA15A65" wp14:editId="52D9610E">
+          <wp:inline distT="0" distB="0" distL="0" distR="0" wp14:anchorId="7AA15A65" wp14:editId="47022C29">
             <wp:extent cx="2801815" cy="2603846"/>
             <wp:effectExtent l="0" t="0" r="0" b="6350"/>
             <wp:docPr id="422847558" name="Grafik 8"/>
@@ -4176,7 +4176,7 @@
           <w:noProof/>
         </w:rPr>
         <w:drawing>
-          <wp:inline distT="0" distB="0" distL="0" distR="0" wp14:anchorId="7965622C" wp14:editId="4AF27759">
+          <wp:inline distT="0" distB="0" distL="0" distR="0" wp14:anchorId="7965622C" wp14:editId="6FCA82A0">
             <wp:extent cx="3390900" cy="2397776"/>
             <wp:effectExtent l="19050" t="19050" r="19050" b="21590"/>
             <wp:docPr id="1745081094" name="Grafik 8"/>
@@ -4559,7 +4559,7 @@
           <w:noProof/>
         </w:rPr>
         <w:drawing>
-          <wp:inline distT="0" distB="0" distL="0" distR="0" wp14:anchorId="2CD4F620" wp14:editId="12B87F25">
+          <wp:inline distT="0" distB="0" distL="0" distR="0" wp14:anchorId="2CD4F620" wp14:editId="2BC2EB52">
             <wp:extent cx="3543300" cy="2125901"/>
             <wp:effectExtent l="19050" t="19050" r="19050" b="27305"/>
             <wp:docPr id="2129645333" name="Grafik 9"/>
@@ -5156,7 +5156,7 @@
           <w:noProof/>
         </w:rPr>
         <w:drawing>
-          <wp:anchor distT="0" distB="0" distL="114300" distR="114300" simplePos="0" relativeHeight="251672576" behindDoc="0" locked="0" layoutInCell="1" allowOverlap="1" wp14:anchorId="302F5CF5" wp14:editId="365C6C6E">
+          <wp:anchor distT="0" distB="0" distL="114300" distR="114300" simplePos="0" relativeHeight="251672576" behindDoc="0" locked="0" layoutInCell="1" allowOverlap="1" wp14:anchorId="302F5CF5" wp14:editId="624C7F77">
             <wp:simplePos x="0" y="0"/>
             <wp:positionH relativeFrom="margin">
               <wp:posOffset>3509501</wp:posOffset>
@@ -5460,7 +5460,7 @@
           <w:noProof/>
         </w:rPr>
         <w:drawing>
-          <wp:inline distT="0" distB="0" distL="0" distR="0" wp14:anchorId="2C86FB31" wp14:editId="657AE2D2">
+          <wp:inline distT="0" distB="0" distL="0" distR="0" wp14:anchorId="2C86FB31" wp14:editId="56966278">
             <wp:extent cx="2100805" cy="1893549"/>
             <wp:effectExtent l="19050" t="19050" r="13970" b="12065"/>
             <wp:docPr id="1348833077" name="Grafik 9"/>
@@ -5552,7 +5552,7 @@
           <w:noProof/>
         </w:rPr>
         <w:drawing>
-          <wp:anchor distT="0" distB="0" distL="114300" distR="114300" simplePos="0" relativeHeight="251676672" behindDoc="0" locked="0" layoutInCell="1" allowOverlap="1" wp14:anchorId="0DEC43F7" wp14:editId="042DA0B5">
+          <wp:anchor distT="0" distB="0" distL="114300" distR="114300" simplePos="0" relativeHeight="251676672" behindDoc="0" locked="0" layoutInCell="1" allowOverlap="1" wp14:anchorId="0DEC43F7" wp14:editId="5BFEBC9B">
             <wp:simplePos x="0" y="0"/>
             <wp:positionH relativeFrom="column">
               <wp:posOffset>224155</wp:posOffset>
@@ -5698,7 +5698,7 @@
         </w:rPr>
         <w:lastRenderedPageBreak/>
         <w:drawing>
-          <wp:inline distT="0" distB="0" distL="0" distR="0" wp14:anchorId="6DDEC299" wp14:editId="3B4293D2">
+          <wp:inline distT="0" distB="0" distL="0" distR="0" wp14:anchorId="6DDEC299" wp14:editId="0D74FC46">
             <wp:extent cx="3857625" cy="2299182"/>
             <wp:effectExtent l="19050" t="19050" r="9525" b="25400"/>
             <wp:docPr id="968413297" name="Grafik 9"/>
@@ -6194,6 +6194,27 @@
       <w:proofErr w:type="spellEnd"/>
       <w:r>
         <w:t xml:space="preserve"> während des Vergleichs von Musterlösung und Studentenlösung. Das System erkennt Aufgaben automatisch und ordnet fehlerhafte Formeln der entsprechenden Aufgabe zu.</w:t>
+      </w:r>
+    </w:p>
+    <w:p>
+      <w:r>
+        <w:t xml:space="preserve">Im nächsten Entwicklungsschritt wurde die </w:t>
+      </w:r>
+      <w:proofErr w:type="spellStart"/>
+      <w:r>
+        <w:t>Bewertungsengine</w:t>
+      </w:r>
+      <w:proofErr w:type="spellEnd"/>
+      <w:r>
+        <w:t xml:space="preserve"> erweitert, um die spätere manuelle Korrektur vorzubereiten. Anstelle einer reinen Gesamtpunktzahl erzeugt das System nun für jede Aufgabe ein eigenes Ergebnisobjekt (</w:t>
+      </w:r>
+      <w:proofErr w:type="spellStart"/>
+      <w:r>
+        <w:t>AufgabeErgebnis</w:t>
+      </w:r>
+      <w:proofErr w:type="spellEnd"/>
+      <w:r>
+        <w:t>). Dieses enthält den Bewertungsstatus sowie die erreichten und maximal möglichen Punkte. Aufgaben mit vollständig korrekten Formeln werden automatisch bewertet, während Aufgaben mit Abweichungen für eine manuelle Prüfung markiert werden. Die Gesamtpunktzahl wird anschließend aus allen Ergebnisobjekten berechnet. Durch diese Erweiterung wurde die Bewertungslogik von einer rein numerischen Auswertung auf eine objektorientierte Ergebnisverwaltung umgestellt und bildet damit die Grundlage für die im nächsten Entwicklungsschritt geplante manuelle Korrektur durch den Dozenten.</w:t>
       </w:r>
     </w:p>
     <w:sectPr>

</xml_diff>

<commit_message>
Manuelle Korrektur in Dozentenbereich integriert
- ErgebnisseGUI zur Auswahl abgegebener Prüfungen hinzugefügt
- Manuelle Korrektur über den Dozentenbereich aufrufbar
- AufgabeErgebnisse aus der Datenbank laden
- Manuelle Bewertungen dauerhaft in SQLite speichern
- Studentenanzeige in der ManuelleKorrekturGUI ergänzt
</commit_message>
<xml_diff>
--- a/Dokumentation.docx
+++ b/Dokumentation.docx
@@ -3062,7 +3062,7 @@
           <w:noProof/>
         </w:rPr>
         <w:drawing>
-          <wp:anchor distT="0" distB="0" distL="114300" distR="114300" simplePos="0" relativeHeight="251666432" behindDoc="0" locked="0" layoutInCell="1" allowOverlap="1" wp14:anchorId="30414A45" wp14:editId="57A628A7">
+          <wp:anchor distT="0" distB="0" distL="114300" distR="114300" simplePos="0" relativeHeight="251666432" behindDoc="0" locked="0" layoutInCell="1" allowOverlap="1" wp14:anchorId="30414A45" wp14:editId="6C0CEF07">
             <wp:simplePos x="0" y="0"/>
             <wp:positionH relativeFrom="margin">
               <wp:align>right</wp:align>
@@ -3124,7 +3124,7 @@
           <w:noProof/>
         </w:rPr>
         <w:drawing>
-          <wp:anchor distT="0" distB="0" distL="114300" distR="114300" simplePos="0" relativeHeight="251667456" behindDoc="0" locked="0" layoutInCell="1" allowOverlap="1" wp14:anchorId="38FD9A55" wp14:editId="44CBC089">
+          <wp:anchor distT="0" distB="0" distL="114300" distR="114300" simplePos="0" relativeHeight="251667456" behindDoc="0" locked="0" layoutInCell="1" allowOverlap="1" wp14:anchorId="38FD9A55" wp14:editId="6C574C09">
             <wp:simplePos x="0" y="0"/>
             <wp:positionH relativeFrom="column">
               <wp:posOffset>90805</wp:posOffset>
@@ -3316,7 +3316,7 @@
           <w:noProof/>
         </w:rPr>
         <w:drawing>
-          <wp:anchor distT="0" distB="0" distL="114300" distR="114300" simplePos="0" relativeHeight="251668480" behindDoc="0" locked="0" layoutInCell="1" allowOverlap="1" wp14:anchorId="6F7F581A" wp14:editId="78648EEB">
+          <wp:anchor distT="0" distB="0" distL="114300" distR="114300" simplePos="0" relativeHeight="251668480" behindDoc="0" locked="0" layoutInCell="1" allowOverlap="1" wp14:anchorId="6F7F581A" wp14:editId="7E430658">
             <wp:simplePos x="0" y="0"/>
             <wp:positionH relativeFrom="column">
               <wp:posOffset>147955</wp:posOffset>
@@ -3626,7 +3626,7 @@
         </w:rPr>
         <w:lastRenderedPageBreak/>
         <w:drawing>
-          <wp:anchor distT="0" distB="0" distL="114300" distR="114300" simplePos="0" relativeHeight="251671552" behindDoc="0" locked="0" layoutInCell="1" allowOverlap="1" wp14:anchorId="076D891D" wp14:editId="71E8507C">
+          <wp:anchor distT="0" distB="0" distL="114300" distR="114300" simplePos="0" relativeHeight="251671552" behindDoc="0" locked="0" layoutInCell="1" allowOverlap="1" wp14:anchorId="076D891D" wp14:editId="36BCA642">
             <wp:simplePos x="0" y="0"/>
             <wp:positionH relativeFrom="column">
               <wp:posOffset>3110230</wp:posOffset>
@@ -3685,7 +3685,7 @@
           <w:noProof/>
         </w:rPr>
         <w:drawing>
-          <wp:inline distT="0" distB="0" distL="0" distR="0" wp14:anchorId="2DDC6EE9" wp14:editId="3964FA6F">
+          <wp:inline distT="0" distB="0" distL="0" distR="0" wp14:anchorId="2DDC6EE9" wp14:editId="0FA7E303">
             <wp:extent cx="2469686" cy="1666875"/>
             <wp:effectExtent l="19050" t="19050" r="26035" b="9525"/>
             <wp:docPr id="1870732759" name="Grafik 9"/>
@@ -3850,7 +3850,7 @@
         </w:rPr>
         <w:lastRenderedPageBreak/>
         <w:drawing>
-          <wp:inline distT="0" distB="0" distL="0" distR="0" wp14:anchorId="7AA15A65" wp14:editId="47022C29">
+          <wp:inline distT="0" distB="0" distL="0" distR="0" wp14:anchorId="7AA15A65" wp14:editId="56F1A731">
             <wp:extent cx="2801815" cy="2603846"/>
             <wp:effectExtent l="0" t="0" r="0" b="6350"/>
             <wp:docPr id="422847558" name="Grafik 8"/>
@@ -4176,7 +4176,7 @@
           <w:noProof/>
         </w:rPr>
         <w:drawing>
-          <wp:inline distT="0" distB="0" distL="0" distR="0" wp14:anchorId="7965622C" wp14:editId="6FCA82A0">
+          <wp:inline distT="0" distB="0" distL="0" distR="0" wp14:anchorId="7965622C" wp14:editId="2721CE3C">
             <wp:extent cx="3390900" cy="2397776"/>
             <wp:effectExtent l="19050" t="19050" r="19050" b="21590"/>
             <wp:docPr id="1745081094" name="Grafik 8"/>
@@ -4559,7 +4559,7 @@
           <w:noProof/>
         </w:rPr>
         <w:drawing>
-          <wp:inline distT="0" distB="0" distL="0" distR="0" wp14:anchorId="2CD4F620" wp14:editId="2BC2EB52">
+          <wp:inline distT="0" distB="0" distL="0" distR="0" wp14:anchorId="2CD4F620" wp14:editId="6BD6B670">
             <wp:extent cx="3543300" cy="2125901"/>
             <wp:effectExtent l="19050" t="19050" r="19050" b="27305"/>
             <wp:docPr id="2129645333" name="Grafik 9"/>
@@ -5156,7 +5156,7 @@
           <w:noProof/>
         </w:rPr>
         <w:drawing>
-          <wp:anchor distT="0" distB="0" distL="114300" distR="114300" simplePos="0" relativeHeight="251672576" behindDoc="0" locked="0" layoutInCell="1" allowOverlap="1" wp14:anchorId="302F5CF5" wp14:editId="624C7F77">
+          <wp:anchor distT="0" distB="0" distL="114300" distR="114300" simplePos="0" relativeHeight="251672576" behindDoc="0" locked="0" layoutInCell="1" allowOverlap="1" wp14:anchorId="302F5CF5" wp14:editId="02A4156D">
             <wp:simplePos x="0" y="0"/>
             <wp:positionH relativeFrom="margin">
               <wp:posOffset>3509501</wp:posOffset>
@@ -5460,7 +5460,7 @@
           <w:noProof/>
         </w:rPr>
         <w:drawing>
-          <wp:inline distT="0" distB="0" distL="0" distR="0" wp14:anchorId="2C86FB31" wp14:editId="56966278">
+          <wp:inline distT="0" distB="0" distL="0" distR="0" wp14:anchorId="2C86FB31" wp14:editId="02048662">
             <wp:extent cx="2100805" cy="1893549"/>
             <wp:effectExtent l="19050" t="19050" r="13970" b="12065"/>
             <wp:docPr id="1348833077" name="Grafik 9"/>
@@ -5552,7 +5552,7 @@
           <w:noProof/>
         </w:rPr>
         <w:drawing>
-          <wp:anchor distT="0" distB="0" distL="114300" distR="114300" simplePos="0" relativeHeight="251676672" behindDoc="0" locked="0" layoutInCell="1" allowOverlap="1" wp14:anchorId="0DEC43F7" wp14:editId="5BFEBC9B">
+          <wp:anchor distT="0" distB="0" distL="114300" distR="114300" simplePos="0" relativeHeight="251676672" behindDoc="0" locked="0" layoutInCell="1" allowOverlap="1" wp14:anchorId="0DEC43F7" wp14:editId="2EA16DF8">
             <wp:simplePos x="0" y="0"/>
             <wp:positionH relativeFrom="column">
               <wp:posOffset>224155</wp:posOffset>
@@ -5698,7 +5698,7 @@
         </w:rPr>
         <w:lastRenderedPageBreak/>
         <w:drawing>
-          <wp:inline distT="0" distB="0" distL="0" distR="0" wp14:anchorId="6DDEC299" wp14:editId="0D74FC46">
+          <wp:inline distT="0" distB="0" distL="0" distR="0" wp14:anchorId="6DDEC299" wp14:editId="059E8D5A">
             <wp:extent cx="3857625" cy="2299182"/>
             <wp:effectExtent l="19050" t="19050" r="9525" b="25400"/>
             <wp:docPr id="968413297" name="Grafik 9"/>
@@ -6219,46 +6219,19 @@
     </w:p>
     <w:p/>
     <w:p>
-      <w:r>
+      <w:pPr>
+        <w:keepNext/>
         <w:rPr>
           <w:b/>
           <w:bCs/>
         </w:rPr>
-        <w:t>Manuelle Korrektur durch den Dozenten</w:t>
-      </w:r>
-    </w:p>
-    <w:p>
-      <w:r>
-        <w:t>Im nächsten Entwicklungsschritt wurde die zuvor vorbereitete manuelle Korrektur vollständig umgesetzt. Für Aufgaben, die während der automatischen Bewertung als MANUELL_PRUEFEN gekennzeichnet wurden, wurde eine eigene grafische Benutzeroberfläche entwickelt. Diese zeigt ausschließlich Aufgaben an, deren Formeln nicht eindeutig automatisch bewertet werden konnten. Der Dozent kann für jede dieser Aufgaben eine individuelle Punktzahl vergeben und die Bewertung anschließend übernehmen.</w:t>
-      </w:r>
-    </w:p>
-    <w:p>
-      <w:r>
-        <w:t xml:space="preserve">Zur Verarbeitung der manuellen Bewertung wurde der </w:t>
-      </w:r>
-      <w:proofErr w:type="spellStart"/>
-      <w:r>
-        <w:t>ManuelleKorrekturService</w:t>
-      </w:r>
-      <w:proofErr w:type="spellEnd"/>
-      <w:r>
-        <w:t xml:space="preserve"> implementiert. Dieser übernimmt die vom Dozenten vergebenen Punkte, aktualisiert den Bewertungsstatus der jeweiligen Aufgabe und berechnet nach Abschluss der Korrektur die Gesamtpunktzahl sowie den prozentualen Prüfungserfolg erneut. Dadurch werden sowohl automatisch als auch manuell bewertete Aufgaben in das Endergebnis einbezogen.</w:t>
-      </w:r>
-    </w:p>
-    <w:p>
-      <w:r>
-        <w:lastRenderedPageBreak/>
-        <w:t xml:space="preserve">Die manuelle Korrektur wurde in den Dozentenbereich integriert und kann über die Funktion </w:t>
-      </w:r>
+      </w:pPr>
       <w:r>
         <w:rPr>
           <w:b/>
           <w:bCs/>
         </w:rPr>
-        <w:t>„Ergebnisse ansehen“</w:t>
-      </w:r>
-      <w:r>
-        <w:t xml:space="preserve"> aufgerufen werden. Nach Abschluss der Nachkorrektur werden die endgültigen Gesamtpunkte sowie das Prüfungsergebnis berechnet. Damit wurde der Bewertungsprozess von der automatischen Prüfung einzelner Aufgaben bis zur abschließenden manuellen Nachbewertung vollständig umgesetzt.</w:t>
+        <w:t>Manuelle Korrektur durch den Dozenten</w:t>
       </w:r>
     </w:p>
     <w:p>
@@ -6266,14 +6239,74 @@
         <w:keepNext/>
       </w:pPr>
       <w:r>
+        <w:t>Im nächsten Entwicklungsschritt wurde die zuvor vorbereitete manuelle Korrektur vollständig in den Dozentenbereich integriert. Hierzu wurde zunächst eine neue Benutzeroberfläche „Ergebnisse“ entwickelt, über die der Dozent eine bereits abgeschlossene Prüfung auswählt und alle Studenten angezeigt bekommt, die eine Lösung abgegeben haben. Dadurch können einzelne Prüfungsergebnisse gezielt für eine Nachkorrektur geöffnet werden.</w:t>
+      </w:r>
+    </w:p>
+    <w:p>
+      <w:pPr>
+        <w:keepNext/>
+      </w:pPr>
+      <w:r>
+        <w:t>Die eigentliche manuelle Bewertung erfolgt anschließend in einer separaten Korrekturansicht. Dort werden ausschließlich Aufgaben angezeigt, die während der automatischen Bewertung den Status MANUELL_PRUEFEN erhalten haben. Für jede dieser Aufgaben kann der Dozent eine individuelle Punktzahl vergeben. Die Eingaben werden unmittelbar übernommen und der Bewertungsstatus der jeweiligen Aufgabe entsprechend angepasst.</w:t>
+      </w:r>
+    </w:p>
+    <w:p>
+      <w:pPr>
+        <w:keepNext/>
+      </w:pPr>
+      <w:r>
+        <w:t xml:space="preserve">Zur Verarbeitung der manuellen Bewertung wurde der </w:t>
+      </w:r>
+      <w:proofErr w:type="spellStart"/>
+      <w:r>
+        <w:t>ManuelleKorrekturService</w:t>
+      </w:r>
+      <w:proofErr w:type="spellEnd"/>
+      <w:r>
+        <w:t xml:space="preserve"> erweitert. Dieser übernimmt die vom Dozenten vergebenen Punkte, aktualisiert den </w:t>
+      </w:r>
+      <w:r>
+        <w:lastRenderedPageBreak/>
+        <w:t xml:space="preserve">Bewertungsstatus der Aufgabe und berechnet nach Abschluss der Korrektur die Gesamtpunktzahl sowie den prozentualen Prüfungserfolg erneut. Die korrigierten Aufgaben werden zusätzlich dauerhaft in der SQLite-Datenbank gespeichert. Hierzu wurden die Tabellen </w:t>
+      </w:r>
+      <w:proofErr w:type="spellStart"/>
+      <w:r>
+        <w:t>ergebnisse</w:t>
+      </w:r>
+      <w:proofErr w:type="spellEnd"/>
+      <w:r>
+        <w:t xml:space="preserve"> und </w:t>
+      </w:r>
+      <w:proofErr w:type="spellStart"/>
+      <w:r>
+        <w:t>aufgabe_ergebnisse</w:t>
+      </w:r>
+      <w:proofErr w:type="spellEnd"/>
+      <w:r>
+        <w:t xml:space="preserve"> erweitert, sodass sowohl das Gesamtergebnis einer Prüfung als auch die Bewertung jeder einzelnen Aufgabe dauerhaft erhalten bleiben und zu einem späteren Zeitpunkt erneut geladen werden können.</w:t>
+      </w:r>
+    </w:p>
+    <w:p>
+      <w:pPr>
+        <w:keepNext/>
+      </w:pPr>
+      <w:r>
+        <w:t>Durch diese Erweiterung wurde der komplette Bewertungsprozess abgeschlossen. Nach der automatischen Bewertung können Prüfungen jederzeit erneut geöffnet, manuell nachkorrigiert und mit den aktualisierten Ergebnissen gespeichert werden. Damit steht erstmals ein vollständiger Korrekturworkflow vom Hochladen der Studentenlösung bis zur abschließenden Nachbewertung durch den Dozenten zur Verfügung.</w:t>
+      </w:r>
+    </w:p>
+    <w:p>
+      <w:pPr>
+        <w:keepNext/>
+      </w:pPr>
+      <w:r>
         <w:rPr>
           <w:noProof/>
         </w:rPr>
         <w:drawing>
-          <wp:inline distT="0" distB="0" distL="0" distR="0" wp14:anchorId="1C433880" wp14:editId="2561A1B9">
-            <wp:extent cx="4795284" cy="3205579"/>
-            <wp:effectExtent l="19050" t="19050" r="24765" b="13970"/>
-            <wp:docPr id="523926341" name="Grafik 9"/>
+          <wp:inline distT="0" distB="0" distL="0" distR="0" wp14:anchorId="3D9C9AA8" wp14:editId="2234144A">
+            <wp:extent cx="4486940" cy="3264803"/>
+            <wp:effectExtent l="19050" t="19050" r="27940" b="12065"/>
+            <wp:docPr id="1608757345" name="Grafik 9"/>
             <wp:cNvGraphicFramePr>
               <a:graphicFrameLocks xmlns:a="http://schemas.openxmlformats.org/drawingml/2006/main" noChangeAspect="1"/>
             </wp:cNvGraphicFramePr>
@@ -6281,7 +6314,7 @@
               <a:graphicData uri="http://schemas.openxmlformats.org/drawingml/2006/picture">
                 <pic:pic xmlns:pic="http://schemas.openxmlformats.org/drawingml/2006/picture">
                   <pic:nvPicPr>
-                    <pic:cNvPr id="523926341" name="Grafik 523926341"/>
+                    <pic:cNvPr id="1608757345" name="Grafik 1608757345"/>
                     <pic:cNvPicPr/>
                   </pic:nvPicPr>
                   <pic:blipFill>
@@ -6299,7 +6332,7 @@
                   <pic:spPr>
                     <a:xfrm>
                       <a:off x="0" y="0"/>
-                      <a:ext cx="4815879" cy="3219346"/>
+                      <a:ext cx="4491845" cy="3268372"/>
                     </a:xfrm>
                     <a:prstGeom prst="rect">
                       <a:avLst/>
@@ -6346,10 +6379,219 @@
         <w:t xml:space="preserve"> </w:t>
       </w:r>
       <w:r>
-        <w:t>Oberfläche zur manuellen Korrektur. Der Dozent vergibt Punkte für automatisch als MANUELL_PRUEFEN markierte Aufgaben. Nach Abschluss der Nachkorrektur werden die Gesamtpunktzahl und der prozentuale Prüfungserfolg automatisch neu berechnet.</w:t>
-      </w:r>
-    </w:p>
-    <w:p/>
+        <w:t>Benutzeroberfläche „Ergebnisse“. Nach Auswahl einer abgeschlossenen Prüfung werden alle abgegebenen Studentenlösungen angezeigt und können für die Nachkorrektur ausgewählt werden</w:t>
+      </w:r>
+    </w:p>
+    <w:p>
+      <w:pPr>
+        <w:keepNext/>
+      </w:pPr>
+      <w:r>
+        <w:rPr>
+          <w:noProof/>
+        </w:rPr>
+        <w:lastRenderedPageBreak/>
+        <w:drawing>
+          <wp:inline distT="0" distB="0" distL="0" distR="0" wp14:anchorId="275F0E33" wp14:editId="6253EBE4">
+            <wp:extent cx="4329667" cy="2767131"/>
+            <wp:effectExtent l="19050" t="19050" r="13970" b="14605"/>
+            <wp:docPr id="395483865" name="Grafik 10"/>
+            <wp:cNvGraphicFramePr>
+              <a:graphicFrameLocks xmlns:a="http://schemas.openxmlformats.org/drawingml/2006/main" noChangeAspect="1"/>
+            </wp:cNvGraphicFramePr>
+            <a:graphic xmlns:a="http://schemas.openxmlformats.org/drawingml/2006/main">
+              <a:graphicData uri="http://schemas.openxmlformats.org/drawingml/2006/picture">
+                <pic:pic xmlns:pic="http://schemas.openxmlformats.org/drawingml/2006/picture">
+                  <pic:nvPicPr>
+                    <pic:cNvPr id="395483865" name="Grafik 395483865"/>
+                    <pic:cNvPicPr/>
+                  </pic:nvPicPr>
+                  <pic:blipFill>
+                    <a:blip r:embed="rId36" cstate="print">
+                      <a:extLst>
+                        <a:ext uri="{28A0092B-C50C-407E-A947-70E740481C1C}">
+                          <a14:useLocalDpi xmlns:a14="http://schemas.microsoft.com/office/drawing/2010/main" val="0"/>
+                        </a:ext>
+                      </a:extLst>
+                    </a:blip>
+                    <a:stretch>
+                      <a:fillRect/>
+                    </a:stretch>
+                  </pic:blipFill>
+                  <pic:spPr>
+                    <a:xfrm>
+                      <a:off x="0" y="0"/>
+                      <a:ext cx="4344853" cy="2776837"/>
+                    </a:xfrm>
+                    <a:prstGeom prst="rect">
+                      <a:avLst/>
+                    </a:prstGeom>
+                    <a:ln>
+                      <a:solidFill>
+                        <a:srgbClr val="EE0000"/>
+                      </a:solidFill>
+                    </a:ln>
+                  </pic:spPr>
+                </pic:pic>
+              </a:graphicData>
+            </a:graphic>
+          </wp:inline>
+        </w:drawing>
+      </w:r>
+    </w:p>
+    <w:p>
+      <w:pPr>
+        <w:pStyle w:val="Beschriftung"/>
+      </w:pPr>
+      <w:r>
+        <w:t xml:space="preserve">Abbildung </w:t>
+      </w:r>
+      <w:r>
+        <w:fldChar w:fldCharType="begin"/>
+      </w:r>
+      <w:r>
+        <w:instrText xml:space="preserve"> SEQ Abbildung \* ARABIC </w:instrText>
+      </w:r>
+      <w:r>
+        <w:fldChar w:fldCharType="separate"/>
+      </w:r>
+      <w:r>
+        <w:rPr>
+          <w:noProof/>
+        </w:rPr>
+        <w:t>25</w:t>
+      </w:r>
+      <w:r>
+        <w:fldChar w:fldCharType="end"/>
+      </w:r>
+      <w:r>
+        <w:t xml:space="preserve"> </w:t>
+      </w:r>
+      <w:r>
+        <w:t>Oberfläche der manuellen Korrektur. Der Dozent bewertet ausschließlich Aufgaben mit dem Status MANUELL_PRUEFEN und vergibt hierfür individuelle Punktzahlen.</w:t>
+      </w:r>
+    </w:p>
+    <w:p>
+      <w:pPr>
+        <w:keepNext/>
+        <w:rPr>
+          <w:noProof/>
+        </w:rPr>
+      </w:pPr>
+    </w:p>
+    <w:p>
+      <w:pPr>
+        <w:keepNext/>
+      </w:pPr>
+      <w:r>
+        <w:rPr>
+          <w:noProof/>
+        </w:rPr>
+        <w:drawing>
+          <wp:inline distT="0" distB="0" distL="0" distR="0" wp14:anchorId="37AA16A5" wp14:editId="15476BB4">
+            <wp:extent cx="4329091" cy="2989964"/>
+            <wp:effectExtent l="19050" t="19050" r="14605" b="20320"/>
+            <wp:docPr id="1217246822" name="Grafik 11"/>
+            <wp:cNvGraphicFramePr>
+              <a:graphicFrameLocks xmlns:a="http://schemas.openxmlformats.org/drawingml/2006/main" noChangeAspect="1"/>
+            </wp:cNvGraphicFramePr>
+            <a:graphic xmlns:a="http://schemas.openxmlformats.org/drawingml/2006/main">
+              <a:graphicData uri="http://schemas.openxmlformats.org/drawingml/2006/picture">
+                <pic:pic xmlns:pic="http://schemas.openxmlformats.org/drawingml/2006/picture">
+                  <pic:nvPicPr>
+                    <pic:cNvPr id="1217246822" name="Grafik 1217246822"/>
+                    <pic:cNvPicPr/>
+                  </pic:nvPicPr>
+                  <pic:blipFill rotWithShape="1">
+                    <a:blip r:embed="rId37">
+                      <a:extLst>
+                        <a:ext uri="{28A0092B-C50C-407E-A947-70E740481C1C}">
+                          <a14:useLocalDpi xmlns:a14="http://schemas.microsoft.com/office/drawing/2010/main" val="0"/>
+                        </a:ext>
+                      </a:extLst>
+                    </a:blip>
+                    <a:srcRect b="23994"/>
+                    <a:stretch>
+                      <a:fillRect/>
+                    </a:stretch>
+                  </pic:blipFill>
+                  <pic:spPr bwMode="auto">
+                    <a:xfrm>
+                      <a:off x="0" y="0"/>
+                      <a:ext cx="4333738" cy="2993174"/>
+                    </a:xfrm>
+                    <a:prstGeom prst="rect">
+                      <a:avLst/>
+                    </a:prstGeom>
+                    <a:ln w="9525" cap="flat" cmpd="sng" algn="ctr">
+                      <a:solidFill>
+                        <a:sysClr val="windowText" lastClr="000000"/>
+                      </a:solidFill>
+                      <a:prstDash val="solid"/>
+                      <a:round/>
+                      <a:headEnd type="none" w="med" len="med"/>
+                      <a:tailEnd type="none" w="med" len="med"/>
+                      <a:extLst>
+                        <a:ext uri="{C807C97D-BFC1-408E-A445-0C87EB9F89A2}">
+                          <ask:lineSketchStyleProps xmlns:ask="http://schemas.microsoft.com/office/drawing/2018/sketchyshapes" sd="0">
+                            <a:custGeom>
+                              <a:avLst/>
+                              <a:gdLst/>
+                              <a:ahLst/>
+                              <a:cxnLst/>
+                              <a:rect l="0" t="0" r="0" b="0"/>
+                              <a:pathLst/>
+                            </a:custGeom>
+                            <ask:type/>
+                          </ask:lineSketchStyleProps>
+                        </a:ext>
+                      </a:extLst>
+                    </a:ln>
+                    <a:extLst>
+                      <a:ext uri="{53640926-AAD7-44D8-BBD7-CCE9431645EC}">
+                        <a14:shadowObscured xmlns:a14="http://schemas.microsoft.com/office/drawing/2010/main"/>
+                      </a:ext>
+                    </a:extLst>
+                  </pic:spPr>
+                </pic:pic>
+              </a:graphicData>
+            </a:graphic>
+          </wp:inline>
+        </w:drawing>
+      </w:r>
+    </w:p>
+    <w:p>
+      <w:pPr>
+        <w:pStyle w:val="Beschriftung"/>
+      </w:pPr>
+      <w:r>
+        <w:t xml:space="preserve">Abbildung </w:t>
+      </w:r>
+      <w:r>
+        <w:fldChar w:fldCharType="begin"/>
+      </w:r>
+      <w:r>
+        <w:instrText xml:space="preserve"> SEQ Abbildung \* ARABIC </w:instrText>
+      </w:r>
+      <w:r>
+        <w:fldChar w:fldCharType="separate"/>
+      </w:r>
+      <w:r>
+        <w:rPr>
+          <w:noProof/>
+        </w:rPr>
+        <w:t>26</w:t>
+      </w:r>
+      <w:r>
+        <w:fldChar w:fldCharType="end"/>
+      </w:r>
+      <w:r>
+        <w:t xml:space="preserve"> </w:t>
+      </w:r>
+      <w:r>
+        <w:t>Speicherung der manuellen Bewertung in der SQLite-Datenbank. Für jede Aufgabe werden Bewertungsstatus, erreichte Punkte sowie die maximale Punktzahl dauerhaft gespeichert.</w:t>
+      </w:r>
+    </w:p>
     <w:sectPr>
       <w:pgSz w:w="11906" w:h="16838"/>
       <w:pgMar w:top="1417" w:right="1417" w:bottom="1134" w:left="1417" w:header="708" w:footer="708" w:gutter="0"/>

</xml_diff>